<commit_message>
Draft_012 (in place): remove 30 blank-page-causing empty paragraphs; set cantSplit on all 64 table rows; set tableHeader on 14 first rows
</commit_message>
<xml_diff>
--- a/thesis/003_ThesisProposal_Draft_012.docx
+++ b/thesis/003_ThesisProposal_Draft_012.docx
@@ -30,28 +30,32 @@
     </w:p>
     <w:p>
       <w:pPr>
-        <w:spacing w:before="0" w:after="0" w:line="240" w:lineRule="auto"/>
-      </w:pPr>
-      <w:r>
-        <w:rPr>
-          <w:rFonts w:ascii="Georgia" w:hAnsi="Georgia" w:eastAsia="Georgia"/>
-          <w:b w:val="0"/>
-          <w:i w:val="0"/>
-          <w:sz w:val="22"/>
-        </w:rPr>
+        <w:spacing w:after="0" w:line="240" w:lineRule="auto"/>
+        <w:jc w:val="center"/>
+      </w:pPr>
+      <w:r>
+        <w:rPr>
+          <w:rFonts w:ascii="Georgia" w:hAnsi="Georgia" w:eastAsia="Georgia"/>
+          <w:b/>
+          <w:i w:val="0"/>
+          <w:sz w:val="28"/>
+        </w:rPr>
+        <w:t>THE USE OF HEDGES IN RESEARCH ABSTRACTS</w:t>
       </w:r>
     </w:p>
     <w:p>
       <w:pPr>
-        <w:spacing w:before="0" w:after="0" w:line="240" w:lineRule="auto"/>
-      </w:pPr>
-      <w:r>
-        <w:rPr>
-          <w:rFonts w:ascii="Georgia" w:hAnsi="Georgia" w:eastAsia="Georgia"/>
-          <w:b w:val="0"/>
-          <w:i w:val="0"/>
-          <w:sz w:val="22"/>
-        </w:rPr>
+        <w:spacing w:after="0" w:line="240" w:lineRule="auto"/>
+        <w:jc w:val="center"/>
+      </w:pPr>
+      <w:r>
+        <w:rPr>
+          <w:rFonts w:ascii="Georgia" w:hAnsi="Georgia" w:eastAsia="Georgia"/>
+          <w:b/>
+          <w:i w:val="0"/>
+          <w:sz w:val="28"/>
+        </w:rPr>
+        <w:t>ACROSS APPLIED LIFE SCIENCES</w:t>
       </w:r>
     </w:p>
     <w:p>
@@ -82,28 +86,32 @@
     </w:p>
     <w:p>
       <w:pPr>
-        <w:spacing w:before="0" w:after="0" w:line="240" w:lineRule="auto"/>
-      </w:pPr>
-      <w:r>
-        <w:rPr>
-          <w:rFonts w:ascii="Georgia" w:hAnsi="Georgia" w:eastAsia="Georgia"/>
-          <w:b w:val="0"/>
-          <w:i w:val="0"/>
-          <w:sz w:val="22"/>
-        </w:rPr>
+        <w:spacing w:after="0" w:line="240" w:lineRule="auto"/>
+        <w:jc w:val="center"/>
+      </w:pPr>
+      <w:r>
+        <w:rPr>
+          <w:rFonts w:ascii="Georgia" w:hAnsi="Georgia" w:eastAsia="Georgia"/>
+          <w:b w:val="0"/>
+          <w:i w:val="0"/>
+          <w:sz w:val="24"/>
+        </w:rPr>
+        <w:t>A Thesis</w:t>
       </w:r>
     </w:p>
     <w:p>
       <w:pPr>
-        <w:spacing w:before="0" w:after="0" w:line="240" w:lineRule="auto"/>
-      </w:pPr>
-      <w:r>
-        <w:rPr>
-          <w:rFonts w:ascii="Georgia" w:hAnsi="Georgia" w:eastAsia="Georgia"/>
-          <w:b w:val="0"/>
-          <w:i w:val="0"/>
-          <w:sz w:val="22"/>
-        </w:rPr>
+        <w:spacing w:after="0" w:line="240" w:lineRule="auto"/>
+        <w:jc w:val="center"/>
+      </w:pPr>
+      <w:r>
+        <w:rPr>
+          <w:rFonts w:ascii="Georgia" w:hAnsi="Georgia" w:eastAsia="Georgia"/>
+          <w:b w:val="0"/>
+          <w:i w:val="0"/>
+          <w:sz w:val="24"/>
+        </w:rPr>
+        <w:t>Presented to the Faculty of</w:t>
       </w:r>
     </w:p>
     <w:p>
@@ -114,11 +122,11 @@
       <w:r>
         <w:rPr>
           <w:rFonts w:ascii="Georgia" w:hAnsi="Georgia" w:eastAsia="Georgia"/>
-          <w:b/>
-          <w:i w:val="0"/>
-          <w:sz w:val="28"/>
-        </w:rPr>
-        <w:t>THE USE OF HEDGES IN RESEARCH ABSTRACTS</w:t>
+          <w:b w:val="0"/>
+          <w:i w:val="0"/>
+          <w:sz w:val="24"/>
+        </w:rPr>
+        <w:t>Department of English</w:t>
       </w:r>
     </w:p>
     <w:p>
@@ -129,37 +137,41 @@
       <w:r>
         <w:rPr>
           <w:rFonts w:ascii="Georgia" w:hAnsi="Georgia" w:eastAsia="Georgia"/>
-          <w:b/>
-          <w:i w:val="0"/>
-          <w:sz w:val="28"/>
-        </w:rPr>
-        <w:t>ACROSS APPLIED LIFE SCIENCES</w:t>
+          <w:b w:val="0"/>
+          <w:i w:val="0"/>
+          <w:sz w:val="24"/>
+        </w:rPr>
+        <w:t>College of Arts and Sciences</w:t>
       </w:r>
     </w:p>
     <w:p>
       <w:pPr>
-        <w:spacing w:before="0" w:after="0" w:line="240" w:lineRule="auto"/>
-      </w:pPr>
-      <w:r>
-        <w:rPr>
-          <w:rFonts w:ascii="Georgia" w:hAnsi="Georgia" w:eastAsia="Georgia"/>
-          <w:b w:val="0"/>
-          <w:i w:val="0"/>
-          <w:sz w:val="22"/>
-        </w:rPr>
+        <w:spacing w:after="0" w:line="240" w:lineRule="auto"/>
+        <w:jc w:val="center"/>
+      </w:pPr>
+      <w:r>
+        <w:rPr>
+          <w:rFonts w:ascii="Georgia" w:hAnsi="Georgia" w:eastAsia="Georgia"/>
+          <w:b w:val="0"/>
+          <w:i w:val="0"/>
+          <w:sz w:val="24"/>
+        </w:rPr>
+        <w:t>Pampanga State Agricultural University</w:t>
       </w:r>
     </w:p>
     <w:p>
       <w:pPr>
-        <w:spacing w:before="0" w:after="0" w:line="240" w:lineRule="auto"/>
-      </w:pPr>
-      <w:r>
-        <w:rPr>
-          <w:rFonts w:ascii="Georgia" w:hAnsi="Georgia" w:eastAsia="Georgia"/>
-          <w:b w:val="0"/>
-          <w:i w:val="0"/>
-          <w:sz w:val="22"/>
-        </w:rPr>
+        <w:spacing w:after="0" w:line="240" w:lineRule="auto"/>
+        <w:jc w:val="center"/>
+      </w:pPr>
+      <w:r>
+        <w:rPr>
+          <w:rFonts w:ascii="Georgia" w:hAnsi="Georgia" w:eastAsia="Georgia"/>
+          <w:b w:val="0"/>
+          <w:i w:val="0"/>
+          <w:sz w:val="24"/>
+        </w:rPr>
+        <w:t>Magalang, Pampanga</w:t>
       </w:r>
     </w:p>
     <w:p>
@@ -200,7 +212,7 @@
           <w:i w:val="0"/>
           <w:sz w:val="24"/>
         </w:rPr>
-        <w:t>A Thesis</w:t>
+        <w:t>In Partial Fulfillment</w:t>
       </w:r>
     </w:p>
     <w:p>
@@ -215,7 +227,7 @@
           <w:i w:val="0"/>
           <w:sz w:val="24"/>
         </w:rPr>
-        <w:t>Presented to the Faculty of</w:t>
+        <w:t>of the Requirements for the Degree</w:t>
       </w:r>
     </w:p>
     <w:p>
@@ -230,11 +242,37 @@
           <w:i w:val="0"/>
           <w:sz w:val="24"/>
         </w:rPr>
-        <w:t>Department of English</w:t>
+        <w:t>BACHELOR OF ARTS IN ENGLISH LANGUAGE STUDIES</w:t>
       </w:r>
     </w:p>
     <w:p>
       <w:pPr>
+        <w:spacing w:before="0" w:after="0" w:line="240" w:lineRule="auto"/>
+      </w:pPr>
+      <w:r>
+        <w:rPr>
+          <w:rFonts w:ascii="Georgia" w:hAnsi="Georgia" w:eastAsia="Georgia"/>
+          <w:b w:val="0"/>
+          <w:i w:val="0"/>
+          <w:sz w:val="22"/>
+        </w:rPr>
+      </w:r>
+    </w:p>
+    <w:p>
+      <w:pPr>
+        <w:spacing w:before="0" w:after="0" w:line="240" w:lineRule="auto"/>
+      </w:pPr>
+      <w:r>
+        <w:rPr>
+          <w:rFonts w:ascii="Georgia" w:hAnsi="Georgia" w:eastAsia="Georgia"/>
+          <w:b w:val="0"/>
+          <w:i w:val="0"/>
+          <w:sz w:val="22"/>
+        </w:rPr>
+      </w:r>
+    </w:p>
+    <w:p>
+      <w:pPr>
         <w:spacing w:after="0" w:line="240" w:lineRule="auto"/>
         <w:jc w:val="center"/>
       </w:pPr>
@@ -245,292 +283,7 @@
           <w:i w:val="0"/>
           <w:sz w:val="24"/>
         </w:rPr>
-        <w:t>College of Arts and Sciences</w:t>
-      </w:r>
-    </w:p>
-    <w:p>
-      <w:pPr>
-        <w:spacing w:after="0" w:line="240" w:lineRule="auto"/>
-        <w:jc w:val="center"/>
-      </w:pPr>
-      <w:r>
-        <w:rPr>
-          <w:rFonts w:ascii="Georgia" w:hAnsi="Georgia" w:eastAsia="Georgia"/>
-          <w:b w:val="0"/>
-          <w:i w:val="0"/>
-          <w:sz w:val="24"/>
-        </w:rPr>
-        <w:t>Pampanga State Agricultural University</w:t>
-      </w:r>
-    </w:p>
-    <w:p>
-      <w:pPr>
-        <w:spacing w:after="0" w:line="240" w:lineRule="auto"/>
-        <w:jc w:val="center"/>
-      </w:pPr>
-      <w:r>
-        <w:rPr>
-          <w:rFonts w:ascii="Georgia" w:hAnsi="Georgia" w:eastAsia="Georgia"/>
-          <w:b w:val="0"/>
-          <w:i w:val="0"/>
-          <w:sz w:val="24"/>
-        </w:rPr>
-        <w:t>Magalang, Pampanga</w:t>
-      </w:r>
-    </w:p>
-    <w:p>
-      <w:pPr>
-        <w:spacing w:before="0" w:after="0" w:line="240" w:lineRule="auto"/>
-      </w:pPr>
-      <w:r>
-        <w:rPr>
-          <w:rFonts w:ascii="Georgia" w:hAnsi="Georgia" w:eastAsia="Georgia"/>
-          <w:b w:val="0"/>
-          <w:i w:val="0"/>
-          <w:sz w:val="22"/>
-        </w:rPr>
-      </w:r>
-    </w:p>
-    <w:p>
-      <w:pPr>
-        <w:spacing w:before="0" w:after="0" w:line="240" w:lineRule="auto"/>
-      </w:pPr>
-      <w:r>
-        <w:rPr>
-          <w:rFonts w:ascii="Georgia" w:hAnsi="Georgia" w:eastAsia="Georgia"/>
-          <w:b w:val="0"/>
-          <w:i w:val="0"/>
-          <w:sz w:val="22"/>
-        </w:rPr>
-      </w:r>
-    </w:p>
-    <w:p>
-      <w:pPr>
-        <w:spacing w:after="0" w:line="240" w:lineRule="auto"/>
-        <w:jc w:val="center"/>
-      </w:pPr>
-      <w:r>
-        <w:rPr>
-          <w:rFonts w:ascii="Georgia" w:hAnsi="Georgia" w:eastAsia="Georgia"/>
-          <w:b w:val="0"/>
-          <w:i w:val="0"/>
-          <w:sz w:val="24"/>
-        </w:rPr>
-        <w:t>In Partial Fulfillment</w:t>
-      </w:r>
-    </w:p>
-    <w:p>
-      <w:pPr>
-        <w:spacing w:after="0" w:line="240" w:lineRule="auto"/>
-        <w:jc w:val="center"/>
-      </w:pPr>
-      <w:r>
-        <w:rPr>
-          <w:rFonts w:ascii="Georgia" w:hAnsi="Georgia" w:eastAsia="Georgia"/>
-          <w:b w:val="0"/>
-          <w:i w:val="0"/>
-          <w:sz w:val="24"/>
-        </w:rPr>
-        <w:t>of the Requirements for the Degree</w:t>
-      </w:r>
-    </w:p>
-    <w:p>
-      <w:pPr>
-        <w:spacing w:after="0" w:line="240" w:lineRule="auto"/>
-        <w:jc w:val="center"/>
-      </w:pPr>
-      <w:r>
-        <w:rPr>
-          <w:rFonts w:ascii="Georgia" w:hAnsi="Georgia" w:eastAsia="Georgia"/>
-          <w:b w:val="0"/>
-          <w:i w:val="0"/>
-          <w:sz w:val="24"/>
-        </w:rPr>
-        <w:t>BACHELOR OF ARTS IN ENGLISH LANGUAGE STUDIES</w:t>
-      </w:r>
-    </w:p>
-    <w:p>
-      <w:pPr>
-        <w:spacing w:before="0" w:after="0" w:line="240" w:lineRule="auto"/>
-      </w:pPr>
-      <w:r>
-        <w:rPr>
-          <w:rFonts w:ascii="Georgia" w:hAnsi="Georgia" w:eastAsia="Georgia"/>
-          <w:b w:val="0"/>
-          <w:i w:val="0"/>
-          <w:sz w:val="22"/>
-        </w:rPr>
-      </w:r>
-    </w:p>
-    <w:p>
-      <w:pPr>
-        <w:spacing w:before="0" w:after="0" w:line="240" w:lineRule="auto"/>
-      </w:pPr>
-      <w:r>
-        <w:rPr>
-          <w:rFonts w:ascii="Georgia" w:hAnsi="Georgia" w:eastAsia="Georgia"/>
-          <w:b w:val="0"/>
-          <w:i w:val="0"/>
-          <w:sz w:val="22"/>
-        </w:rPr>
-      </w:r>
-    </w:p>
-    <w:p>
-      <w:pPr>
-        <w:spacing w:before="0" w:after="0" w:line="240" w:lineRule="auto"/>
-      </w:pPr>
-      <w:r>
-        <w:rPr>
-          <w:rFonts w:ascii="Georgia" w:hAnsi="Georgia" w:eastAsia="Georgia"/>
-          <w:b w:val="0"/>
-          <w:i w:val="0"/>
-          <w:sz w:val="22"/>
-        </w:rPr>
-      </w:r>
-    </w:p>
-    <w:p>
-      <w:pPr>
-        <w:spacing w:before="0" w:after="0" w:line="240" w:lineRule="auto"/>
-      </w:pPr>
-      <w:r>
-        <w:rPr>
-          <w:rFonts w:ascii="Georgia" w:hAnsi="Georgia" w:eastAsia="Georgia"/>
-          <w:b w:val="0"/>
-          <w:i w:val="0"/>
-          <w:sz w:val="22"/>
-        </w:rPr>
-      </w:r>
-    </w:p>
-    <w:p>
-      <w:pPr>
-        <w:spacing w:before="0" w:after="0" w:line="240" w:lineRule="auto"/>
-      </w:pPr>
-      <w:r>
-        <w:rPr>
-          <w:rFonts w:ascii="Georgia" w:hAnsi="Georgia" w:eastAsia="Georgia"/>
-          <w:b w:val="0"/>
-          <w:i w:val="0"/>
-          <w:sz w:val="22"/>
-        </w:rPr>
-      </w:r>
-    </w:p>
-    <w:p>
-      <w:pPr>
-        <w:spacing w:after="0" w:line="240" w:lineRule="auto"/>
-        <w:jc w:val="center"/>
-      </w:pPr>
-      <w:r>
-        <w:rPr>
-          <w:rFonts w:ascii="Georgia" w:hAnsi="Georgia" w:eastAsia="Georgia"/>
-          <w:b w:val="0"/>
-          <w:i w:val="0"/>
-          <w:sz w:val="24"/>
-        </w:rPr>
         <w:t>By</w:t>
-      </w:r>
-    </w:p>
-    <w:p>
-      <w:pPr>
-        <w:spacing w:before="0" w:after="0" w:line="240" w:lineRule="auto"/>
-      </w:pPr>
-      <w:r>
-        <w:rPr>
-          <w:rFonts w:ascii="Georgia" w:hAnsi="Georgia" w:eastAsia="Georgia"/>
-          <w:b w:val="0"/>
-          <w:i w:val="0"/>
-          <w:sz w:val="22"/>
-        </w:rPr>
-      </w:r>
-    </w:p>
-    <w:p>
-      <w:pPr>
-        <w:spacing w:before="0" w:after="0" w:line="240" w:lineRule="auto"/>
-      </w:pPr>
-      <w:r>
-        <w:rPr>
-          <w:rFonts w:ascii="Georgia" w:hAnsi="Georgia" w:eastAsia="Georgia"/>
-          <w:b w:val="0"/>
-          <w:i w:val="0"/>
-          <w:sz w:val="22"/>
-        </w:rPr>
-      </w:r>
-    </w:p>
-    <w:p>
-      <w:pPr>
-        <w:spacing w:before="0" w:after="0" w:line="240" w:lineRule="auto"/>
-      </w:pPr>
-      <w:r>
-        <w:rPr>
-          <w:rFonts w:ascii="Georgia" w:hAnsi="Georgia" w:eastAsia="Georgia"/>
-          <w:b w:val="0"/>
-          <w:i w:val="0"/>
-          <w:sz w:val="22"/>
-        </w:rPr>
-      </w:r>
-    </w:p>
-    <w:p>
-      <w:pPr>
-        <w:spacing w:before="0" w:after="0" w:line="240" w:lineRule="auto"/>
-      </w:pPr>
-      <w:r>
-        <w:rPr>
-          <w:rFonts w:ascii="Georgia" w:hAnsi="Georgia" w:eastAsia="Georgia"/>
-          <w:b w:val="0"/>
-          <w:i w:val="0"/>
-          <w:sz w:val="22"/>
-        </w:rPr>
-      </w:r>
-    </w:p>
-    <w:p>
-      <w:pPr>
-        <w:spacing w:before="0" w:after="0" w:line="240" w:lineRule="auto"/>
-      </w:pPr>
-      <w:r>
-        <w:rPr>
-          <w:rFonts w:ascii="Georgia" w:hAnsi="Georgia" w:eastAsia="Georgia"/>
-          <w:b w:val="0"/>
-          <w:i w:val="0"/>
-          <w:sz w:val="22"/>
-        </w:rPr>
-      </w:r>
-    </w:p>
-    <w:p>
-      <w:pPr>
-        <w:spacing w:before="0" w:after="0" w:line="240" w:lineRule="auto"/>
-      </w:pPr>
-      <w:r>
-        <w:rPr>
-          <w:rFonts w:ascii="Georgia" w:hAnsi="Georgia" w:eastAsia="Georgia"/>
-          <w:b w:val="0"/>
-          <w:i w:val="0"/>
-          <w:sz w:val="22"/>
-        </w:rPr>
-      </w:r>
-    </w:p>
-    <w:p>
-      <w:pPr>
-        <w:spacing w:before="0" w:after="0" w:line="240" w:lineRule="auto"/>
-      </w:pPr>
-      <w:r>
-        <w:rPr>
-          <w:rFonts w:ascii="Georgia" w:hAnsi="Georgia" w:eastAsia="Georgia"/>
-          <w:b w:val="0"/>
-          <w:i w:val="0"/>
-          <w:sz w:val="22"/>
-        </w:rPr>
-      </w:r>
-    </w:p>
-    <w:p>
-      <w:pPr>
-        <w:spacing w:before="0" w:after="0" w:line="240" w:lineRule="auto"/>
-      </w:pPr>
-      <w:r>
-        <w:rPr>
-          <w:rFonts w:ascii="Georgia" w:hAnsi="Georgia" w:eastAsia="Georgia"/>
-          <w:b w:val="0"/>
-          <w:i w:val="0"/>
-          <w:sz w:val="22"/>
-        </w:rPr>
       </w:r>
     </w:p>
     <w:p>
@@ -611,19 +364,6 @@
           <w:docGrid w:linePitch="360"/>
         </w:sectPr>
       </w:pPr>
-    </w:p>
-    <w:p>
-      <w:pPr>
-        <w:spacing w:after="0" w:before="0"/>
-      </w:pPr>
-      <w:r>
-        <w:rPr>
-          <w:rFonts w:ascii="Georgia" w:hAnsi="Georgia" w:eastAsia="Georgia"/>
-          <w:b w:val="0"/>
-          <w:i w:val="0"/>
-          <w:sz w:val="22"/>
-        </w:rPr>
-      </w:r>
     </w:p>
     <w:p>
       <w:pPr>
@@ -1961,17 +1701,6 @@
     </w:p>
     <w:p>
       <w:pPr>
-        <w:spacing w:line="480" w:lineRule="auto" w:before="0" w:after="0"/>
-      </w:pPr>
-      <w:r>
-        <w:rPr>
-          <w:rFonts w:ascii="Georgia" w:hAnsi="Georgia" w:cs="Georgia"/>
-          <w:sz w:val="22"/>
-        </w:rPr>
-      </w:r>
-    </w:p>
-    <w:p>
-      <w:pPr>
         <w:pageBreakBefore/>
         <w:keepNext/>
         <w:keepLines/>
@@ -2415,6 +2144,10 @@
         <w:gridCol w:w="1384"/>
       </w:tblGrid>
       <w:tr>
+        <w:trPr>
+          <w:cantSplit/>
+          <w:tblHeader/>
+        </w:trPr>
         <w:tc>
           <w:tcPr>
             <w:tcW w:type="dxa" w:w="1384"/>
@@ -2537,6 +2270,9 @@
         </w:tc>
       </w:tr>
       <w:tr>
+        <w:trPr>
+          <w:cantSplit/>
+        </w:trPr>
         <w:tc>
           <w:tcPr>
             <w:tcW w:type="dxa" w:w="1384"/>
@@ -2641,6 +2377,9 @@
         </w:tc>
       </w:tr>
       <w:tr>
+        <w:trPr>
+          <w:cantSplit/>
+        </w:trPr>
         <w:tc>
           <w:tcPr>
             <w:tcW w:type="dxa" w:w="1384"/>
@@ -2745,6 +2484,9 @@
         </w:tc>
       </w:tr>
       <w:tr>
+        <w:trPr>
+          <w:cantSplit/>
+        </w:trPr>
         <w:tc>
           <w:tcPr>
             <w:tcW w:type="dxa" w:w="1384"/>
@@ -2849,6 +2591,9 @@
         </w:tc>
       </w:tr>
       <w:tr>
+        <w:trPr>
+          <w:cantSplit/>
+        </w:trPr>
         <w:tc>
           <w:tcPr>
             <w:tcW w:type="dxa" w:w="1384"/>
@@ -2953,6 +2698,9 @@
         </w:tc>
       </w:tr>
       <w:tr>
+        <w:trPr>
+          <w:cantSplit/>
+        </w:trPr>
         <w:tc>
           <w:tcPr>
             <w:tcW w:type="dxa" w:w="1384"/>
@@ -3174,17 +2922,6 @@
     </w:p>
     <w:p>
       <w:pPr>
-        <w:spacing w:line="480" w:lineRule="auto" w:before="0" w:after="0"/>
-      </w:pPr>
-      <w:r>
-        <w:rPr>
-          <w:rFonts w:ascii="Georgia" w:hAnsi="Georgia" w:cs="Georgia"/>
-          <w:sz w:val="22"/>
-        </w:rPr>
-      </w:r>
-    </w:p>
-    <w:p>
-      <w:pPr>
         <w:pageBreakBefore/>
         <w:keepNext/>
         <w:keepLines/>
@@ -3311,6 +3048,10 @@
         <w:gridCol w:w="2769"/>
       </w:tblGrid>
       <w:tr>
+        <w:trPr>
+          <w:cantSplit/>
+          <w:tblHeader/>
+        </w:trPr>
         <w:tc>
           <w:tcPr>
             <w:tcW w:type="dxa" w:w="2769"/>
@@ -3373,6 +3114,9 @@
         </w:tc>
       </w:tr>
       <w:tr>
+        <w:trPr>
+          <w:cantSplit/>
+        </w:trPr>
         <w:tc>
           <w:tcPr>
             <w:tcW w:type="dxa" w:w="2769"/>
@@ -3426,6 +3170,9 @@
         </w:tc>
       </w:tr>
       <w:tr>
+        <w:trPr>
+          <w:cantSplit/>
+        </w:trPr>
         <w:tc>
           <w:tcPr>
             <w:tcW w:type="dxa" w:w="2769"/>
@@ -3479,6 +3226,9 @@
         </w:tc>
       </w:tr>
       <w:tr>
+        <w:trPr>
+          <w:cantSplit/>
+        </w:trPr>
         <w:tc>
           <w:tcPr>
             <w:tcW w:type="dxa" w:w="2769"/>
@@ -3532,6 +3282,9 @@
         </w:tc>
       </w:tr>
       <w:tr>
+        <w:trPr>
+          <w:cantSplit/>
+        </w:trPr>
         <w:tc>
           <w:tcPr>
             <w:tcW w:type="dxa" w:w="2769"/>
@@ -3585,6 +3338,9 @@
         </w:tc>
       </w:tr>
       <w:tr>
+        <w:trPr>
+          <w:cantSplit/>
+        </w:trPr>
         <w:tc>
           <w:tcPr>
             <w:tcW w:type="dxa" w:w="2769"/>
@@ -3752,6 +3508,10 @@
         <w:gridCol w:w="1384"/>
       </w:tblGrid>
       <w:tr>
+        <w:trPr>
+          <w:cantSplit/>
+          <w:tblHeader/>
+        </w:trPr>
         <w:tc>
           <w:tcPr>
             <w:tcW w:type="dxa" w:w="1384"/>
@@ -3874,6 +3634,9 @@
         </w:tc>
       </w:tr>
       <w:tr>
+        <w:trPr>
+          <w:cantSplit/>
+        </w:trPr>
         <w:tc>
           <w:tcPr>
             <w:tcW w:type="dxa" w:w="1384"/>
@@ -3978,6 +3741,9 @@
         </w:tc>
       </w:tr>
       <w:tr>
+        <w:trPr>
+          <w:cantSplit/>
+        </w:trPr>
         <w:tc>
           <w:tcPr>
             <w:tcW w:type="dxa" w:w="1384"/>
@@ -4082,6 +3848,9 @@
         </w:tc>
       </w:tr>
       <w:tr>
+        <w:trPr>
+          <w:cantSplit/>
+        </w:trPr>
         <w:tc>
           <w:tcPr>
             <w:tcW w:type="dxa" w:w="1384"/>
@@ -4186,6 +3955,9 @@
         </w:tc>
       </w:tr>
       <w:tr>
+        <w:trPr>
+          <w:cantSplit/>
+        </w:trPr>
         <w:tc>
           <w:tcPr>
             <w:tcW w:type="dxa" w:w="1384"/>
@@ -4471,6 +4243,10 @@
         <w:gridCol w:w="1038"/>
       </w:tblGrid>
       <w:tr>
+        <w:trPr>
+          <w:cantSplit/>
+          <w:tblHeader/>
+        </w:trPr>
         <w:tc>
           <w:tcPr>
             <w:tcW w:type="dxa" w:w="1038"/>
@@ -4633,6 +4409,9 @@
         </w:tc>
       </w:tr>
       <w:tr>
+        <w:trPr>
+          <w:cantSplit/>
+        </w:trPr>
         <w:tc>
           <w:tcPr>
             <w:tcW w:type="dxa" w:w="1038"/>
@@ -4771,6 +4550,9 @@
         </w:tc>
       </w:tr>
       <w:tr>
+        <w:trPr>
+          <w:cantSplit/>
+        </w:trPr>
         <w:tc>
           <w:tcPr>
             <w:tcW w:type="dxa" w:w="1038"/>
@@ -4909,6 +4691,9 @@
         </w:tc>
       </w:tr>
       <w:tr>
+        <w:trPr>
+          <w:cantSplit/>
+        </w:trPr>
         <w:tc>
           <w:tcPr>
             <w:tcW w:type="dxa" w:w="1038"/>
@@ -5047,6 +4832,9 @@
         </w:tc>
       </w:tr>
       <w:tr>
+        <w:trPr>
+          <w:cantSplit/>
+        </w:trPr>
         <w:tc>
           <w:tcPr>
             <w:tcW w:type="dxa" w:w="1038"/>
@@ -5377,6 +5165,10 @@
         <w:gridCol w:w="2769"/>
       </w:tblGrid>
       <w:tr>
+        <w:trPr>
+          <w:cantSplit/>
+          <w:tblHeader/>
+        </w:trPr>
         <w:tc>
           <w:tcPr>
             <w:tcW w:type="dxa" w:w="2769"/>
@@ -5439,6 +5231,9 @@
         </w:tc>
       </w:tr>
       <w:tr>
+        <w:trPr>
+          <w:cantSplit/>
+        </w:trPr>
         <w:tc>
           <w:tcPr>
             <w:tcW w:type="dxa" w:w="2769"/>
@@ -5492,6 +5287,9 @@
         </w:tc>
       </w:tr>
       <w:tr>
+        <w:trPr>
+          <w:cantSplit/>
+        </w:trPr>
         <w:tc>
           <w:tcPr>
             <w:tcW w:type="dxa" w:w="2769"/>
@@ -5545,6 +5343,9 @@
         </w:tc>
       </w:tr>
       <w:tr>
+        <w:trPr>
+          <w:cantSplit/>
+        </w:trPr>
         <w:tc>
           <w:tcPr>
             <w:tcW w:type="dxa" w:w="2769"/>
@@ -5598,6 +5399,9 @@
         </w:tc>
       </w:tr>
       <w:tr>
+        <w:trPr>
+          <w:cantSplit/>
+        </w:trPr>
         <w:tc>
           <w:tcPr>
             <w:tcW w:type="dxa" w:w="2769"/>
@@ -5868,17 +5672,6 @@
     </w:p>
     <w:p>
       <w:pPr>
-        <w:spacing w:line="480" w:lineRule="auto" w:before="0" w:after="0"/>
-      </w:pPr>
-      <w:r>
-        <w:rPr>
-          <w:rFonts w:ascii="Georgia" w:hAnsi="Georgia" w:cs="Georgia"/>
-          <w:sz w:val="22"/>
-        </w:rPr>
-      </w:r>
-    </w:p>
-    <w:p>
-      <w:pPr>
         <w:pageBreakBefore/>
         <w:keepNext/>
         <w:keepLines/>
@@ -6141,17 +5934,6 @@
     </w:p>
     <w:p>
       <w:pPr>
-        <w:spacing w:line="480" w:lineRule="auto" w:before="0" w:after="0"/>
-      </w:pPr>
-      <w:r>
-        <w:rPr>
-          <w:rFonts w:ascii="Georgia" w:hAnsi="Georgia" w:cs="Georgia"/>
-          <w:sz w:val="22"/>
-        </w:rPr>
-      </w:r>
-    </w:p>
-    <w:p>
-      <w:pPr>
         <w:pageBreakBefore/>
         <w:keepNext/>
         <w:keepLines/>
@@ -6833,17 +6615,6 @@
     </w:p>
     <w:p>
       <w:pPr>
-        <w:spacing w:line="480" w:lineRule="auto" w:before="0" w:after="0"/>
-      </w:pPr>
-      <w:r>
-        <w:rPr>
-          <w:rFonts w:ascii="Georgia" w:hAnsi="Georgia" w:cs="Georgia"/>
-          <w:sz w:val="22"/>
-        </w:rPr>
-      </w:r>
-    </w:p>
-    <w:p>
-      <w:pPr>
         <w:pageBreakBefore/>
         <w:keepNext/>
         <w:keepLines/>
@@ -6858,19 +6629,6 @@
           <w:sz w:val="28"/>
         </w:rPr>
         <w:t>APPENDICES</w:t>
-      </w:r>
-    </w:p>
-    <w:p>
-      <w:pPr>
-        <w:spacing w:after="0" w:before="0"/>
-      </w:pPr>
-      <w:r>
-        <w:rPr>
-          <w:rFonts w:ascii="Georgia" w:hAnsi="Georgia" w:eastAsia="Georgia"/>
-          <w:b w:val="0"/>
-          <w:i w:val="0"/>
-          <w:sz w:val="22"/>
-        </w:rPr>
       </w:r>
     </w:p>
     <w:p>
@@ -7699,6 +7457,7 @@
       <w:tr>
         <w:trPr>
           <w:cantSplit/>
+          <w:tblHeader/>
         </w:trPr>
         <w:tc>
           <w:tcPr>
@@ -8506,6 +8265,7 @@
       <w:tr>
         <w:trPr>
           <w:cantSplit/>
+          <w:tblHeader/>
         </w:trPr>
         <w:tc>
           <w:tcPr>
@@ -9051,6 +8811,7 @@
       <w:tr>
         <w:trPr>
           <w:cantSplit/>
+          <w:tblHeader/>
         </w:trPr>
         <w:tc>
           <w:tcPr>
@@ -9785,6 +9546,7 @@
       <w:tr>
         <w:trPr>
           <w:cantSplit/>
+          <w:tblHeader/>
         </w:trPr>
         <w:tc>
           <w:tcPr>
@@ -10404,6 +10166,7 @@
       <w:tr>
         <w:trPr>
           <w:cantSplit/>
+          <w:tblHeader/>
         </w:trPr>
         <w:tc>
           <w:tcPr>
@@ -10885,6 +10648,7 @@
       <w:tr>
         <w:trPr>
           <w:cantSplit/>
+          <w:tblHeader/>
         </w:trPr>
         <w:tc>
           <w:tcPr>
@@ -11506,6 +11270,7 @@
       <w:tr>
         <w:trPr>
           <w:cantSplit/>
+          <w:tblHeader/>
         </w:trPr>
         <w:tc>
           <w:tcPr>
@@ -11954,6 +11719,7 @@
       <w:tr>
         <w:trPr>
           <w:cantSplit/>
+          <w:tblHeader/>
         </w:trPr>
         <w:tc>
           <w:tcPr>
@@ -12285,6 +12051,7 @@
       <w:tr>
         <w:trPr>
           <w:cantSplit/>
+          <w:tblHeader/>
         </w:trPr>
         <w:tc>
           <w:tcPr>
@@ -13132,32 +12899,6 @@
     </w:p>
     <w:p>
       <w:pPr>
-        <w:spacing w:before="0" w:after="0" w:line="240" w:lineRule="auto"/>
-      </w:pPr>
-      <w:r>
-        <w:rPr>
-          <w:rFonts w:ascii="Georgia" w:hAnsi="Georgia" w:eastAsia="Georgia"/>
-          <w:b w:val="0"/>
-          <w:i w:val="0"/>
-          <w:sz w:val="22"/>
-        </w:rPr>
-      </w:r>
-    </w:p>
-    <w:p>
-      <w:pPr>
-        <w:spacing w:before="0" w:after="0" w:line="240" w:lineRule="auto"/>
-      </w:pPr>
-      <w:r>
-        <w:rPr>
-          <w:rFonts w:ascii="Georgia" w:hAnsi="Georgia" w:eastAsia="Georgia"/>
-          <w:b w:val="0"/>
-          <w:i w:val="0"/>
-          <w:sz w:val="22"/>
-        </w:rPr>
-      </w:r>
-    </w:p>
-    <w:p>
-      <w:pPr>
         <w:pageBreakBefore/>
         <w:spacing w:before="360" w:after="200" w:line="240" w:lineRule="auto"/>
         <w:jc w:val="center"/>
@@ -20037,32 +19778,6 @@
           <w:docGrid w:linePitch="360"/>
         </w:sectPr>
       </w:pPr>
-    </w:p>
-    <w:p>
-      <w:pPr>
-        <w:spacing w:before="0" w:after="0" w:line="240" w:lineRule="auto"/>
-      </w:pPr>
-      <w:r>
-        <w:rPr>
-          <w:rFonts w:ascii="Georgia" w:hAnsi="Georgia" w:eastAsia="Georgia"/>
-          <w:b w:val="0"/>
-          <w:i w:val="0"/>
-          <w:sz w:val="22"/>
-        </w:rPr>
-      </w:r>
-    </w:p>
-    <w:p>
-      <w:pPr>
-        <w:spacing w:before="0" w:after="0" w:line="240" w:lineRule="auto"/>
-      </w:pPr>
-      <w:r>
-        <w:rPr>
-          <w:rFonts w:ascii="Georgia" w:hAnsi="Georgia" w:eastAsia="Georgia"/>
-          <w:b w:val="0"/>
-          <w:i w:val="0"/>
-          <w:sz w:val="22"/>
-        </w:rPr>
-      </w:r>
     </w:p>
     <w:p>
       <w:pPr>

</xml_diff>

<commit_message>
Draft_012 (in place): revert tables to TableGrid style + restore D5 spacing pattern (4 empties before major headings, 3 before sub-headings)
</commit_message>
<xml_diff>
--- a/thesis/003_ThesisProposal_Draft_012.docx
+++ b/thesis/003_ThesisProposal_Draft_012.docx
@@ -378,6 +378,8 @@
         </w:rPr>
       </w:r>
     </w:p>
+    <w:p/>
+    <w:p/>
     <w:p>
       <w:pPr>
         <w:keepNext/>
@@ -408,6 +410,8 @@
         </w:rPr>
       </w:r>
     </w:p>
+    <w:p/>
+    <w:p/>
     <w:p>
       <w:pPr>
         <w:keepNext/>
@@ -782,6 +786,8 @@
         <w:t xml:space="preserve"/>
       </w:r>
     </w:p>
+    <w:p/>
+    <w:p/>
     <w:p>
       <w:pPr>
         <w:keepNext/>
@@ -891,6 +897,9 @@
         <w:t>4. What do the frequency and functional patterns suggest about the construction of epistemic stance through hedging among developing researchers?</w:t>
       </w:r>
     </w:p>
+    <w:p/>
+    <w:p/>
+    <w:p/>
     <w:p>
       <w:pPr>
         <w:keepNext/>
@@ -1042,6 +1051,9 @@
         </w:drawing>
       </w:r>
     </w:p>
+    <w:p/>
+    <w:p/>
+    <w:p/>
     <w:p>
       <w:pPr>
         <w:keepNext/>
@@ -1175,6 +1187,8 @@
         <w:t/>
       </w:r>
     </w:p>
+    <w:p/>
+    <w:p/>
     <w:p>
       <w:pPr>
         <w:keepNext/>
@@ -1292,6 +1306,9 @@
         <w:t>Crucially, this study analyzes the archived thesis abstract as a ratified textual product rather than a measure of individual cognition. Undergraduate theses are heavily supervised, and abstracts are often the product of multiple revisions guided by advisers. Consequently, observed hedging patterns do not solely reflect the independent rhetorical choices or internalized norms of developing researchers; rather, they reflect the standards of the disciplinary community as enforced by faculty advisers. Therefore, while the study investigates patterns within texts produced by developing researchers, its claims are limited to the epistemic stance constructed in the final abstracts and the departmental standards they represent, rather than the internal cognitive processes of the writers themselves. The findings are strictly descriptive of the observed patterns within the PSAU context.</w:t>
       </w:r>
     </w:p>
+    <w:p/>
+    <w:p/>
+    <w:p/>
     <w:p>
       <w:pPr>
         <w:keepNext/>
@@ -1699,6 +1716,8 @@
         </w:rPr>
       </w:r>
     </w:p>
+    <w:p/>
+    <w:p/>
     <w:p>
       <w:pPr>
         <w:pageBreakBefore/>
@@ -1730,6 +1749,8 @@
         </w:rPr>
       </w:r>
     </w:p>
+    <w:p/>
+    <w:p/>
     <w:p>
       <w:pPr>
         <w:spacing w:line="480" w:lineRule="auto" w:before="0" w:after="0"/>
@@ -1746,6 +1767,9 @@
         <w:t>This chapter describes the research design, institutional context, data collection process, and corpus selection for the study. Each methodological decision was justified by the nature of the research questions and the practical constraints of an undergraduate thesis.</w:t>
       </w:r>
     </w:p>
+    <w:p/>
+    <w:p/>
+    <w:p/>
     <w:p>
       <w:pPr>
         <w:keepNext/>
@@ -1811,6 +1835,9 @@
         <w:t>The PSAU thesis guidelines prescribed standard formatting but did not impose a rigid rhetorical template for abstracts. This allowed for disciplinary and individual variation in linguistic choices, ensuring that observed hedging patterns reflected negotiated textual choices rather than rigid institutional constraints.</w:t>
       </w:r>
     </w:p>
+    <w:p/>
+    <w:p/>
+    <w:p/>
     <w:p>
       <w:pPr>
         <w:keepNext/>
@@ -1844,6 +1871,9 @@
         <w:t>This study employed a descriptive mixed-methods design combining quantitative frequency analysis with qualitative functional interpretation (Biber et al., 1998). The quantitative layer identified hedging type and distribution patterns through frequency counts normalized per 100 words. This enabled cross-disciplinary comparison on a common scale. The qualitative layer involved functional coding using Hyland’s (1998) framework to assign rhetorical purposes to the identified hedges. The interpretation of disciplinary patterns was then informed by two theoretical lenses. These are Salager-Meyer’s (1994) concept of claim-responsibility and Hyland’s (2005) model of stance and engagement. All coding was conducted manually using Google Sheets. This prioritized researcher judgment over automated processing for functional coding decisions, since automated tools cannot reliably assign hedge function from context, which was central to this study’s research questions.</w:t>
       </w:r>
     </w:p>
+    <w:p/>
+    <w:p/>
+    <w:p/>
     <w:p>
       <w:pPr>
         <w:keepNext/>
@@ -2027,6 +2057,9 @@
         <w:t>Permission and library access: 1 week. Corpus construction and on-site photography: 3 weeks. OCR verification and text preparation: 2 weeks. Pilot testing and coding finalization: 2 weeks. Full coding and frequency analysis: 8 weeks (approximately 10 hours per week). Writing and revision: 8 weeks. Total timeframe: approximately 5.5 months (24 weeks).</w:t>
       </w:r>
     </w:p>
+    <w:p/>
+    <w:p/>
+    <w:p/>
     <w:p>
       <w:pPr>
         <w:keepNext/>
@@ -2060,6 +2093,9 @@
         <w:t>Following an initial coding pass, borderline tokens were re-examined using the contextual decision rules in Appendix A. Particular attention was given to potentially ambiguous forms such as can, potential, indicating, and possibility, because these forms may function either as epistemic hedges or as non-epistemic lexical items depending on context. Four rule refinements were applied during this revision pass. First, “can” combined with an active content verb describing a treatment effect (enhance, promote, reduce, help) was classified as capability (FP-Cap) regardless of whether it appeared inside a “suggests that” clause, because the Working Test showed that removing “can” alone did not change the epistemic weight of the clause when “suggests” was already carrying the hedge. Second, the “indicating” tautology test was extended beyond numeric restatement to cover field-standard interpretive thresholds: “non-toxic” from no mortality observed, “limited benefits” from poor performance, and “superior feed efficiency” from lower feed conversion ratio were all reclassified as operational restatements (FP-Gen) rather than inferential hedges. Third, the “potential + noun” topic-naming rule was extended to “possibility + noun” in aim and methods sentences. Fourth, a multi-hedge Working Test rule was added: when a sentence contains multiple hedge-like tokens, each token is tested individually in isolation, ignoring the other hedges in the sentence; a token counts only if removing it alone changes the epistemic weight of its own clause. The final corpus therefore reflects contextual rather than purely lexical classification, and the 63 rejected candidates document the decision trail for tokens that were considered but ultimately excluded. Additionally, the outlier abstract Acs2 was found to use a repeated hedging template (“This suggests that while X might not have been Y, Z could still [verb] beneficial effects”) twice with light variation, inflating its own token count through formulaic repetition rather than independent hedging decisions.</w:t>
       </w:r>
     </w:p>
+    <w:p/>
+    <w:p/>
+    <w:p/>
     <w:p>
       <w:pPr>
         <w:keepNext/>
@@ -2123,17 +2159,10 @@
     </w:p>
     <w:tbl>
       <w:tblPr>
+        <w:tblStyle w:val="TableGrid"/>
         <w:tblW w:type="auto" w:w="0"/>
         <w:tblLayout w:type="autofit"/>
         <w:tblLook w:firstColumn="1" w:firstRow="1" w:lastColumn="0" w:lastRow="0" w:noHBand="0" w:noVBand="1" w:val="04A0"/>
-        <w:tblBorders>
-          <w:top w:val="single" w:sz="18" w:space="0" w:color="000000"/>
-          <w:left w:val="nil" w:sz="0" w:space="0" w:color="000000"/>
-          <w:right w:val="nil" w:sz="0" w:space="0" w:color="000000"/>
-          <w:bottom w:val="single" w:sz="18" w:space="0" w:color="000000"/>
-          <w:insideH w:val="nil" w:sz="0" w:space="0" w:color="000000"/>
-          <w:insideV w:val="nil" w:sz="0" w:space="0" w:color="000000"/>
-        </w:tblBorders>
       </w:tblPr>
       <w:tblGrid>
         <w:gridCol w:w="1384"/>
@@ -2151,9 +2180,6 @@
         <w:tc>
           <w:tcPr>
             <w:tcW w:type="dxa" w:w="1384"/>
-            <w:tcBorders>
-              <w:bottom w:val="single" w:sz="2" w:space="0" w:color="000000"/>
-            </w:tcBorders>
           </w:tcPr>
           <w:p>
             <w:r/>
@@ -2171,9 +2197,6 @@
         <w:tc>
           <w:tcPr>
             <w:tcW w:type="dxa" w:w="1384"/>
-            <w:tcBorders>
-              <w:bottom w:val="single" w:sz="2" w:space="0" w:color="000000"/>
-            </w:tcBorders>
           </w:tcPr>
           <w:p>
             <w:r/>
@@ -2191,9 +2214,6 @@
         <w:tc>
           <w:tcPr>
             <w:tcW w:type="dxa" w:w="1384"/>
-            <w:tcBorders>
-              <w:bottom w:val="single" w:sz="2" w:space="0" w:color="000000"/>
-            </w:tcBorders>
           </w:tcPr>
           <w:p>
             <w:r/>
@@ -2211,9 +2231,6 @@
         <w:tc>
           <w:tcPr>
             <w:tcW w:type="dxa" w:w="1384"/>
-            <w:tcBorders>
-              <w:bottom w:val="single" w:sz="2" w:space="0" w:color="000000"/>
-            </w:tcBorders>
           </w:tcPr>
           <w:p>
             <w:r/>
@@ -2231,9 +2248,6 @@
         <w:tc>
           <w:tcPr>
             <w:tcW w:type="dxa" w:w="1384"/>
-            <w:tcBorders>
-              <w:bottom w:val="single" w:sz="2" w:space="0" w:color="000000"/>
-            </w:tcBorders>
           </w:tcPr>
           <w:p>
             <w:r/>
@@ -2251,9 +2265,6 @@
         <w:tc>
           <w:tcPr>
             <w:tcW w:type="dxa" w:w="1384"/>
-            <w:tcBorders>
-              <w:bottom w:val="single" w:sz="2" w:space="0" w:color="000000"/>
-            </w:tcBorders>
           </w:tcPr>
           <w:p>
             <w:r/>
@@ -2920,6 +2931,8 @@
         </w:rPr>
       </w:r>
     </w:p>
+    <w:p/>
+    <w:p/>
     <w:p>
       <w:pPr>
         <w:pageBreakBefore/>
@@ -2951,6 +2964,8 @@
         </w:rPr>
       </w:r>
     </w:p>
+    <w:p/>
+    <w:p/>
     <w:p>
       <w:pPr>
         <w:spacing w:line="480" w:lineRule="auto" w:before="0" w:after="0"/>
@@ -2967,6 +2982,9 @@
         <w:t>This chapter presents the results, analysis, and discussion of the hedging patterns identified in the 60 undergraduate thesis abstracts across Agriculture, Veterinary Medicine, and Biology at Pampanga State Agricultural University. The chapter is organized into four parts, each corresponding to a research question. Part I presents the types of hedging devices found across the three disciplines. Part II examines how hedge frequency varies across Agriculture, Veterinary Medicine, and Biology. Part III identifies the rhetorical functions served by the hedging devices. Part IV discusses what the frequency and functional patterns suggest about the discipline-specific hedging profile of developing researchers.</w:t>
       </w:r>
     </w:p>
+    <w:p/>
+    <w:p/>
+    <w:p/>
     <w:p>
       <w:pPr>
         <w:keepNext/>
@@ -3030,17 +3048,10 @@
     </w:p>
     <w:tbl>
       <w:tblPr>
+        <w:tblStyle w:val="TableGrid"/>
         <w:tblW w:type="auto" w:w="0"/>
         <w:tblLayout w:type="autofit"/>
         <w:tblLook w:firstColumn="1" w:firstRow="1" w:lastColumn="0" w:lastRow="0" w:noHBand="0" w:noVBand="1" w:val="04A0"/>
-        <w:tblBorders>
-          <w:top w:val="single" w:sz="18" w:space="0" w:color="000000"/>
-          <w:left w:val="nil" w:sz="0" w:space="0" w:color="000000"/>
-          <w:right w:val="nil" w:sz="0" w:space="0" w:color="000000"/>
-          <w:bottom w:val="single" w:sz="18" w:space="0" w:color="000000"/>
-          <w:insideH w:val="nil" w:sz="0" w:space="0" w:color="000000"/>
-          <w:insideV w:val="nil" w:sz="0" w:space="0" w:color="000000"/>
-        </w:tblBorders>
       </w:tblPr>
       <w:tblGrid>
         <w:gridCol w:w="2769"/>
@@ -3055,9 +3066,6 @@
         <w:tc>
           <w:tcPr>
             <w:tcW w:type="dxa" w:w="2769"/>
-            <w:tcBorders>
-              <w:bottom w:val="single" w:sz="2" w:space="0" w:color="000000"/>
-            </w:tcBorders>
           </w:tcPr>
           <w:p>
             <w:r/>
@@ -3075,9 +3083,6 @@
         <w:tc>
           <w:tcPr>
             <w:tcW w:type="dxa" w:w="2769"/>
-            <w:tcBorders>
-              <w:bottom w:val="single" w:sz="2" w:space="0" w:color="000000"/>
-            </w:tcBorders>
           </w:tcPr>
           <w:p>
             <w:r/>
@@ -3095,9 +3100,6 @@
         <w:tc>
           <w:tcPr>
             <w:tcW w:type="dxa" w:w="2769"/>
-            <w:tcBorders>
-              <w:bottom w:val="single" w:sz="2" w:space="0" w:color="000000"/>
-            </w:tcBorders>
           </w:tcPr>
           <w:p>
             <w:r/>
@@ -3487,17 +3489,10 @@
     </w:p>
     <w:tbl>
       <w:tblPr>
+        <w:tblStyle w:val="TableGrid"/>
         <w:tblW w:type="auto" w:w="0"/>
         <w:tblLayout w:type="autofit"/>
         <w:tblLook w:firstColumn="1" w:firstRow="1" w:lastColumn="0" w:lastRow="0" w:noHBand="0" w:noVBand="1" w:val="04A0"/>
-        <w:tblBorders>
-          <w:top w:val="single" w:sz="18" w:space="0" w:color="000000"/>
-          <w:left w:val="nil" w:sz="0" w:space="0" w:color="000000"/>
-          <w:right w:val="nil" w:sz="0" w:space="0" w:color="000000"/>
-          <w:bottom w:val="single" w:sz="18" w:space="0" w:color="000000"/>
-          <w:insideH w:val="nil" w:sz="0" w:space="0" w:color="000000"/>
-          <w:insideV w:val="nil" w:sz="0" w:space="0" w:color="000000"/>
-        </w:tblBorders>
       </w:tblPr>
       <w:tblGrid>
         <w:gridCol w:w="1384"/>
@@ -3515,9 +3510,6 @@
         <w:tc>
           <w:tcPr>
             <w:tcW w:type="dxa" w:w="1384"/>
-            <w:tcBorders>
-              <w:bottom w:val="single" w:sz="2" w:space="0" w:color="000000"/>
-            </w:tcBorders>
           </w:tcPr>
           <w:p>
             <w:r/>
@@ -3535,9 +3527,6 @@
         <w:tc>
           <w:tcPr>
             <w:tcW w:type="dxa" w:w="1384"/>
-            <w:tcBorders>
-              <w:bottom w:val="single" w:sz="2" w:space="0" w:color="000000"/>
-            </w:tcBorders>
           </w:tcPr>
           <w:p>
             <w:r/>
@@ -3555,9 +3544,6 @@
         <w:tc>
           <w:tcPr>
             <w:tcW w:type="dxa" w:w="1384"/>
-            <w:tcBorders>
-              <w:bottom w:val="single" w:sz="2" w:space="0" w:color="000000"/>
-            </w:tcBorders>
           </w:tcPr>
           <w:p>
             <w:r/>
@@ -3575,9 +3561,6 @@
         <w:tc>
           <w:tcPr>
             <w:tcW w:type="dxa" w:w="1384"/>
-            <w:tcBorders>
-              <w:bottom w:val="single" w:sz="2" w:space="0" w:color="000000"/>
-            </w:tcBorders>
           </w:tcPr>
           <w:p>
             <w:r/>
@@ -3595,9 +3578,6 @@
         <w:tc>
           <w:tcPr>
             <w:tcW w:type="dxa" w:w="1384"/>
-            <w:tcBorders>
-              <w:bottom w:val="single" w:sz="2" w:space="0" w:color="000000"/>
-            </w:tcBorders>
           </w:tcPr>
           <w:p>
             <w:r/>
@@ -3615,9 +3595,6 @@
         <w:tc>
           <w:tcPr>
             <w:tcW w:type="dxa" w:w="1384"/>
-            <w:tcBorders>
-              <w:bottom w:val="single" w:sz="2" w:space="0" w:color="000000"/>
-            </w:tcBorders>
           </w:tcPr>
           <w:p>
             <w:r/>
@@ -4157,6 +4134,9 @@
         <w:t>Booster analysis of the 28 zero-hedge abstracts revealed 88 booster tokens, averaging approximately 3.1 boosters per abstract. The most frequent boosters were showed (18 instances), revealed (13), observed (12), and highest (12). This density of assertive markers confirms that zero-hedge abstracts do not represent neutral reporting but rather an absence of overt hedging, where findings are stated with emphatic rather than tentative language.</w:t>
       </w:r>
     </w:p>
+    <w:p/>
+    <w:p/>
+    <w:p/>
     <w:p>
       <w:pPr>
         <w:keepNext/>
@@ -4220,17 +4200,10 @@
     </w:p>
     <w:tbl>
       <w:tblPr>
+        <w:tblStyle w:val="TableGrid"/>
         <w:tblW w:type="auto" w:w="0"/>
         <w:tblLayout w:type="autofit"/>
         <w:tblLook w:firstColumn="1" w:firstRow="1" w:lastColumn="0" w:lastRow="0" w:noHBand="0" w:noVBand="1" w:val="04A0"/>
-        <w:tblBorders>
-          <w:top w:val="single" w:sz="18" w:space="0" w:color="000000"/>
-          <w:left w:val="nil" w:sz="0" w:space="0" w:color="000000"/>
-          <w:right w:val="nil" w:sz="0" w:space="0" w:color="000000"/>
-          <w:bottom w:val="single" w:sz="18" w:space="0" w:color="000000"/>
-          <w:insideH w:val="nil" w:sz="0" w:space="0" w:color="000000"/>
-          <w:insideV w:val="nil" w:sz="0" w:space="0" w:color="000000"/>
-        </w:tblBorders>
       </w:tblPr>
       <w:tblGrid>
         <w:gridCol w:w="1038"/>
@@ -4250,9 +4223,6 @@
         <w:tc>
           <w:tcPr>
             <w:tcW w:type="dxa" w:w="1038"/>
-            <w:tcBorders>
-              <w:bottom w:val="single" w:sz="2" w:space="0" w:color="000000"/>
-            </w:tcBorders>
           </w:tcPr>
           <w:p>
             <w:r/>
@@ -4270,9 +4240,6 @@
         <w:tc>
           <w:tcPr>
             <w:tcW w:type="dxa" w:w="1038"/>
-            <w:tcBorders>
-              <w:bottom w:val="single" w:sz="2" w:space="0" w:color="000000"/>
-            </w:tcBorders>
           </w:tcPr>
           <w:p>
             <w:r/>
@@ -4290,9 +4257,6 @@
         <w:tc>
           <w:tcPr>
             <w:tcW w:type="dxa" w:w="1038"/>
-            <w:tcBorders>
-              <w:bottom w:val="single" w:sz="2" w:space="0" w:color="000000"/>
-            </w:tcBorders>
           </w:tcPr>
           <w:p>
             <w:r/>
@@ -4310,9 +4274,6 @@
         <w:tc>
           <w:tcPr>
             <w:tcW w:type="dxa" w:w="1038"/>
-            <w:tcBorders>
-              <w:bottom w:val="single" w:sz="2" w:space="0" w:color="000000"/>
-            </w:tcBorders>
           </w:tcPr>
           <w:p>
             <w:r/>
@@ -4330,9 +4291,6 @@
         <w:tc>
           <w:tcPr>
             <w:tcW w:type="dxa" w:w="1038"/>
-            <w:tcBorders>
-              <w:bottom w:val="single" w:sz="2" w:space="0" w:color="000000"/>
-            </w:tcBorders>
           </w:tcPr>
           <w:p>
             <w:r/>
@@ -4350,9 +4308,6 @@
         <w:tc>
           <w:tcPr>
             <w:tcW w:type="dxa" w:w="1038"/>
-            <w:tcBorders>
-              <w:bottom w:val="single" w:sz="2" w:space="0" w:color="000000"/>
-            </w:tcBorders>
           </w:tcPr>
           <w:p>
             <w:r/>
@@ -4370,9 +4325,6 @@
         <w:tc>
           <w:tcPr>
             <w:tcW w:type="dxa" w:w="1038"/>
-            <w:tcBorders>
-              <w:bottom w:val="single" w:sz="2" w:space="0" w:color="000000"/>
-            </w:tcBorders>
           </w:tcPr>
           <w:p>
             <w:r/>
@@ -4390,9 +4342,6 @@
         <w:tc>
           <w:tcPr>
             <w:tcW w:type="dxa" w:w="1038"/>
-            <w:tcBorders>
-              <w:bottom w:val="single" w:sz="2" w:space="0" w:color="000000"/>
-            </w:tcBorders>
           </w:tcPr>
           <w:p>
             <w:r/>
@@ -5084,6 +5033,9 @@
         <w:t>The false positive distribution also varies by discipline. Biology produced 35 false positives, far more than Agriculture (15) or Veterinary Medicine (13). This is partly because Biology abstracts contained more instances of “potential” in aim statements and “indicated by” evidential pointers, constructions that look like hedges but do not express uncertainty about a claim. The higher false positive count in Biology does not necessarily mean Biology writers hedge more. It means they use more hedge-like vocabulary in non-hedging functions.</w:t>
       </w:r>
     </w:p>
+    <w:p/>
+    <w:p/>
+    <w:p/>
     <w:p>
       <w:pPr>
         <w:keepNext/>
@@ -5147,17 +5099,10 @@
     </w:p>
     <w:tbl>
       <w:tblPr>
+        <w:tblStyle w:val="TableGrid"/>
         <w:tblW w:type="auto" w:w="0"/>
         <w:tblLayout w:type="autofit"/>
         <w:tblLook w:firstColumn="1" w:firstRow="1" w:lastColumn="0" w:lastRow="0" w:noHBand="0" w:noVBand="1" w:val="04A0"/>
-        <w:tblBorders>
-          <w:top w:val="single" w:sz="18" w:space="0" w:color="000000"/>
-          <w:left w:val="nil" w:sz="0" w:space="0" w:color="000000"/>
-          <w:right w:val="nil" w:sz="0" w:space="0" w:color="000000"/>
-          <w:bottom w:val="single" w:sz="18" w:space="0" w:color="000000"/>
-          <w:insideH w:val="nil" w:sz="0" w:space="0" w:color="000000"/>
-          <w:insideV w:val="nil" w:sz="0" w:space="0" w:color="000000"/>
-        </w:tblBorders>
       </w:tblPr>
       <w:tblGrid>
         <w:gridCol w:w="2769"/>
@@ -5172,9 +5117,6 @@
         <w:tc>
           <w:tcPr>
             <w:tcW w:type="dxa" w:w="2769"/>
-            <w:tcBorders>
-              <w:bottom w:val="single" w:sz="2" w:space="0" w:color="000000"/>
-            </w:tcBorders>
           </w:tcPr>
           <w:p>
             <w:r/>
@@ -5192,9 +5134,6 @@
         <w:tc>
           <w:tcPr>
             <w:tcW w:type="dxa" w:w="2769"/>
-            <w:tcBorders>
-              <w:bottom w:val="single" w:sz="2" w:space="0" w:color="000000"/>
-            </w:tcBorders>
           </w:tcPr>
           <w:p>
             <w:r/>
@@ -5212,9 +5151,6 @@
         <w:tc>
           <w:tcPr>
             <w:tcW w:type="dxa" w:w="2769"/>
-            <w:tcBorders>
-              <w:bottom w:val="single" w:sz="2" w:space="0" w:color="000000"/>
-            </w:tcBorders>
           </w:tcPr>
           <w:p>
             <w:r/>
@@ -5522,6 +5458,9 @@
         <w:t>The relationship between hedge type and function further illuminates the patterns. Modal verbs (21 instances, all EC) were used almost exclusively to express possibility about results or implications, as in “the biosynthesis... may affect the overall development.” Lexical hedges (36 instances, all EC) were used to qualify the strength of findings, as in “results suggest that fermented banana peel... can significantly enhance growth.” The convergence of all hedge types on a single function reinforces the interpretation that these writers view hedging primarily as a tool for managing factual certainty, not for managing social or textual relationships.</w:t>
       </w:r>
     </w:p>
+    <w:p/>
+    <w:p/>
+    <w:p/>
     <w:p>
       <w:pPr>
         <w:keepNext/>
@@ -5670,6 +5609,8 @@
         </w:rPr>
       </w:r>
     </w:p>
+    <w:p/>
+    <w:p/>
     <w:p>
       <w:pPr>
         <w:pageBreakBefore/>
@@ -5717,6 +5658,9 @@
         <w:t xml:space="preserve">This study mapped hedging in 60 undergraduate thesis abstracts across Agriculture, Veterinary Medicine, and Biology at PSAU.</w:t>
       </w:r>
     </w:p>
+    <w:p/>
+    <w:p/>
+    <w:p/>
     <w:p>
       <w:pPr>
         <w:keepNext/>
@@ -5782,6 +5726,8 @@
         <w:t xml:space="preserve"/>
       </w:r>
     </w:p>
+    <w:p/>
+    <w:p/>
     <w:p>
       <w:pPr>
         <w:keepNext/>
@@ -5932,6 +5878,8 @@
         </w:rPr>
       </w:r>
     </w:p>
+    <w:p/>
+    <w:p/>
     <w:p>
       <w:pPr>
         <w:pageBreakBefore/>
@@ -6613,6 +6561,8 @@
         </w:rPr>
       </w:r>
     </w:p>
+    <w:p/>
+    <w:p/>
     <w:p>
       <w:pPr>
         <w:pageBreakBefore/>
@@ -6657,6 +6607,8 @@
         </w:rPr>
       </w:r>
     </w:p>
+    <w:p/>
+    <w:p/>
     <w:p>
       <w:pPr>
         <w:spacing w:before="120" w:after="200" w:line="240" w:lineRule="auto"/>
@@ -6701,6 +6653,9 @@
         <w:t>This appendix is the full coding protocol used for the study. It opens with a one-page quick-reference, then gives the operational layers, decision rules, false-positive categories, and recording conventions.</w:t>
       </w:r>
     </w:p>
+    <w:p/>
+    <w:p/>
+    <w:p/>
     <w:p>
       <w:pPr>
         <w:spacing w:line="240" w:lineRule="auto" w:before="240" w:after="120"/>
@@ -7176,6 +7131,9 @@
         <w:t>Ability, future procedure, and necessity (must / should in procedural contexts) are never hedges. Working Test: if removing the device does not change how certain or tentative the claim is, it is not a hedge.</w:t>
       </w:r>
     </w:p>
+    <w:p/>
+    <w:p/>
+    <w:p/>
     <w:p>
       <w:pPr>
         <w:spacing w:before="320" w:after="160" w:line="240" w:lineRule="auto"/>
@@ -7251,6 +7209,9 @@
         <w:t>This codebook turns Hyland’s (1998) framework into a practical coding scheme for the PSAU undergraduate thesis abstract corpus. Highlights are background colors applied by hand or digital highlighter on printed or PDF copies. They are not font colors and are not software-dependent. The marked hard copy is the primary record; any spreadsheet is only a derived tally.</w:t>
       </w:r>
     </w:p>
+    <w:p/>
+    <w:p/>
+    <w:p/>
     <w:p>
       <w:pPr>
         <w:keepNext/>
@@ -7394,6 +7355,9 @@
         <w:t>Coding order: read the sentence in full, check Decision Rules, apply the Working Test if unresolved, and log any case that still can’t be resolved in Coder Notes rather than guessing.</w:t>
       </w:r>
     </w:p>
+    <w:p/>
+    <w:p/>
+    <w:p/>
     <w:p>
       <w:pPr>
         <w:keepNext/>
@@ -7429,6 +7393,7 @@
     </w:p>
     <w:tbl>
       <w:tblPr>
+        <w:tblStyle w:val="TableGrid"/>
         <w:tblW w:type="auto" w:w="0"/>
         <w:tblLayout w:type="fixed"/>
         <w:tblLook w:firstColumn="1" w:firstRow="1" w:lastColumn="0" w:lastRow="0" w:noHBand="0" w:noVBand="1" w:val="04A0"/>
@@ -7439,14 +7404,6 @@
           <w:bottom w:w="20" w:type="dxa"/>
           <w:right w:w="40" w:type="dxa"/>
         </w:tblCellMar>
-        <w:tblBorders>
-          <w:top w:val="single" w:sz="18" w:space="0" w:color="000000"/>
-          <w:left w:val="nil" w:sz="0" w:space="0" w:color="000000"/>
-          <w:right w:val="nil" w:sz="0" w:space="0" w:color="000000"/>
-          <w:bottom w:val="single" w:sz="18" w:space="0" w:color="000000"/>
-          <w:insideH w:val="nil" w:sz="0" w:space="0" w:color="000000"/>
-          <w:insideV w:val="nil" w:sz="0" w:space="0" w:color="000000"/>
-        </w:tblBorders>
       </w:tblPr>
       <w:tblGrid>
         <w:gridCol w:w="2076"/>
@@ -7464,9 +7421,6 @@
             <w:tcW w:type="dxa" w:w="2076"/>
             <w:shd w:val="clear" w:color="auto" w:fill="F2F4F6"/>
             <w:tcW w:w="900" w:type="dxa"/>
-            <w:tcBorders>
-              <w:bottom w:val="single" w:sz="2" w:space="0" w:color="000000"/>
-            </w:tcBorders>
           </w:tcPr>
           <w:p>
             <w:pPr>
@@ -7488,9 +7442,6 @@
             <w:tcW w:type="dxa" w:w="2076"/>
             <w:shd w:val="clear" w:color="auto" w:fill="F2F4F6"/>
             <w:tcW w:w="1600" w:type="dxa"/>
-            <w:tcBorders>
-              <w:bottom w:val="single" w:sz="2" w:space="0" w:color="000000"/>
-            </w:tcBorders>
           </w:tcPr>
           <w:p>
             <w:pPr>
@@ -7512,9 +7463,6 @@
             <w:tcW w:type="dxa" w:w="2076"/>
             <w:shd w:val="clear" w:color="auto" w:fill="F2F4F6"/>
             <w:tcW w:w="2700" w:type="dxa"/>
-            <w:tcBorders>
-              <w:bottom w:val="single" w:sz="2" w:space="0" w:color="000000"/>
-            </w:tcBorders>
           </w:tcPr>
           <w:p>
             <w:pPr>
@@ -7536,9 +7484,6 @@
             <w:tcW w:type="dxa" w:w="2076"/>
             <w:shd w:val="clear" w:color="auto" w:fill="F2F4F6"/>
             <w:tcW w:w="2300" w:type="dxa"/>
-            <w:tcBorders>
-              <w:bottom w:val="single" w:sz="2" w:space="0" w:color="000000"/>
-            </w:tcBorders>
           </w:tcPr>
           <w:p>
             <w:pPr>
@@ -8202,6 +8147,9 @@
         <w:t>Stricter rule for “potential + noun” constructions: if the phrase sits in an introduction/rationale sentence (motivating why the topic matters, before any data is presented), treat as topic-naming (FP-Gen) regardless of the verb used. If it sits in a results/conclusion sentence qualifying a claim about findings, treat as a Lexical hedge (EC). The distinction is structural position, not verb choice.</w:t>
       </w:r>
     </w:p>
+    <w:p/>
+    <w:p/>
+    <w:p/>
     <w:p>
       <w:pPr>
         <w:keepNext/>
@@ -8237,6 +8185,7 @@
     </w:p>
     <w:tbl>
       <w:tblPr>
+        <w:tblStyle w:val="TableGrid"/>
         <w:tblW w:type="auto" w:w="0"/>
         <w:tblLayout w:type="fixed"/>
         <w:tblLook w:firstColumn="1" w:firstRow="1" w:lastColumn="0" w:lastRow="0" w:noHBand="0" w:noVBand="1" w:val="04A0"/>
@@ -8247,14 +8196,6 @@
           <w:bottom w:w="20" w:type="dxa"/>
           <w:right w:w="40" w:type="dxa"/>
         </w:tblCellMar>
-        <w:tblBorders>
-          <w:top w:val="single" w:sz="18" w:space="0" w:color="000000"/>
-          <w:left w:val="nil" w:sz="0" w:space="0" w:color="000000"/>
-          <w:right w:val="nil" w:sz="0" w:space="0" w:color="000000"/>
-          <w:bottom w:val="single" w:sz="18" w:space="0" w:color="000000"/>
-          <w:insideH w:val="nil" w:sz="0" w:space="0" w:color="000000"/>
-          <w:insideV w:val="nil" w:sz="0" w:space="0" w:color="000000"/>
-        </w:tblBorders>
       </w:tblPr>
       <w:tblGrid>
         <w:gridCol w:w="2076"/>
@@ -8272,9 +8213,6 @@
             <w:tcW w:type="dxa" w:w="2076"/>
             <w:shd w:val="clear" w:color="auto" w:fill="F2F4F6"/>
             <w:tcW w:w="700" w:type="dxa"/>
-            <w:tcBorders>
-              <w:bottom w:val="single" w:sz="2" w:space="0" w:color="000000"/>
-            </w:tcBorders>
           </w:tcPr>
           <w:p>
             <w:pPr>
@@ -8296,9 +8234,6 @@
             <w:tcW w:type="dxa" w:w="2076"/>
             <w:shd w:val="clear" w:color="auto" w:fill="F2F4F6"/>
             <w:tcW w:w="1800" w:type="dxa"/>
-            <w:tcBorders>
-              <w:bottom w:val="single" w:sz="2" w:space="0" w:color="000000"/>
-            </w:tcBorders>
           </w:tcPr>
           <w:p>
             <w:pPr>
@@ -8320,9 +8255,6 @@
             <w:tcW w:type="dxa" w:w="2076"/>
             <w:shd w:val="clear" w:color="auto" w:fill="F2F4F6"/>
             <w:tcW w:w="2400" w:type="dxa"/>
-            <w:tcBorders>
-              <w:bottom w:val="single" w:sz="2" w:space="0" w:color="000000"/>
-            </w:tcBorders>
           </w:tcPr>
           <w:p>
             <w:pPr>
@@ -8344,9 +8276,6 @@
             <w:tcW w:type="dxa" w:w="2076"/>
             <w:shd w:val="clear" w:color="auto" w:fill="F2F4F6"/>
             <w:tcW w:w="2600" w:type="dxa"/>
-            <w:tcBorders>
-              <w:bottom w:val="single" w:sz="2" w:space="0" w:color="000000"/>
-            </w:tcBorders>
           </w:tcPr>
           <w:p>
             <w:pPr>
@@ -8749,6 +8678,9 @@
         </w:tc>
       </w:tr>
     </w:tbl>
+    <w:p/>
+    <w:p/>
+    <w:p/>
     <w:p>
       <w:pPr>
         <w:keepNext/>
@@ -8784,6 +8716,7 @@
     </w:p>
     <w:tbl>
       <w:tblPr>
+        <w:tblStyle w:val="TableGrid"/>
         <w:tblW w:type="auto" w:w="0"/>
         <w:tblLayout w:type="fixed"/>
         <w:tblLook w:firstColumn="1" w:firstRow="1" w:lastColumn="0" w:lastRow="0" w:noHBand="0" w:noVBand="1" w:val="04A0"/>
@@ -8794,14 +8727,6 @@
           <w:bottom w:w="20" w:type="dxa"/>
           <w:right w:w="40" w:type="dxa"/>
         </w:tblCellMar>
-        <w:tblBorders>
-          <w:top w:val="single" w:sz="18" w:space="0" w:color="000000"/>
-          <w:left w:val="nil" w:sz="0" w:space="0" w:color="000000"/>
-          <w:right w:val="nil" w:sz="0" w:space="0" w:color="000000"/>
-          <w:bottom w:val="single" w:sz="18" w:space="0" w:color="000000"/>
-          <w:insideH w:val="nil" w:sz="0" w:space="0" w:color="000000"/>
-          <w:insideV w:val="nil" w:sz="0" w:space="0" w:color="000000"/>
-        </w:tblBorders>
       </w:tblPr>
       <w:tblGrid>
         <w:gridCol w:w="2769"/>
@@ -8818,9 +8743,6 @@
             <w:tcW w:type="dxa" w:w="2769"/>
             <w:shd w:val="clear" w:color="auto" w:fill="F2F4F6"/>
             <w:tcW w:w="2000" w:type="dxa"/>
-            <w:tcBorders>
-              <w:bottom w:val="single" w:sz="2" w:space="0" w:color="000000"/>
-            </w:tcBorders>
           </w:tcPr>
           <w:p>
             <w:pPr>
@@ -8842,9 +8764,6 @@
             <w:tcW w:type="dxa" w:w="2769"/>
             <w:shd w:val="clear" w:color="auto" w:fill="F2F4F6"/>
             <w:tcW w:w="2750" w:type="dxa"/>
-            <w:tcBorders>
-              <w:bottom w:val="single" w:sz="2" w:space="0" w:color="000000"/>
-            </w:tcBorders>
           </w:tcPr>
           <w:p>
             <w:pPr>
@@ -8866,9 +8785,6 @@
             <w:tcW w:type="dxa" w:w="2769"/>
             <w:shd w:val="clear" w:color="auto" w:fill="F2F4F6"/>
             <w:tcW w:w="2750" w:type="dxa"/>
-            <w:tcBorders>
-              <w:bottom w:val="single" w:sz="2" w:space="0" w:color="000000"/>
-            </w:tcBorders>
           </w:tcPr>
           <w:p>
             <w:pPr>
@@ -9484,6 +9400,9 @@
         <w:t>: “Might this be true?” = hedge. “Should this be done?” = FP-Rec.</w:t>
       </w:r>
     </w:p>
+    <w:p/>
+    <w:p/>
+    <w:p/>
     <w:p>
       <w:pPr>
         <w:keepNext/>
@@ -9519,6 +9438,7 @@
     </w:p>
     <w:tbl>
       <w:tblPr>
+        <w:tblStyle w:val="TableGrid"/>
         <w:tblW w:type="auto" w:w="0"/>
         <w:tblLayout w:type="fixed"/>
         <w:tblLook w:firstColumn="1" w:firstRow="1" w:lastColumn="0" w:lastRow="0" w:noHBand="0" w:noVBand="1" w:val="04A0"/>
@@ -9529,14 +9449,6 @@
           <w:bottom w:w="20" w:type="dxa"/>
           <w:right w:w="40" w:type="dxa"/>
         </w:tblCellMar>
-        <w:tblBorders>
-          <w:top w:val="single" w:sz="18" w:space="0" w:color="000000"/>
-          <w:left w:val="nil" w:sz="0" w:space="0" w:color="000000"/>
-          <w:right w:val="nil" w:sz="0" w:space="0" w:color="000000"/>
-          <w:bottom w:val="single" w:sz="18" w:space="0" w:color="000000"/>
-          <w:insideH w:val="nil" w:sz="0" w:space="0" w:color="000000"/>
-          <w:insideV w:val="nil" w:sz="0" w:space="0" w:color="000000"/>
-        </w:tblBorders>
       </w:tblPr>
       <w:tblGrid>
         <w:gridCol w:w="2769"/>
@@ -9553,9 +9465,6 @@
             <w:tcW w:type="dxa" w:w="2769"/>
             <w:shd w:val="clear" w:color="auto" w:fill="F2F4F6"/>
             <w:tcW w:w="1000" w:type="dxa"/>
-            <w:tcBorders>
-              <w:bottom w:val="single" w:sz="2" w:space="0" w:color="000000"/>
-            </w:tcBorders>
           </w:tcPr>
           <w:p>
             <w:pPr>
@@ -9577,9 +9486,6 @@
             <w:tcW w:type="dxa" w:w="2769"/>
             <w:shd w:val="clear" w:color="auto" w:fill="F2F4F6"/>
             <w:tcW w:w="3600" w:type="dxa"/>
-            <w:tcBorders>
-              <w:bottom w:val="single" w:sz="2" w:space="0" w:color="000000"/>
-            </w:tcBorders>
           </w:tcPr>
           <w:p>
             <w:pPr>
@@ -9601,9 +9507,6 @@
             <w:tcW w:type="dxa" w:w="2769"/>
             <w:shd w:val="clear" w:color="auto" w:fill="F2F4F6"/>
             <w:tcW w:w="2900" w:type="dxa"/>
-            <w:tcBorders>
-              <w:bottom w:val="single" w:sz="2" w:space="0" w:color="000000"/>
-            </w:tcBorders>
           </w:tcPr>
           <w:p>
             <w:pPr>
@@ -10062,6 +9965,9 @@
         </w:tc>
       </w:tr>
     </w:tbl>
+    <w:p/>
+    <w:p/>
+    <w:p/>
     <w:p>
       <w:pPr>
         <w:keepNext/>
@@ -10138,6 +10044,7 @@
     </w:p>
     <w:tbl>
       <w:tblPr>
+        <w:tblStyle w:val="TableGrid"/>
         <w:tblW w:type="auto" w:w="0"/>
         <w:tblLayout w:type="fixed"/>
         <w:tblLook w:firstColumn="1" w:firstRow="1" w:lastColumn="0" w:lastRow="0" w:noHBand="0" w:noVBand="1" w:val="04A0"/>
@@ -10148,14 +10055,6 @@
           <w:bottom w:w="20" w:type="dxa"/>
           <w:right w:w="40" w:type="dxa"/>
         </w:tblCellMar>
-        <w:tblBorders>
-          <w:top w:val="single" w:sz="18" w:space="0" w:color="000000"/>
-          <w:left w:val="nil" w:sz="0" w:space="0" w:color="000000"/>
-          <w:right w:val="nil" w:sz="0" w:space="0" w:color="000000"/>
-          <w:bottom w:val="single" w:sz="18" w:space="0" w:color="000000"/>
-          <w:insideH w:val="nil" w:sz="0" w:space="0" w:color="000000"/>
-          <w:insideV w:val="nil" w:sz="0" w:space="0" w:color="000000"/>
-        </w:tblBorders>
       </w:tblPr>
       <w:tblGrid>
         <w:gridCol w:w="2076"/>
@@ -10173,9 +10072,6 @@
             <w:tcW w:type="dxa" w:w="2076"/>
             <w:shd w:val="clear" w:color="auto" w:fill="F2F4F6"/>
             <w:tcW w:w="900" w:type="dxa"/>
-            <w:tcBorders>
-              <w:bottom w:val="single" w:sz="2" w:space="0" w:color="000000"/>
-            </w:tcBorders>
           </w:tcPr>
           <w:p>
             <w:pPr>
@@ -10197,9 +10093,6 @@
             <w:tcW w:type="dxa" w:w="2076"/>
             <w:shd w:val="clear" w:color="auto" w:fill="F2F4F6"/>
             <w:tcW w:w="1600" w:type="dxa"/>
-            <w:tcBorders>
-              <w:bottom w:val="single" w:sz="2" w:space="0" w:color="000000"/>
-            </w:tcBorders>
           </w:tcPr>
           <w:p>
             <w:pPr>
@@ -10221,9 +10114,6 @@
             <w:tcW w:type="dxa" w:w="2076"/>
             <w:shd w:val="clear" w:color="auto" w:fill="F2F4F6"/>
             <w:tcW w:w="2500" w:type="dxa"/>
-            <w:tcBorders>
-              <w:bottom w:val="single" w:sz="2" w:space="0" w:color="000000"/>
-            </w:tcBorders>
           </w:tcPr>
           <w:p>
             <w:pPr>
@@ -10245,9 +10135,6 @@
             <w:tcW w:type="dxa" w:w="2076"/>
             <w:shd w:val="clear" w:color="auto" w:fill="F2F4F6"/>
             <w:tcW w:w="2500" w:type="dxa"/>
-            <w:tcBorders>
-              <w:bottom w:val="single" w:sz="2" w:space="0" w:color="000000"/>
-            </w:tcBorders>
           </w:tcPr>
           <w:p>
             <w:pPr>
@@ -10587,6 +10474,9 @@
         </w:tc>
       </w:tr>
     </w:tbl>
+    <w:p/>
+    <w:p/>
+    <w:p/>
     <w:p>
       <w:pPr>
         <w:keepNext/>
@@ -10622,6 +10512,7 @@
     </w:p>
     <w:tbl>
       <w:tblPr>
+        <w:tblStyle w:val="TableGrid"/>
         <w:tblW w:type="auto" w:w="0"/>
         <w:tblLayout w:type="fixed"/>
         <w:tblLook w:firstColumn="1" w:firstRow="1" w:lastColumn="0" w:lastRow="0" w:noHBand="0" w:noVBand="1" w:val="04A0"/>
@@ -10632,14 +10523,6 @@
           <w:bottom w:w="20" w:type="dxa"/>
           <w:right w:w="40" w:type="dxa"/>
         </w:tblCellMar>
-        <w:tblBorders>
-          <w:top w:val="single" w:sz="18" w:space="0" w:color="000000"/>
-          <w:left w:val="nil" w:sz="0" w:space="0" w:color="000000"/>
-          <w:right w:val="nil" w:sz="0" w:space="0" w:color="000000"/>
-          <w:bottom w:val="single" w:sz="18" w:space="0" w:color="000000"/>
-          <w:insideH w:val="nil" w:sz="0" w:space="0" w:color="000000"/>
-          <w:insideV w:val="nil" w:sz="0" w:space="0" w:color="000000"/>
-        </w:tblBorders>
       </w:tblPr>
       <w:tblGrid>
         <w:gridCol w:w="4153"/>
@@ -10655,9 +10538,6 @@
             <w:tcW w:type="dxa" w:w="4153"/>
             <w:shd w:val="clear" w:color="auto" w:fill="F2F4F6"/>
             <w:tcW w:w="3750" w:type="dxa"/>
-            <w:tcBorders>
-              <w:bottom w:val="single" w:sz="2" w:space="0" w:color="000000"/>
-            </w:tcBorders>
           </w:tcPr>
           <w:p>
             <w:pPr>
@@ -10679,9 +10559,6 @@
             <w:tcW w:type="dxa" w:w="4153"/>
             <w:shd w:val="clear" w:color="auto" w:fill="F2F4F6"/>
             <w:tcW w:w="3750" w:type="dxa"/>
-            <w:tcBorders>
-              <w:bottom w:val="single" w:sz="2" w:space="0" w:color="000000"/>
-            </w:tcBorders>
           </w:tcPr>
           <w:p>
             <w:pPr>
@@ -10980,6 +10857,9 @@
         </w:tc>
       </w:tr>
     </w:tbl>
+    <w:p/>
+    <w:p/>
+    <w:p/>
     <w:p>
       <w:pPr>
         <w:keepNext/>
@@ -11203,6 +11083,9 @@
         <w:t>Blue and red highlights mark type. Orange text marks function. The strikethrough marks a rejected candidate. Grey highlight marks an unhedged site. Here, “potential” is struck because it names a research property, not a hedge on the claim.</w:t>
       </w:r>
     </w:p>
+    <w:p/>
+    <w:p/>
+    <w:p/>
     <w:p>
       <w:pPr>
         <w:keepNext/>
@@ -11238,6 +11121,7 @@
     </w:p>
     <w:tbl>
       <w:tblPr>
+        <w:tblStyle w:val="TableGrid"/>
         <w:tblW w:type="auto" w:w="0"/>
         <w:tblLayout w:type="fixed"/>
         <w:tblLook w:firstColumn="1" w:firstRow="1" w:lastColumn="0" w:lastRow="0" w:noHBand="0" w:noVBand="1" w:val="04A0"/>
@@ -11248,14 +11132,6 @@
           <w:bottom w:w="20" w:type="dxa"/>
           <w:right w:w="40" w:type="dxa"/>
         </w:tblCellMar>
-        <w:tblBorders>
-          <w:top w:val="single" w:sz="18" w:space="0" w:color="000000"/>
-          <w:left w:val="nil" w:sz="0" w:space="0" w:color="000000"/>
-          <w:right w:val="nil" w:sz="0" w:space="0" w:color="000000"/>
-          <w:bottom w:val="single" w:sz="18" w:space="0" w:color="000000"/>
-          <w:insideH w:val="nil" w:sz="0" w:space="0" w:color="000000"/>
-          <w:insideV w:val="nil" w:sz="0" w:space="0" w:color="000000"/>
-        </w:tblBorders>
       </w:tblPr>
       <w:tblGrid>
         <w:gridCol w:w="1038"/>
@@ -11277,9 +11153,6 @@
             <w:tcW w:type="dxa" w:w="1038"/>
             <w:shd w:val="clear" w:color="auto" w:fill="F2F4F6"/>
             <w:tcW w:w="1100" w:type="dxa"/>
-            <w:tcBorders>
-              <w:bottom w:val="single" w:sz="2" w:space="0" w:color="000000"/>
-            </w:tcBorders>
           </w:tcPr>
           <w:p>
             <w:pPr>
@@ -11301,9 +11174,6 @@
             <w:tcW w:type="dxa" w:w="1038"/>
             <w:shd w:val="clear" w:color="auto" w:fill="F2F4F6"/>
             <w:tcW w:w="800" w:type="dxa"/>
-            <w:tcBorders>
-              <w:bottom w:val="single" w:sz="2" w:space="0" w:color="000000"/>
-            </w:tcBorders>
           </w:tcPr>
           <w:p>
             <w:pPr>
@@ -11325,9 +11195,6 @@
             <w:tcW w:type="dxa" w:w="1038"/>
             <w:shd w:val="clear" w:color="auto" w:fill="F2F4F6"/>
             <w:tcW w:w="1500" w:type="dxa"/>
-            <w:tcBorders>
-              <w:bottom w:val="single" w:sz="2" w:space="0" w:color="000000"/>
-            </w:tcBorders>
           </w:tcPr>
           <w:p>
             <w:pPr>
@@ -11349,9 +11216,6 @@
             <w:tcW w:type="dxa" w:w="1038"/>
             <w:shd w:val="clear" w:color="auto" w:fill="F2F4F6"/>
             <w:tcW w:w="1100" w:type="dxa"/>
-            <w:tcBorders>
-              <w:bottom w:val="single" w:sz="2" w:space="0" w:color="000000"/>
-            </w:tcBorders>
           </w:tcPr>
           <w:p>
             <w:pPr>
@@ -11373,9 +11237,6 @@
             <w:tcW w:type="dxa" w:w="1038"/>
             <w:shd w:val="clear" w:color="auto" w:fill="F2F4F6"/>
             <w:tcW w:w="800" w:type="dxa"/>
-            <w:tcBorders>
-              <w:bottom w:val="single" w:sz="2" w:space="0" w:color="000000"/>
-            </w:tcBorders>
           </w:tcPr>
           <w:p>
             <w:pPr>
@@ -11397,9 +11258,6 @@
             <w:tcW w:type="dxa" w:w="1038"/>
             <w:shd w:val="clear" w:color="auto" w:fill="F2F4F6"/>
             <w:tcW w:w="800" w:type="dxa"/>
-            <w:tcBorders>
-              <w:bottom w:val="single" w:sz="2" w:space="0" w:color="000000"/>
-            </w:tcBorders>
           </w:tcPr>
           <w:p>
             <w:pPr>
@@ -11421,9 +11279,6 @@
             <w:tcW w:type="dxa" w:w="1038"/>
             <w:shd w:val="clear" w:color="auto" w:fill="F2F4F6"/>
             <w:tcW w:w="700" w:type="dxa"/>
-            <w:tcBorders>
-              <w:bottom w:val="single" w:sz="2" w:space="0" w:color="000000"/>
-            </w:tcBorders>
           </w:tcPr>
           <w:p>
             <w:pPr>
@@ -11445,9 +11300,6 @@
             <w:tcW w:type="dxa" w:w="1038"/>
             <w:shd w:val="clear" w:color="auto" w:fill="F2F4F6"/>
             <w:tcW w:w="700" w:type="dxa"/>
-            <w:tcBorders>
-              <w:bottom w:val="single" w:sz="2" w:space="0" w:color="000000"/>
-            </w:tcBorders>
           </w:tcPr>
           <w:p>
             <w:pPr>
@@ -11689,6 +11541,7 @@
     </w:p>
     <w:tbl>
       <w:tblPr>
+        <w:tblStyle w:val="TableGrid"/>
         <w:tblW w:type="auto" w:w="0"/>
         <w:tblLayout w:type="fixed"/>
         <w:tblLook w:firstColumn="1" w:firstRow="1" w:lastColumn="0" w:lastRow="0" w:noHBand="0" w:noVBand="1" w:val="04A0"/>
@@ -11699,14 +11552,6 @@
           <w:bottom w:w="20" w:type="dxa"/>
           <w:right w:w="40" w:type="dxa"/>
         </w:tblCellMar>
-        <w:tblBorders>
-          <w:top w:val="single" w:sz="18" w:space="0" w:color="000000"/>
-          <w:left w:val="nil" w:sz="0" w:space="0" w:color="000000"/>
-          <w:right w:val="nil" w:sz="0" w:space="0" w:color="000000"/>
-          <w:bottom w:val="single" w:sz="18" w:space="0" w:color="000000"/>
-          <w:insideH w:val="nil" w:sz="0" w:space="0" w:color="000000"/>
-          <w:insideV w:val="nil" w:sz="0" w:space="0" w:color="000000"/>
-        </w:tblBorders>
       </w:tblPr>
       <w:tblGrid>
         <w:gridCol w:w="1384"/>
@@ -11726,9 +11571,6 @@
             <w:tcW w:type="dxa" w:w="1384"/>
             <w:shd w:val="clear" w:color="auto" w:fill="F2F4F6"/>
             <w:tcW w:w="1200" w:type="dxa"/>
-            <w:tcBorders>
-              <w:bottom w:val="single" w:sz="2" w:space="0" w:color="000000"/>
-            </w:tcBorders>
           </w:tcPr>
           <w:p>
             <w:pPr>
@@ -11750,9 +11592,6 @@
             <w:tcW w:type="dxa" w:w="1384"/>
             <w:shd w:val="clear" w:color="auto" w:fill="F2F4F6"/>
             <w:tcW w:w="800" w:type="dxa"/>
-            <w:tcBorders>
-              <w:bottom w:val="single" w:sz="2" w:space="0" w:color="000000"/>
-            </w:tcBorders>
           </w:tcPr>
           <w:p>
             <w:pPr>
@@ -11774,9 +11613,6 @@
             <w:tcW w:type="dxa" w:w="1384"/>
             <w:shd w:val="clear" w:color="auto" w:fill="F2F4F6"/>
             <w:tcW w:w="1800" w:type="dxa"/>
-            <w:tcBorders>
-              <w:bottom w:val="single" w:sz="2" w:space="0" w:color="000000"/>
-            </w:tcBorders>
           </w:tcPr>
           <w:p>
             <w:pPr>
@@ -11798,9 +11634,6 @@
             <w:tcW w:type="dxa" w:w="1384"/>
             <w:shd w:val="clear" w:color="auto" w:fill="F2F4F6"/>
             <w:tcW w:w="1200" w:type="dxa"/>
-            <w:tcBorders>
-              <w:bottom w:val="single" w:sz="2" w:space="0" w:color="000000"/>
-            </w:tcBorders>
           </w:tcPr>
           <w:p>
             <w:pPr>
@@ -11822,9 +11655,6 @@
             <w:tcW w:type="dxa" w:w="1384"/>
             <w:shd w:val="clear" w:color="auto" w:fill="F2F4F6"/>
             <w:tcW w:w="1350" w:type="dxa"/>
-            <w:tcBorders>
-              <w:bottom w:val="single" w:sz="2" w:space="0" w:color="000000"/>
-            </w:tcBorders>
           </w:tcPr>
           <w:p>
             <w:pPr>
@@ -11846,9 +11676,6 @@
             <w:tcW w:type="dxa" w:w="1384"/>
             <w:shd w:val="clear" w:color="auto" w:fill="F2F4F6"/>
             <w:tcW w:w="1150" w:type="dxa"/>
-            <w:tcBorders>
-              <w:bottom w:val="single" w:sz="2" w:space="0" w:color="000000"/>
-            </w:tcBorders>
           </w:tcPr>
           <w:p>
             <w:pPr>
@@ -12021,6 +11848,7 @@
     </w:p>
     <w:tbl>
       <w:tblPr>
+        <w:tblStyle w:val="TableGrid"/>
         <w:tblW w:type="auto" w:w="0"/>
         <w:tblLayout w:type="fixed"/>
         <w:tblLook w:firstColumn="1" w:firstRow="1" w:lastColumn="0" w:lastRow="0" w:noHBand="0" w:noVBand="1" w:val="04A0"/>
@@ -12031,14 +11859,6 @@
           <w:bottom w:w="20" w:type="dxa"/>
           <w:right w:w="40" w:type="dxa"/>
         </w:tblCellMar>
-        <w:tblBorders>
-          <w:top w:val="single" w:sz="18" w:space="0" w:color="000000"/>
-          <w:left w:val="nil" w:sz="0" w:space="0" w:color="000000"/>
-          <w:right w:val="nil" w:sz="0" w:space="0" w:color="000000"/>
-          <w:bottom w:val="single" w:sz="18" w:space="0" w:color="000000"/>
-          <w:insideH w:val="nil" w:sz="0" w:space="0" w:color="000000"/>
-          <w:insideV w:val="nil" w:sz="0" w:space="0" w:color="000000"/>
-        </w:tblBorders>
       </w:tblPr>
       <w:tblGrid>
         <w:gridCol w:w="1384"/>
@@ -12058,9 +11878,6 @@
             <w:tcW w:type="dxa" w:w="1384"/>
             <w:shd w:val="clear" w:color="auto" w:fill="F2F4F6"/>
             <w:tcW w:w="1200" w:type="dxa"/>
-            <w:tcBorders>
-              <w:bottom w:val="single" w:sz="2" w:space="0" w:color="000000"/>
-            </w:tcBorders>
           </w:tcPr>
           <w:p>
             <w:pPr>
@@ -12082,9 +11899,6 @@
             <w:tcW w:type="dxa" w:w="1384"/>
             <w:shd w:val="clear" w:color="auto" w:fill="F2F4F6"/>
             <w:tcW w:w="800" w:type="dxa"/>
-            <w:tcBorders>
-              <w:bottom w:val="single" w:sz="2" w:space="0" w:color="000000"/>
-            </w:tcBorders>
           </w:tcPr>
           <w:p>
             <w:pPr>
@@ -12106,9 +11920,6 @@
             <w:tcW w:type="dxa" w:w="1384"/>
             <w:shd w:val="clear" w:color="auto" w:fill="F2F4F6"/>
             <w:tcW w:w="1800" w:type="dxa"/>
-            <w:tcBorders>
-              <w:bottom w:val="single" w:sz="2" w:space="0" w:color="000000"/>
-            </w:tcBorders>
           </w:tcPr>
           <w:p>
             <w:pPr>
@@ -12130,9 +11941,6 @@
             <w:tcW w:type="dxa" w:w="1384"/>
             <w:shd w:val="clear" w:color="auto" w:fill="F2F4F6"/>
             <w:tcW w:w="1350" w:type="dxa"/>
-            <w:tcBorders>
-              <w:bottom w:val="single" w:sz="2" w:space="0" w:color="000000"/>
-            </w:tcBorders>
           </w:tcPr>
           <w:p>
             <w:pPr>
@@ -12154,9 +11962,6 @@
             <w:tcW w:type="dxa" w:w="1384"/>
             <w:shd w:val="clear" w:color="auto" w:fill="F2F4F6"/>
             <w:tcW w:w="1200" w:type="dxa"/>
-            <w:tcBorders>
-              <w:bottom w:val="single" w:sz="2" w:space="0" w:color="000000"/>
-            </w:tcBorders>
           </w:tcPr>
           <w:p>
             <w:pPr>
@@ -12178,9 +11983,6 @@
             <w:tcW w:type="dxa" w:w="1384"/>
             <w:shd w:val="clear" w:color="auto" w:fill="F2F4F6"/>
             <w:tcW w:w="1150" w:type="dxa"/>
-            <w:tcBorders>
-              <w:bottom w:val="single" w:sz="2" w:space="0" w:color="000000"/>
-            </w:tcBorders>
           </w:tcPr>
           <w:p>
             <w:pPr>
@@ -12318,6 +12120,10 @@
         </w:tc>
       </w:tr>
     </w:tbl>
+    <w:p/>
+    <w:p/>
+    <w:p/>
+    <w:p/>
     <w:p>
       <w:pPr>
         <w:pageBreakBefore/>
@@ -12897,6 +12703,8 @@
         </w:rPr>
       </w:r>
     </w:p>
+    <w:p/>
+    <w:p/>
     <w:p>
       <w:pPr>
         <w:pageBreakBefore/>
@@ -16426,6 +16234,9 @@
         <w:t>VM8  ·  253 words  ·  1 hedges  ·  0.4 per 100 words</w:t>
       </w:r>
     </w:p>
+    <w:p/>
+    <w:p/>
+    <w:p/>
     <w:p>
       <w:pPr>
         <w:spacing w:line="480" w:lineRule="auto" w:before="0" w:after="240"/>

</xml_diff>

<commit_message>
Draft_012 (in place): match D5 spacing exactly — 26 changes; 45 D5-known headings verified match
</commit_message>
<xml_diff>
--- a/thesis/003_ThesisProposal_Draft_012.docx
+++ b/thesis/003_ThesisProposal_Draft_012.docx
@@ -28,6 +28,12 @@
         </w:rPr>
       </w:r>
     </w:p>
+    <w:p/>
+    <w:p/>
+    <w:p/>
+    <w:p/>
+    <w:p/>
+    <w:p/>
     <w:p>
       <w:pPr>
         <w:spacing w:after="0" w:line="240" w:lineRule="auto"/>
@@ -675,22 +681,6 @@
     </w:p>
     <w:p>
       <w:pPr>
-        <w:spacing w:line="480" w:lineRule="auto" w:before="0" w:after="0"/>
-        <w:ind w:firstLine="720"/>
-        <w:jc w:val="both"/>
-      </w:pPr>
-      <w:r>
-        <w:rPr>
-          <w:rFonts w:ascii="Georgia" w:hAnsi="Georgia" w:eastAsia="Georgia"/>
-          <w:b w:val="0"/>
-          <w:i w:val="0"/>
-          <w:sz w:val="22"/>
-        </w:rPr>
-        <w:t xml:space="preserve"/>
-      </w:r>
-    </w:p>
-    <w:p>
-      <w:pPr>
         <w:keepNext/>
         <w:keepLines/>
         <w:spacing w:before="240" w:after="240" w:line="480" w:lineRule="auto"/>
@@ -772,24 +762,6 @@
     </w:p>
     <w:p>
       <w:pPr>
-        <w:spacing w:line="480" w:lineRule="auto" w:before="0" w:after="0"/>
-        <w:ind w:firstLine="720"/>
-        <w:jc w:val="both"/>
-      </w:pPr>
-      <w:r>
-        <w:rPr>
-          <w:rFonts w:ascii="Georgia" w:hAnsi="Georgia" w:eastAsia="Georgia"/>
-          <w:b w:val="0"/>
-          <w:i w:val="0"/>
-          <w:sz w:val="22"/>
-        </w:rPr>
-        <w:t xml:space="preserve"/>
-      </w:r>
-    </w:p>
-    <w:p/>
-    <w:p/>
-    <w:p>
-      <w:pPr>
         <w:keepNext/>
         <w:keepLines/>
         <w:spacing w:before="240" w:after="240" w:line="480" w:lineRule="auto"/>
@@ -897,9 +869,6 @@
         <w:t>4. What do the frequency and functional patterns suggest about the construction of epistemic stance through hedging among developing researchers?</w:t>
       </w:r>
     </w:p>
-    <w:p/>
-    <w:p/>
-    <w:p/>
     <w:p>
       <w:pPr>
         <w:keepNext/>
@@ -1051,9 +1020,6 @@
         </w:drawing>
       </w:r>
     </w:p>
-    <w:p/>
-    <w:p/>
-    <w:p/>
     <w:p>
       <w:pPr>
         <w:keepNext/>
@@ -1164,33 +1130,6 @@
     </w:p>
     <w:p>
       <w:pPr>
-        <w:spacing w:line="480" w:lineRule="auto" w:before="0" w:after="0"/>
-        <w:ind w:firstLine="720"/>
-        <w:jc w:val="both"/>
-      </w:pPr>
-      <w:r>
-        <w:rPr>
-          <w:rFonts w:ascii="Georgia" w:hAnsi="Georgia" w:eastAsia="Georgia"/>
-          <w:b/>
-          <w:i w:val="0"/>
-          <w:sz w:val="22"/>
-        </w:rPr>
-        <w:t xml:space="preserve"/>
-      </w:r>
-      <w:r>
-        <w:rPr>
-          <w:rFonts w:ascii="Georgia" w:hAnsi="Georgia" w:eastAsia="Georgia"/>
-          <w:b w:val="0"/>
-          <w:i w:val="0"/>
-          <w:sz w:val="22"/>
-        </w:rPr>
-        <w:t/>
-      </w:r>
-    </w:p>
-    <w:p/>
-    <w:p/>
-    <w:p>
-      <w:pPr>
         <w:keepNext/>
         <w:keepLines/>
         <w:spacing w:before="240" w:after="240" w:line="480" w:lineRule="auto"/>
@@ -1306,9 +1245,6 @@
         <w:t>Crucially, this study analyzes the archived thesis abstract as a ratified textual product rather than a measure of individual cognition. Undergraduate theses are heavily supervised, and abstracts are often the product of multiple revisions guided by advisers. Consequently, observed hedging patterns do not solely reflect the independent rhetorical choices or internalized norms of developing researchers; rather, they reflect the standards of the disciplinary community as enforced by faculty advisers. Therefore, while the study investigates patterns within texts produced by developing researchers, its claims are limited to the epistemic stance constructed in the final abstracts and the departmental standards they represent, rather than the internal cognitive processes of the writers themselves. The findings are strictly descriptive of the observed patterns within the PSAU context.</w:t>
       </w:r>
     </w:p>
-    <w:p/>
-    <w:p/>
-    <w:p/>
     <w:p>
       <w:pPr>
         <w:keepNext/>
@@ -1767,9 +1703,6 @@
         <w:t>This chapter describes the research design, institutional context, data collection process, and corpus selection for the study. Each methodological decision was justified by the nature of the research questions and the practical constraints of an undergraduate thesis.</w:t>
       </w:r>
     </w:p>
-    <w:p/>
-    <w:p/>
-    <w:p/>
     <w:p>
       <w:pPr>
         <w:keepNext/>
@@ -1835,9 +1768,6 @@
         <w:t>The PSAU thesis guidelines prescribed standard formatting but did not impose a rigid rhetorical template for abstracts. This allowed for disciplinary and individual variation in linguistic choices, ensuring that observed hedging patterns reflected negotiated textual choices rather than rigid institutional constraints.</w:t>
       </w:r>
     </w:p>
-    <w:p/>
-    <w:p/>
-    <w:p/>
     <w:p>
       <w:pPr>
         <w:keepNext/>
@@ -1871,9 +1801,6 @@
         <w:t>This study employed a descriptive mixed-methods design combining quantitative frequency analysis with qualitative functional interpretation (Biber et al., 1998). The quantitative layer identified hedging type and distribution patterns through frequency counts normalized per 100 words. This enabled cross-disciplinary comparison on a common scale. The qualitative layer involved functional coding using Hyland’s (1998) framework to assign rhetorical purposes to the identified hedges. The interpretation of disciplinary patterns was then informed by two theoretical lenses. These are Salager-Meyer’s (1994) concept of claim-responsibility and Hyland’s (2005) model of stance and engagement. All coding was conducted manually using Google Sheets. This prioritized researcher judgment over automated processing for functional coding decisions, since automated tools cannot reliably assign hedge function from context, which was central to this study’s research questions.</w:t>
       </w:r>
     </w:p>
-    <w:p/>
-    <w:p/>
-    <w:p/>
     <w:p>
       <w:pPr>
         <w:keepNext/>
@@ -2057,9 +1984,6 @@
         <w:t>Permission and library access: 1 week. Corpus construction and on-site photography: 3 weeks. OCR verification and text preparation: 2 weeks. Pilot testing and coding finalization: 2 weeks. Full coding and frequency analysis: 8 weeks (approximately 10 hours per week). Writing and revision: 8 weeks. Total timeframe: approximately 5.5 months (24 weeks).</w:t>
       </w:r>
     </w:p>
-    <w:p/>
-    <w:p/>
-    <w:p/>
     <w:p>
       <w:pPr>
         <w:keepNext/>
@@ -2093,9 +2017,6 @@
         <w:t>Following an initial coding pass, borderline tokens were re-examined using the contextual decision rules in Appendix A. Particular attention was given to potentially ambiguous forms such as can, potential, indicating, and possibility, because these forms may function either as epistemic hedges or as non-epistemic lexical items depending on context. Four rule refinements were applied during this revision pass. First, “can” combined with an active content verb describing a treatment effect (enhance, promote, reduce, help) was classified as capability (FP-Cap) regardless of whether it appeared inside a “suggests that” clause, because the Working Test showed that removing “can” alone did not change the epistemic weight of the clause when “suggests” was already carrying the hedge. Second, the “indicating” tautology test was extended beyond numeric restatement to cover field-standard interpretive thresholds: “non-toxic” from no mortality observed, “limited benefits” from poor performance, and “superior feed efficiency” from lower feed conversion ratio were all reclassified as operational restatements (FP-Gen) rather than inferential hedges. Third, the “potential + noun” topic-naming rule was extended to “possibility + noun” in aim and methods sentences. Fourth, a multi-hedge Working Test rule was added: when a sentence contains multiple hedge-like tokens, each token is tested individually in isolation, ignoring the other hedges in the sentence; a token counts only if removing it alone changes the epistemic weight of its own clause. The final corpus therefore reflects contextual rather than purely lexical classification, and the 63 rejected candidates document the decision trail for tokens that were considered but ultimately excluded. Additionally, the outlier abstract Acs2 was found to use a repeated hedging template (“This suggests that while X might not have been Y, Z could still [verb] beneficial effects”) twice with light variation, inflating its own token count through formulaic repetition rather than independent hedging decisions.</w:t>
       </w:r>
     </w:p>
-    <w:p/>
-    <w:p/>
-    <w:p/>
     <w:p>
       <w:pPr>
         <w:keepNext/>
@@ -2982,9 +2903,6 @@
         <w:t>This chapter presents the results, analysis, and discussion of the hedging patterns identified in the 60 undergraduate thesis abstracts across Agriculture, Veterinary Medicine, and Biology at Pampanga State Agricultural University. The chapter is organized into four parts, each corresponding to a research question. Part I presents the types of hedging devices found across the three disciplines. Part II examines how hedge frequency varies across Agriculture, Veterinary Medicine, and Biology. Part III identifies the rhetorical functions served by the hedging devices. Part IV discusses what the frequency and functional patterns suggest about the discipline-specific hedging profile of developing researchers.</w:t>
       </w:r>
     </w:p>
-    <w:p/>
-    <w:p/>
-    <w:p/>
     <w:p>
       <w:pPr>
         <w:keepNext/>
@@ -4134,9 +4052,6 @@
         <w:t>Booster analysis of the 28 zero-hedge abstracts revealed 88 booster tokens, averaging approximately 3.1 boosters per abstract. The most frequent boosters were showed (18 instances), revealed (13), observed (12), and highest (12). This density of assertive markers confirms that zero-hedge abstracts do not represent neutral reporting but rather an absence of overt hedging, where findings are stated with emphatic rather than tentative language.</w:t>
       </w:r>
     </w:p>
-    <w:p/>
-    <w:p/>
-    <w:p/>
     <w:p>
       <w:pPr>
         <w:keepNext/>
@@ -5033,9 +4948,6 @@
         <w:t>The false positive distribution also varies by discipline. Biology produced 35 false positives, far more than Agriculture (15) or Veterinary Medicine (13). This is partly because Biology abstracts contained more instances of “potential” in aim statements and “indicated by” evidential pointers, constructions that look like hedges but do not express uncertainty about a claim. The higher false positive count in Biology does not necessarily mean Biology writers hedge more. It means they use more hedge-like vocabulary in non-hedging functions.</w:t>
       </w:r>
     </w:p>
-    <w:p/>
-    <w:p/>
-    <w:p/>
     <w:p>
       <w:pPr>
         <w:keepNext/>
@@ -5458,9 +5370,6 @@
         <w:t>The relationship between hedge type and function further illuminates the patterns. Modal verbs (21 instances, all EC) were used almost exclusively to express possibility about results or implications, as in “the biosynthesis... may affect the overall development.” Lexical hedges (36 instances, all EC) were used to qualify the strength of findings, as in “results suggest that fermented banana peel... can significantly enhance growth.” The convergence of all hedge types on a single function reinforces the interpretation that these writers view hedging primarily as a tool for managing factual certainty, not for managing social or textual relationships.</w:t>
       </w:r>
     </w:p>
-    <w:p/>
-    <w:p/>
-    <w:p/>
     <w:p>
       <w:pPr>
         <w:keepNext/>
@@ -5658,9 +5567,6 @@
         <w:t xml:space="preserve">This study mapped hedging in 60 undergraduate thesis abstracts across Agriculture, Veterinary Medicine, and Biology at PSAU.</w:t>
       </w:r>
     </w:p>
-    <w:p/>
-    <w:p/>
-    <w:p/>
     <w:p>
       <w:pPr>
         <w:keepNext/>
@@ -5710,24 +5616,6 @@
         <w:t>Disciplinary differentiation is present but uneven. Veterinary Medicine’s sparse, assertive profile is the clearest contrast. Agriculture’s edge over Biology is modest and outlier-sensitive. The patterns are consistent with field-specific epistemic demands (Salager-Meyer, 1994) among developing writers, but statistical evidence is borderline (Kruskal-Wallis p ≈ .052) and the sample is small. The study provides a local baseline, not a general law.</w:t>
       </w:r>
     </w:p>
-    <w:p>
-      <w:pPr>
-        <w:spacing w:line="480" w:lineRule="auto" w:before="0" w:after="0"/>
-        <w:ind w:firstLine="720"/>
-        <w:jc w:val="both"/>
-      </w:pPr>
-      <w:r>
-        <w:rPr>
-          <w:rFonts w:ascii="Georgia" w:hAnsi="Georgia" w:eastAsia="Georgia"/>
-          <w:b w:val="0"/>
-          <w:i w:val="0"/>
-          <w:sz w:val="22"/>
-        </w:rPr>
-        <w:t xml:space="preserve"/>
-      </w:r>
-    </w:p>
-    <w:p/>
-    <w:p/>
     <w:p>
       <w:pPr>
         <w:keepNext/>
@@ -6608,7 +6496,6 @@
       </w:r>
     </w:p>
     <w:p/>
-    <w:p/>
     <w:p>
       <w:pPr>
         <w:spacing w:before="120" w:after="200" w:line="240" w:lineRule="auto"/>
@@ -6653,9 +6540,6 @@
         <w:t>This appendix is the full coding protocol used for the study. It opens with a one-page quick-reference, then gives the operational layers, decision rules, false-positive categories, and recording conventions.</w:t>
       </w:r>
     </w:p>
-    <w:p/>
-    <w:p/>
-    <w:p/>
     <w:p>
       <w:pPr>
         <w:spacing w:line="240" w:lineRule="auto" w:before="240" w:after="120"/>
@@ -7131,9 +7015,6 @@
         <w:t>Ability, future procedure, and necessity (must / should in procedural contexts) are never hedges. Working Test: if removing the device does not change how certain or tentative the claim is, it is not a hedge.</w:t>
       </w:r>
     </w:p>
-    <w:p/>
-    <w:p/>
-    <w:p/>
     <w:p>
       <w:pPr>
         <w:spacing w:before="320" w:after="160" w:line="240" w:lineRule="auto"/>
@@ -7209,9 +7090,6 @@
         <w:t>This codebook turns Hyland’s (1998) framework into a practical coding scheme for the PSAU undergraduate thesis abstract corpus. Highlights are background colors applied by hand or digital highlighter on printed or PDF copies. They are not font colors and are not software-dependent. The marked hard copy is the primary record; any spreadsheet is only a derived tally.</w:t>
       </w:r>
     </w:p>
-    <w:p/>
-    <w:p/>
-    <w:p/>
     <w:p>
       <w:pPr>
         <w:keepNext/>
@@ -7355,9 +7233,6 @@
         <w:t>Coding order: read the sentence in full, check Decision Rules, apply the Working Test if unresolved, and log any case that still can’t be resolved in Coder Notes rather than guessing.</w:t>
       </w:r>
     </w:p>
-    <w:p/>
-    <w:p/>
-    <w:p/>
     <w:p>
       <w:pPr>
         <w:keepNext/>
@@ -8147,9 +8022,6 @@
         <w:t>Stricter rule for “potential + noun” constructions: if the phrase sits in an introduction/rationale sentence (motivating why the topic matters, before any data is presented), treat as topic-naming (FP-Gen) regardless of the verb used. If it sits in a results/conclusion sentence qualifying a claim about findings, treat as a Lexical hedge (EC). The distinction is structural position, not verb choice.</w:t>
       </w:r>
     </w:p>
-    <w:p/>
-    <w:p/>
-    <w:p/>
     <w:p>
       <w:pPr>
         <w:keepNext/>
@@ -8678,9 +8550,6 @@
         </w:tc>
       </w:tr>
     </w:tbl>
-    <w:p/>
-    <w:p/>
-    <w:p/>
     <w:p>
       <w:pPr>
         <w:keepNext/>
@@ -9400,9 +9269,6 @@
         <w:t>: “Might this be true?” = hedge. “Should this be done?” = FP-Rec.</w:t>
       </w:r>
     </w:p>
-    <w:p/>
-    <w:p/>
-    <w:p/>
     <w:p>
       <w:pPr>
         <w:keepNext/>
@@ -9965,9 +9831,6 @@
         </w:tc>
       </w:tr>
     </w:tbl>
-    <w:p/>
-    <w:p/>
-    <w:p/>
     <w:p>
       <w:pPr>
         <w:keepNext/>
@@ -10474,9 +10337,6 @@
         </w:tc>
       </w:tr>
     </w:tbl>
-    <w:p/>
-    <w:p/>
-    <w:p/>
     <w:p>
       <w:pPr>
         <w:keepNext/>
@@ -10857,9 +10717,6 @@
         </w:tc>
       </w:tr>
     </w:tbl>
-    <w:p/>
-    <w:p/>
-    <w:p/>
     <w:p>
       <w:pPr>
         <w:keepNext/>
@@ -11083,9 +10940,6 @@
         <w:t>Blue and red highlights mark type. Orange text marks function. The strikethrough marks a rejected candidate. Grey highlight marks an unhedged site. Here, “potential” is struck because it names a research property, not a hedge on the claim.</w:t>
       </w:r>
     </w:p>
-    <w:p/>
-    <w:p/>
-    <w:p/>
     <w:p>
       <w:pPr>
         <w:keepNext/>
@@ -12123,7 +11977,6 @@
     <w:p/>
     <w:p/>
     <w:p/>
-    <w:p/>
     <w:p>
       <w:pPr>
         <w:pageBreakBefore/>
@@ -12703,7 +12556,6 @@
         </w:rPr>
       </w:r>
     </w:p>
-    <w:p/>
     <w:p/>
     <w:p>
       <w:pPr>

</xml_diff>

<commit_message>
Draft_012 (in place): BAELS borders + word-wrap fix (wordWrap=0, fixed layout, 10pt cells) + remove 17 leading empties after section breaks + reduce title page top empties 8→2
</commit_message>
<xml_diff>
--- a/thesis/003_ThesisProposal_Draft_012.docx
+++ b/thesis/003_ThesisProposal_Draft_012.docx
@@ -28,12 +28,6 @@
         </w:rPr>
       </w:r>
     </w:p>
-    <w:p/>
-    <w:p/>
-    <w:p/>
-    <w:p/>
-    <w:p/>
-    <w:p/>
     <w:p>
       <w:pPr>
         <w:spacing w:after="0" w:line="240" w:lineRule="auto"/>
@@ -371,21 +365,6 @@
         </w:sectPr>
       </w:pPr>
     </w:p>
-    <w:p>
-      <w:pPr>
-        <w:spacing w:after="0" w:before="0"/>
-      </w:pPr>
-      <w:r>
-        <w:rPr>
-          <w:rFonts w:ascii="Georgia" w:hAnsi="Georgia" w:eastAsia="Georgia"/>
-          <w:b w:val="0"/>
-          <w:i w:val="0"/>
-          <w:sz w:val="22"/>
-        </w:rPr>
-      </w:r>
-    </w:p>
-    <w:p/>
-    <w:p/>
     <w:p>
       <w:pPr>
         <w:keepNext/>
@@ -1643,19 +1622,6 @@
     </w:p>
     <w:p>
       <w:pPr>
-        <w:spacing w:line="480" w:lineRule="auto" w:before="0" w:after="0"/>
-      </w:pPr>
-      <w:r>
-        <w:rPr>
-          <w:rFonts w:ascii="Georgia" w:hAnsi="Georgia" w:cs="Georgia"/>
-          <w:sz w:val="22"/>
-        </w:rPr>
-      </w:r>
-    </w:p>
-    <w:p/>
-    <w:p/>
-    <w:p>
-      <w:pPr>
         <w:pageBreakBefore/>
         <w:keepNext/>
         <w:keepLines/>
@@ -2080,10 +2046,17 @@
     </w:p>
     <w:tbl>
       <w:tblPr>
-        <w:tblStyle w:val="TableGrid"/>
         <w:tblW w:type="auto" w:w="0"/>
-        <w:tblLayout w:type="autofit"/>
         <w:tblLook w:firstColumn="1" w:firstRow="1" w:lastColumn="0" w:lastRow="0" w:noHBand="0" w:noVBand="1" w:val="04A0"/>
+        <w:tblBorders>
+          <w:top w:val="single" w:sz="18" w:space="0" w:color="000000"/>
+          <w:left w:val="nil" w:sz="0" w:space="0" w:color="000000"/>
+          <w:right w:val="nil" w:sz="0" w:space="0" w:color="000000"/>
+          <w:bottom w:val="single" w:sz="18" w:space="0" w:color="000000"/>
+          <w:insideH w:val="nil" w:sz="0" w:space="0" w:color="000000"/>
+          <w:insideV w:val="nil" w:sz="0" w:space="0" w:color="000000"/>
+        </w:tblBorders>
+        <w:tblLayout w:type="fixed"/>
       </w:tblPr>
       <w:tblGrid>
         <w:gridCol w:w="1384"/>
@@ -2101,8 +2074,14 @@
         <w:tc>
           <w:tcPr>
             <w:tcW w:type="dxa" w:w="1384"/>
+            <w:tcBorders>
+              <w:bottom w:val="single" w:sz="2" w:space="0" w:color="000000"/>
+            </w:tcBorders>
           </w:tcPr>
           <w:p>
+            <w:pPr>
+              <w:wordWrap w:val="0"/>
+            </w:pPr>
             <w:r/>
             <w:r>
               <w:rPr>
@@ -2118,8 +2097,14 @@
         <w:tc>
           <w:tcPr>
             <w:tcW w:type="dxa" w:w="1384"/>
+            <w:tcBorders>
+              <w:bottom w:val="single" w:sz="2" w:space="0" w:color="000000"/>
+            </w:tcBorders>
           </w:tcPr>
           <w:p>
+            <w:pPr>
+              <w:wordWrap w:val="0"/>
+            </w:pPr>
             <w:r/>
             <w:r>
               <w:rPr>
@@ -2135,8 +2120,14 @@
         <w:tc>
           <w:tcPr>
             <w:tcW w:type="dxa" w:w="1384"/>
+            <w:tcBorders>
+              <w:bottom w:val="single" w:sz="2" w:space="0" w:color="000000"/>
+            </w:tcBorders>
           </w:tcPr>
           <w:p>
+            <w:pPr>
+              <w:wordWrap w:val="0"/>
+            </w:pPr>
             <w:r/>
             <w:r>
               <w:rPr>
@@ -2152,8 +2143,14 @@
         <w:tc>
           <w:tcPr>
             <w:tcW w:type="dxa" w:w="1384"/>
+            <w:tcBorders>
+              <w:bottom w:val="single" w:sz="2" w:space="0" w:color="000000"/>
+            </w:tcBorders>
           </w:tcPr>
           <w:p>
+            <w:pPr>
+              <w:wordWrap w:val="0"/>
+            </w:pPr>
             <w:r/>
             <w:r>
               <w:rPr>
@@ -2169,8 +2166,14 @@
         <w:tc>
           <w:tcPr>
             <w:tcW w:type="dxa" w:w="1384"/>
+            <w:tcBorders>
+              <w:bottom w:val="single" w:sz="2" w:space="0" w:color="000000"/>
+            </w:tcBorders>
           </w:tcPr>
           <w:p>
+            <w:pPr>
+              <w:wordWrap w:val="0"/>
+            </w:pPr>
             <w:r/>
             <w:r>
               <w:rPr>
@@ -2186,8 +2189,14 @@
         <w:tc>
           <w:tcPr>
             <w:tcW w:type="dxa" w:w="1384"/>
+            <w:tcBorders>
+              <w:bottom w:val="single" w:sz="2" w:space="0" w:color="000000"/>
+            </w:tcBorders>
           </w:tcPr>
           <w:p>
+            <w:pPr>
+              <w:wordWrap w:val="0"/>
+            </w:pPr>
             <w:r/>
             <w:r>
               <w:rPr>
@@ -2210,6 +2219,9 @@
             <w:tcW w:type="dxa" w:w="1384"/>
           </w:tcPr>
           <w:p>
+            <w:pPr>
+              <w:wordWrap w:val="0"/>
+            </w:pPr>
             <w:r/>
             <w:r>
               <w:rPr>
@@ -2227,6 +2239,9 @@
             <w:tcW w:type="dxa" w:w="1384"/>
           </w:tcPr>
           <w:p>
+            <w:pPr>
+              <w:wordWrap w:val="0"/>
+            </w:pPr>
             <w:r/>
             <w:r>
               <w:rPr>
@@ -2244,6 +2259,9 @@
             <w:tcW w:type="dxa" w:w="1384"/>
           </w:tcPr>
           <w:p>
+            <w:pPr>
+              <w:wordWrap w:val="0"/>
+            </w:pPr>
             <w:r/>
             <w:r>
               <w:rPr>
@@ -2261,6 +2279,9 @@
             <w:tcW w:type="dxa" w:w="1384"/>
           </w:tcPr>
           <w:p>
+            <w:pPr>
+              <w:wordWrap w:val="0"/>
+            </w:pPr>
             <w:r/>
             <w:r>
               <w:rPr>
@@ -2278,6 +2299,9 @@
             <w:tcW w:type="dxa" w:w="1384"/>
           </w:tcPr>
           <w:p>
+            <w:pPr>
+              <w:wordWrap w:val="0"/>
+            </w:pPr>
             <w:r/>
             <w:r>
               <w:rPr>
@@ -2295,6 +2319,9 @@
             <w:tcW w:type="dxa" w:w="1384"/>
           </w:tcPr>
           <w:p>
+            <w:pPr>
+              <w:wordWrap w:val="0"/>
+            </w:pPr>
             <w:r/>
             <w:r>
               <w:rPr>
@@ -2317,6 +2344,9 @@
             <w:tcW w:type="dxa" w:w="1384"/>
           </w:tcPr>
           <w:p>
+            <w:pPr>
+              <w:wordWrap w:val="0"/>
+            </w:pPr>
             <w:r/>
             <w:r>
               <w:rPr>
@@ -2334,6 +2364,9 @@
             <w:tcW w:type="dxa" w:w="1384"/>
           </w:tcPr>
           <w:p>
+            <w:pPr>
+              <w:wordWrap w:val="0"/>
+            </w:pPr>
             <w:r/>
             <w:r>
               <w:rPr>
@@ -2351,6 +2384,9 @@
             <w:tcW w:type="dxa" w:w="1384"/>
           </w:tcPr>
           <w:p>
+            <w:pPr>
+              <w:wordWrap w:val="0"/>
+            </w:pPr>
             <w:r/>
             <w:r>
               <w:rPr>
@@ -2368,6 +2404,9 @@
             <w:tcW w:type="dxa" w:w="1384"/>
           </w:tcPr>
           <w:p>
+            <w:pPr>
+              <w:wordWrap w:val="0"/>
+            </w:pPr>
             <w:r/>
             <w:r>
               <w:rPr>
@@ -2385,6 +2424,9 @@
             <w:tcW w:type="dxa" w:w="1384"/>
           </w:tcPr>
           <w:p>
+            <w:pPr>
+              <w:wordWrap w:val="0"/>
+            </w:pPr>
             <w:r/>
             <w:r>
               <w:rPr>
@@ -2402,6 +2444,9 @@
             <w:tcW w:type="dxa" w:w="1384"/>
           </w:tcPr>
           <w:p>
+            <w:pPr>
+              <w:wordWrap w:val="0"/>
+            </w:pPr>
             <w:r/>
             <w:r>
               <w:rPr>
@@ -2424,6 +2469,9 @@
             <w:tcW w:type="dxa" w:w="1384"/>
           </w:tcPr>
           <w:p>
+            <w:pPr>
+              <w:wordWrap w:val="0"/>
+            </w:pPr>
             <w:r/>
             <w:r>
               <w:rPr>
@@ -2441,6 +2489,9 @@
             <w:tcW w:type="dxa" w:w="1384"/>
           </w:tcPr>
           <w:p>
+            <w:pPr>
+              <w:wordWrap w:val="0"/>
+            </w:pPr>
             <w:r/>
             <w:r>
               <w:rPr>
@@ -2458,6 +2509,9 @@
             <w:tcW w:type="dxa" w:w="1384"/>
           </w:tcPr>
           <w:p>
+            <w:pPr>
+              <w:wordWrap w:val="0"/>
+            </w:pPr>
             <w:r/>
             <w:r>
               <w:rPr>
@@ -2475,6 +2529,9 @@
             <w:tcW w:type="dxa" w:w="1384"/>
           </w:tcPr>
           <w:p>
+            <w:pPr>
+              <w:wordWrap w:val="0"/>
+            </w:pPr>
             <w:r/>
             <w:r>
               <w:rPr>
@@ -2492,6 +2549,9 @@
             <w:tcW w:type="dxa" w:w="1384"/>
           </w:tcPr>
           <w:p>
+            <w:pPr>
+              <w:wordWrap w:val="0"/>
+            </w:pPr>
             <w:r/>
             <w:r>
               <w:rPr>
@@ -2509,6 +2569,9 @@
             <w:tcW w:type="dxa" w:w="1384"/>
           </w:tcPr>
           <w:p>
+            <w:pPr>
+              <w:wordWrap w:val="0"/>
+            </w:pPr>
             <w:r/>
             <w:r>
               <w:rPr>
@@ -2531,6 +2594,9 @@
             <w:tcW w:type="dxa" w:w="1384"/>
           </w:tcPr>
           <w:p>
+            <w:pPr>
+              <w:wordWrap w:val="0"/>
+            </w:pPr>
             <w:r/>
             <w:r>
               <w:rPr>
@@ -2548,6 +2614,9 @@
             <w:tcW w:type="dxa" w:w="1384"/>
           </w:tcPr>
           <w:p>
+            <w:pPr>
+              <w:wordWrap w:val="0"/>
+            </w:pPr>
             <w:r/>
             <w:r>
               <w:rPr>
@@ -2565,6 +2634,9 @@
             <w:tcW w:type="dxa" w:w="1384"/>
           </w:tcPr>
           <w:p>
+            <w:pPr>
+              <w:wordWrap w:val="0"/>
+            </w:pPr>
             <w:r/>
             <w:r>
               <w:rPr>
@@ -2582,6 +2654,9 @@
             <w:tcW w:type="dxa" w:w="1384"/>
           </w:tcPr>
           <w:p>
+            <w:pPr>
+              <w:wordWrap w:val="0"/>
+            </w:pPr>
             <w:r/>
             <w:r>
               <w:rPr>
@@ -2599,6 +2674,9 @@
             <w:tcW w:type="dxa" w:w="1384"/>
           </w:tcPr>
           <w:p>
+            <w:pPr>
+              <w:wordWrap w:val="0"/>
+            </w:pPr>
             <w:r/>
             <w:r>
               <w:rPr>
@@ -2616,6 +2694,9 @@
             <w:tcW w:type="dxa" w:w="1384"/>
           </w:tcPr>
           <w:p>
+            <w:pPr>
+              <w:wordWrap w:val="0"/>
+            </w:pPr>
             <w:r/>
             <w:r>
               <w:rPr>
@@ -2638,6 +2719,9 @@
             <w:tcW w:type="dxa" w:w="1384"/>
           </w:tcPr>
           <w:p>
+            <w:pPr>
+              <w:wordWrap w:val="0"/>
+            </w:pPr>
             <w:r/>
             <w:r>
               <w:rPr>
@@ -2655,6 +2739,9 @@
             <w:tcW w:type="dxa" w:w="1384"/>
           </w:tcPr>
           <w:p>
+            <w:pPr>
+              <w:wordWrap w:val="0"/>
+            </w:pPr>
             <w:r/>
             <w:r>
               <w:rPr>
@@ -2672,6 +2759,9 @@
             <w:tcW w:type="dxa" w:w="1384"/>
           </w:tcPr>
           <w:p>
+            <w:pPr>
+              <w:wordWrap w:val="0"/>
+            </w:pPr>
             <w:r/>
             <w:r>
               <w:rPr>
@@ -2689,6 +2779,9 @@
             <w:tcW w:type="dxa" w:w="1384"/>
           </w:tcPr>
           <w:p>
+            <w:pPr>
+              <w:wordWrap w:val="0"/>
+            </w:pPr>
             <w:r/>
             <w:r>
               <w:rPr>
@@ -2706,6 +2799,9 @@
             <w:tcW w:type="dxa" w:w="1384"/>
           </w:tcPr>
           <w:p>
+            <w:pPr>
+              <w:wordWrap w:val="0"/>
+            </w:pPr>
             <w:r/>
             <w:r>
               <w:rPr>
@@ -2723,6 +2819,9 @@
             <w:tcW w:type="dxa" w:w="1384"/>
           </w:tcPr>
           <w:p>
+            <w:pPr>
+              <w:wordWrap w:val="0"/>
+            </w:pPr>
             <w:r/>
             <w:r>
               <w:rPr>
@@ -2843,19 +2942,6 @@
     </w:p>
     <w:p>
       <w:pPr>
-        <w:spacing w:line="480" w:lineRule="auto" w:before="0" w:after="0"/>
-      </w:pPr>
-      <w:r>
-        <w:rPr>
-          <w:rFonts w:ascii="Georgia" w:hAnsi="Georgia" w:cs="Georgia"/>
-          <w:sz w:val="22"/>
-        </w:rPr>
-      </w:r>
-    </w:p>
-    <w:p/>
-    <w:p/>
-    <w:p>
-      <w:pPr>
         <w:pageBreakBefore/>
         <w:keepNext/>
         <w:keepLines/>
@@ -2966,10 +3052,17 @@
     </w:p>
     <w:tbl>
       <w:tblPr>
-        <w:tblStyle w:val="TableGrid"/>
         <w:tblW w:type="auto" w:w="0"/>
-        <w:tblLayout w:type="autofit"/>
         <w:tblLook w:firstColumn="1" w:firstRow="1" w:lastColumn="0" w:lastRow="0" w:noHBand="0" w:noVBand="1" w:val="04A0"/>
+        <w:tblBorders>
+          <w:top w:val="single" w:sz="18" w:space="0" w:color="000000"/>
+          <w:left w:val="nil" w:sz="0" w:space="0" w:color="000000"/>
+          <w:right w:val="nil" w:sz="0" w:space="0" w:color="000000"/>
+          <w:bottom w:val="single" w:sz="18" w:space="0" w:color="000000"/>
+          <w:insideH w:val="nil" w:sz="0" w:space="0" w:color="000000"/>
+          <w:insideV w:val="nil" w:sz="0" w:space="0" w:color="000000"/>
+        </w:tblBorders>
+        <w:tblLayout w:type="fixed"/>
       </w:tblPr>
       <w:tblGrid>
         <w:gridCol w:w="2769"/>
@@ -2984,8 +3077,14 @@
         <w:tc>
           <w:tcPr>
             <w:tcW w:type="dxa" w:w="2769"/>
+            <w:tcBorders>
+              <w:bottom w:val="single" w:sz="2" w:space="0" w:color="000000"/>
+            </w:tcBorders>
           </w:tcPr>
           <w:p>
+            <w:pPr>
+              <w:wordWrap w:val="0"/>
+            </w:pPr>
             <w:r/>
             <w:r>
               <w:rPr>
@@ -3001,8 +3100,14 @@
         <w:tc>
           <w:tcPr>
             <w:tcW w:type="dxa" w:w="2769"/>
+            <w:tcBorders>
+              <w:bottom w:val="single" w:sz="2" w:space="0" w:color="000000"/>
+            </w:tcBorders>
           </w:tcPr>
           <w:p>
+            <w:pPr>
+              <w:wordWrap w:val="0"/>
+            </w:pPr>
             <w:r/>
             <w:r>
               <w:rPr>
@@ -3018,8 +3123,14 @@
         <w:tc>
           <w:tcPr>
             <w:tcW w:type="dxa" w:w="2769"/>
+            <w:tcBorders>
+              <w:bottom w:val="single" w:sz="2" w:space="0" w:color="000000"/>
+            </w:tcBorders>
           </w:tcPr>
           <w:p>
+            <w:pPr>
+              <w:wordWrap w:val="0"/>
+            </w:pPr>
             <w:r/>
             <w:r>
               <w:rPr>
@@ -3042,6 +3153,9 @@
             <w:tcW w:type="dxa" w:w="2769"/>
           </w:tcPr>
           <w:p>
+            <w:pPr>
+              <w:wordWrap w:val="0"/>
+            </w:pPr>
             <w:r/>
             <w:r>
               <w:rPr>
@@ -3059,6 +3173,9 @@
             <w:tcW w:type="dxa" w:w="2769"/>
           </w:tcPr>
           <w:p>
+            <w:pPr>
+              <w:wordWrap w:val="0"/>
+            </w:pPr>
             <w:r/>
             <w:r>
               <w:rPr>
@@ -3076,6 +3193,9 @@
             <w:tcW w:type="dxa" w:w="2769"/>
           </w:tcPr>
           <w:p>
+            <w:pPr>
+              <w:wordWrap w:val="0"/>
+            </w:pPr>
             <w:r/>
             <w:r>
               <w:rPr>
@@ -3098,6 +3218,9 @@
             <w:tcW w:type="dxa" w:w="2769"/>
           </w:tcPr>
           <w:p>
+            <w:pPr>
+              <w:wordWrap w:val="0"/>
+            </w:pPr>
             <w:r/>
             <w:r>
               <w:rPr>
@@ -3115,6 +3238,9 @@
             <w:tcW w:type="dxa" w:w="2769"/>
           </w:tcPr>
           <w:p>
+            <w:pPr>
+              <w:wordWrap w:val="0"/>
+            </w:pPr>
             <w:r/>
             <w:r>
               <w:rPr>
@@ -3132,6 +3258,9 @@
             <w:tcW w:type="dxa" w:w="2769"/>
           </w:tcPr>
           <w:p>
+            <w:pPr>
+              <w:wordWrap w:val="0"/>
+            </w:pPr>
             <w:r/>
             <w:r>
               <w:rPr>
@@ -3154,6 +3283,9 @@
             <w:tcW w:type="dxa" w:w="2769"/>
           </w:tcPr>
           <w:p>
+            <w:pPr>
+              <w:wordWrap w:val="0"/>
+            </w:pPr>
             <w:r/>
             <w:r>
               <w:rPr>
@@ -3171,6 +3303,9 @@
             <w:tcW w:type="dxa" w:w="2769"/>
           </w:tcPr>
           <w:p>
+            <w:pPr>
+              <w:wordWrap w:val="0"/>
+            </w:pPr>
             <w:r/>
             <w:r>
               <w:rPr>
@@ -3188,6 +3323,9 @@
             <w:tcW w:type="dxa" w:w="2769"/>
           </w:tcPr>
           <w:p>
+            <w:pPr>
+              <w:wordWrap w:val="0"/>
+            </w:pPr>
             <w:r/>
             <w:r>
               <w:rPr>
@@ -3210,6 +3348,9 @@
             <w:tcW w:type="dxa" w:w="2769"/>
           </w:tcPr>
           <w:p>
+            <w:pPr>
+              <w:wordWrap w:val="0"/>
+            </w:pPr>
             <w:r/>
             <w:r>
               <w:rPr>
@@ -3227,6 +3368,9 @@
             <w:tcW w:type="dxa" w:w="2769"/>
           </w:tcPr>
           <w:p>
+            <w:pPr>
+              <w:wordWrap w:val="0"/>
+            </w:pPr>
             <w:r/>
             <w:r>
               <w:rPr>
@@ -3244,6 +3388,9 @@
             <w:tcW w:type="dxa" w:w="2769"/>
           </w:tcPr>
           <w:p>
+            <w:pPr>
+              <w:wordWrap w:val="0"/>
+            </w:pPr>
             <w:r/>
             <w:r>
               <w:rPr>
@@ -3266,6 +3413,9 @@
             <w:tcW w:type="dxa" w:w="2769"/>
           </w:tcPr>
           <w:p>
+            <w:pPr>
+              <w:wordWrap w:val="0"/>
+            </w:pPr>
             <w:r/>
             <w:r>
               <w:rPr>
@@ -3283,6 +3433,9 @@
             <w:tcW w:type="dxa" w:w="2769"/>
           </w:tcPr>
           <w:p>
+            <w:pPr>
+              <w:wordWrap w:val="0"/>
+            </w:pPr>
             <w:r/>
             <w:r>
               <w:rPr>
@@ -3300,6 +3453,9 @@
             <w:tcW w:type="dxa" w:w="2769"/>
           </w:tcPr>
           <w:p>
+            <w:pPr>
+              <w:wordWrap w:val="0"/>
+            </w:pPr>
             <w:r/>
             <w:r>
               <w:rPr>
@@ -3407,10 +3563,17 @@
     </w:p>
     <w:tbl>
       <w:tblPr>
-        <w:tblStyle w:val="TableGrid"/>
         <w:tblW w:type="auto" w:w="0"/>
-        <w:tblLayout w:type="autofit"/>
         <w:tblLook w:firstColumn="1" w:firstRow="1" w:lastColumn="0" w:lastRow="0" w:noHBand="0" w:noVBand="1" w:val="04A0"/>
+        <w:tblBorders>
+          <w:top w:val="single" w:sz="18" w:space="0" w:color="000000"/>
+          <w:left w:val="nil" w:sz="0" w:space="0" w:color="000000"/>
+          <w:right w:val="nil" w:sz="0" w:space="0" w:color="000000"/>
+          <w:bottom w:val="single" w:sz="18" w:space="0" w:color="000000"/>
+          <w:insideH w:val="nil" w:sz="0" w:space="0" w:color="000000"/>
+          <w:insideV w:val="nil" w:sz="0" w:space="0" w:color="000000"/>
+        </w:tblBorders>
+        <w:tblLayout w:type="fixed"/>
       </w:tblPr>
       <w:tblGrid>
         <w:gridCol w:w="1384"/>
@@ -3428,8 +3591,14 @@
         <w:tc>
           <w:tcPr>
             <w:tcW w:type="dxa" w:w="1384"/>
+            <w:tcBorders>
+              <w:bottom w:val="single" w:sz="2" w:space="0" w:color="000000"/>
+            </w:tcBorders>
           </w:tcPr>
           <w:p>
+            <w:pPr>
+              <w:wordWrap w:val="0"/>
+            </w:pPr>
             <w:r/>
             <w:r>
               <w:rPr>
@@ -3445,8 +3614,14 @@
         <w:tc>
           <w:tcPr>
             <w:tcW w:type="dxa" w:w="1384"/>
+            <w:tcBorders>
+              <w:bottom w:val="single" w:sz="2" w:space="0" w:color="000000"/>
+            </w:tcBorders>
           </w:tcPr>
           <w:p>
+            <w:pPr>
+              <w:wordWrap w:val="0"/>
+            </w:pPr>
             <w:r/>
             <w:r>
               <w:rPr>
@@ -3462,8 +3637,14 @@
         <w:tc>
           <w:tcPr>
             <w:tcW w:type="dxa" w:w="1384"/>
+            <w:tcBorders>
+              <w:bottom w:val="single" w:sz="2" w:space="0" w:color="000000"/>
+            </w:tcBorders>
           </w:tcPr>
           <w:p>
+            <w:pPr>
+              <w:wordWrap w:val="0"/>
+            </w:pPr>
             <w:r/>
             <w:r>
               <w:rPr>
@@ -3479,8 +3660,14 @@
         <w:tc>
           <w:tcPr>
             <w:tcW w:type="dxa" w:w="1384"/>
+            <w:tcBorders>
+              <w:bottom w:val="single" w:sz="2" w:space="0" w:color="000000"/>
+            </w:tcBorders>
           </w:tcPr>
           <w:p>
+            <w:pPr>
+              <w:wordWrap w:val="0"/>
+            </w:pPr>
             <w:r/>
             <w:r>
               <w:rPr>
@@ -3496,8 +3683,14 @@
         <w:tc>
           <w:tcPr>
             <w:tcW w:type="dxa" w:w="1384"/>
+            <w:tcBorders>
+              <w:bottom w:val="single" w:sz="2" w:space="0" w:color="000000"/>
+            </w:tcBorders>
           </w:tcPr>
           <w:p>
+            <w:pPr>
+              <w:wordWrap w:val="0"/>
+            </w:pPr>
             <w:r/>
             <w:r>
               <w:rPr>
@@ -3513,8 +3706,14 @@
         <w:tc>
           <w:tcPr>
             <w:tcW w:type="dxa" w:w="1384"/>
+            <w:tcBorders>
+              <w:bottom w:val="single" w:sz="2" w:space="0" w:color="000000"/>
+            </w:tcBorders>
           </w:tcPr>
           <w:p>
+            <w:pPr>
+              <w:wordWrap w:val="0"/>
+            </w:pPr>
             <w:r/>
             <w:r>
               <w:rPr>
@@ -3537,6 +3736,9 @@
             <w:tcW w:type="dxa" w:w="1384"/>
           </w:tcPr>
           <w:p>
+            <w:pPr>
+              <w:wordWrap w:val="0"/>
+            </w:pPr>
             <w:r/>
             <w:r>
               <w:rPr>
@@ -3554,6 +3756,9 @@
             <w:tcW w:type="dxa" w:w="1384"/>
           </w:tcPr>
           <w:p>
+            <w:pPr>
+              <w:wordWrap w:val="0"/>
+            </w:pPr>
             <w:r/>
             <w:r>
               <w:rPr>
@@ -3571,6 +3776,9 @@
             <w:tcW w:type="dxa" w:w="1384"/>
           </w:tcPr>
           <w:p>
+            <w:pPr>
+              <w:wordWrap w:val="0"/>
+            </w:pPr>
             <w:r/>
             <w:r>
               <w:rPr>
@@ -3588,6 +3796,9 @@
             <w:tcW w:type="dxa" w:w="1384"/>
           </w:tcPr>
           <w:p>
+            <w:pPr>
+              <w:wordWrap w:val="0"/>
+            </w:pPr>
             <w:r/>
             <w:r>
               <w:rPr>
@@ -3605,6 +3816,9 @@
             <w:tcW w:type="dxa" w:w="1384"/>
           </w:tcPr>
           <w:p>
+            <w:pPr>
+              <w:wordWrap w:val="0"/>
+            </w:pPr>
             <w:r/>
             <w:r>
               <w:rPr>
@@ -3622,6 +3836,9 @@
             <w:tcW w:type="dxa" w:w="1384"/>
           </w:tcPr>
           <w:p>
+            <w:pPr>
+              <w:wordWrap w:val="0"/>
+            </w:pPr>
             <w:r/>
             <w:r>
               <w:rPr>
@@ -3644,6 +3861,9 @@
             <w:tcW w:type="dxa" w:w="1384"/>
           </w:tcPr>
           <w:p>
+            <w:pPr>
+              <w:wordWrap w:val="0"/>
+            </w:pPr>
             <w:r/>
             <w:r>
               <w:rPr>
@@ -3661,6 +3881,9 @@
             <w:tcW w:type="dxa" w:w="1384"/>
           </w:tcPr>
           <w:p>
+            <w:pPr>
+              <w:wordWrap w:val="0"/>
+            </w:pPr>
             <w:r/>
             <w:r>
               <w:rPr>
@@ -3678,6 +3901,9 @@
             <w:tcW w:type="dxa" w:w="1384"/>
           </w:tcPr>
           <w:p>
+            <w:pPr>
+              <w:wordWrap w:val="0"/>
+            </w:pPr>
             <w:r/>
             <w:r>
               <w:rPr>
@@ -3695,6 +3921,9 @@
             <w:tcW w:type="dxa" w:w="1384"/>
           </w:tcPr>
           <w:p>
+            <w:pPr>
+              <w:wordWrap w:val="0"/>
+            </w:pPr>
             <w:r/>
             <w:r>
               <w:rPr>
@@ -3712,6 +3941,9 @@
             <w:tcW w:type="dxa" w:w="1384"/>
           </w:tcPr>
           <w:p>
+            <w:pPr>
+              <w:wordWrap w:val="0"/>
+            </w:pPr>
             <w:r/>
             <w:r>
               <w:rPr>
@@ -3729,6 +3961,9 @@
             <w:tcW w:type="dxa" w:w="1384"/>
           </w:tcPr>
           <w:p>
+            <w:pPr>
+              <w:wordWrap w:val="0"/>
+            </w:pPr>
             <w:r/>
             <w:r>
               <w:rPr>
@@ -3751,6 +3986,9 @@
             <w:tcW w:type="dxa" w:w="1384"/>
           </w:tcPr>
           <w:p>
+            <w:pPr>
+              <w:wordWrap w:val="0"/>
+            </w:pPr>
             <w:r/>
             <w:r>
               <w:rPr>
@@ -3768,6 +4006,9 @@
             <w:tcW w:type="dxa" w:w="1384"/>
           </w:tcPr>
           <w:p>
+            <w:pPr>
+              <w:wordWrap w:val="0"/>
+            </w:pPr>
             <w:r/>
             <w:r>
               <w:rPr>
@@ -3785,6 +4026,9 @@
             <w:tcW w:type="dxa" w:w="1384"/>
           </w:tcPr>
           <w:p>
+            <w:pPr>
+              <w:wordWrap w:val="0"/>
+            </w:pPr>
             <w:r/>
             <w:r>
               <w:rPr>
@@ -3802,6 +4046,9 @@
             <w:tcW w:type="dxa" w:w="1384"/>
           </w:tcPr>
           <w:p>
+            <w:pPr>
+              <w:wordWrap w:val="0"/>
+            </w:pPr>
             <w:r/>
             <w:r>
               <w:rPr>
@@ -3819,6 +4066,9 @@
             <w:tcW w:type="dxa" w:w="1384"/>
           </w:tcPr>
           <w:p>
+            <w:pPr>
+              <w:wordWrap w:val="0"/>
+            </w:pPr>
             <w:r/>
             <w:r>
               <w:rPr>
@@ -3836,6 +4086,9 @@
             <w:tcW w:type="dxa" w:w="1384"/>
           </w:tcPr>
           <w:p>
+            <w:pPr>
+              <w:wordWrap w:val="0"/>
+            </w:pPr>
             <w:r/>
             <w:r>
               <w:rPr>
@@ -3858,6 +4111,9 @@
             <w:tcW w:type="dxa" w:w="1384"/>
           </w:tcPr>
           <w:p>
+            <w:pPr>
+              <w:wordWrap w:val="0"/>
+            </w:pPr>
             <w:r/>
             <w:r>
               <w:rPr>
@@ -3875,6 +4131,9 @@
             <w:tcW w:type="dxa" w:w="1384"/>
           </w:tcPr>
           <w:p>
+            <w:pPr>
+              <w:wordWrap w:val="0"/>
+            </w:pPr>
             <w:r/>
             <w:r>
               <w:rPr>
@@ -3892,6 +4151,9 @@
             <w:tcW w:type="dxa" w:w="1384"/>
           </w:tcPr>
           <w:p>
+            <w:pPr>
+              <w:wordWrap w:val="0"/>
+            </w:pPr>
             <w:r/>
             <w:r>
               <w:rPr>
@@ -3909,6 +4171,9 @@
             <w:tcW w:type="dxa" w:w="1384"/>
           </w:tcPr>
           <w:p>
+            <w:pPr>
+              <w:wordWrap w:val="0"/>
+            </w:pPr>
             <w:r/>
             <w:r>
               <w:rPr>
@@ -3926,6 +4191,9 @@
             <w:tcW w:type="dxa" w:w="1384"/>
           </w:tcPr>
           <w:p>
+            <w:pPr>
+              <w:wordWrap w:val="0"/>
+            </w:pPr>
             <w:r/>
             <w:r>
               <w:rPr>
@@ -3943,6 +4211,9 @@
             <w:tcW w:type="dxa" w:w="1384"/>
           </w:tcPr>
           <w:p>
+            <w:pPr>
+              <w:wordWrap w:val="0"/>
+            </w:pPr>
             <w:r/>
             <w:r>
               <w:rPr>
@@ -4115,10 +4386,17 @@
     </w:p>
     <w:tbl>
       <w:tblPr>
-        <w:tblStyle w:val="TableGrid"/>
         <w:tblW w:type="auto" w:w="0"/>
-        <w:tblLayout w:type="autofit"/>
         <w:tblLook w:firstColumn="1" w:firstRow="1" w:lastColumn="0" w:lastRow="0" w:noHBand="0" w:noVBand="1" w:val="04A0"/>
+        <w:tblBorders>
+          <w:top w:val="single" w:sz="18" w:space="0" w:color="000000"/>
+          <w:left w:val="nil" w:sz="0" w:space="0" w:color="000000"/>
+          <w:right w:val="nil" w:sz="0" w:space="0" w:color="000000"/>
+          <w:bottom w:val="single" w:sz="18" w:space="0" w:color="000000"/>
+          <w:insideH w:val="nil" w:sz="0" w:space="0" w:color="000000"/>
+          <w:insideV w:val="nil" w:sz="0" w:space="0" w:color="000000"/>
+        </w:tblBorders>
+        <w:tblLayout w:type="fixed"/>
       </w:tblPr>
       <w:tblGrid>
         <w:gridCol w:w="1038"/>
@@ -4138,8 +4416,14 @@
         <w:tc>
           <w:tcPr>
             <w:tcW w:type="dxa" w:w="1038"/>
+            <w:tcBorders>
+              <w:bottom w:val="single" w:sz="2" w:space="0" w:color="000000"/>
+            </w:tcBorders>
           </w:tcPr>
           <w:p>
+            <w:pPr>
+              <w:wordWrap w:val="0"/>
+            </w:pPr>
             <w:r/>
             <w:r>
               <w:rPr>
@@ -4155,8 +4439,14 @@
         <w:tc>
           <w:tcPr>
             <w:tcW w:type="dxa" w:w="1038"/>
+            <w:tcBorders>
+              <w:bottom w:val="single" w:sz="2" w:space="0" w:color="000000"/>
+            </w:tcBorders>
           </w:tcPr>
           <w:p>
+            <w:pPr>
+              <w:wordWrap w:val="0"/>
+            </w:pPr>
             <w:r/>
             <w:r>
               <w:rPr>
@@ -4172,8 +4462,14 @@
         <w:tc>
           <w:tcPr>
             <w:tcW w:type="dxa" w:w="1038"/>
+            <w:tcBorders>
+              <w:bottom w:val="single" w:sz="2" w:space="0" w:color="000000"/>
+            </w:tcBorders>
           </w:tcPr>
           <w:p>
+            <w:pPr>
+              <w:wordWrap w:val="0"/>
+            </w:pPr>
             <w:r/>
             <w:r>
               <w:rPr>
@@ -4189,8 +4485,14 @@
         <w:tc>
           <w:tcPr>
             <w:tcW w:type="dxa" w:w="1038"/>
+            <w:tcBorders>
+              <w:bottom w:val="single" w:sz="2" w:space="0" w:color="000000"/>
+            </w:tcBorders>
           </w:tcPr>
           <w:p>
+            <w:pPr>
+              <w:wordWrap w:val="0"/>
+            </w:pPr>
             <w:r/>
             <w:r>
               <w:rPr>
@@ -4206,8 +4508,14 @@
         <w:tc>
           <w:tcPr>
             <w:tcW w:type="dxa" w:w="1038"/>
+            <w:tcBorders>
+              <w:bottom w:val="single" w:sz="2" w:space="0" w:color="000000"/>
+            </w:tcBorders>
           </w:tcPr>
           <w:p>
+            <w:pPr>
+              <w:wordWrap w:val="0"/>
+            </w:pPr>
             <w:r/>
             <w:r>
               <w:rPr>
@@ -4223,8 +4531,14 @@
         <w:tc>
           <w:tcPr>
             <w:tcW w:type="dxa" w:w="1038"/>
+            <w:tcBorders>
+              <w:bottom w:val="single" w:sz="2" w:space="0" w:color="000000"/>
+            </w:tcBorders>
           </w:tcPr>
           <w:p>
+            <w:pPr>
+              <w:wordWrap w:val="0"/>
+            </w:pPr>
             <w:r/>
             <w:r>
               <w:rPr>
@@ -4240,8 +4554,14 @@
         <w:tc>
           <w:tcPr>
             <w:tcW w:type="dxa" w:w="1038"/>
+            <w:tcBorders>
+              <w:bottom w:val="single" w:sz="2" w:space="0" w:color="000000"/>
+            </w:tcBorders>
           </w:tcPr>
           <w:p>
+            <w:pPr>
+              <w:wordWrap w:val="0"/>
+            </w:pPr>
             <w:r/>
             <w:r>
               <w:rPr>
@@ -4257,8 +4577,14 @@
         <w:tc>
           <w:tcPr>
             <w:tcW w:type="dxa" w:w="1038"/>
+            <w:tcBorders>
+              <w:bottom w:val="single" w:sz="2" w:space="0" w:color="000000"/>
+            </w:tcBorders>
           </w:tcPr>
           <w:p>
+            <w:pPr>
+              <w:wordWrap w:val="0"/>
+            </w:pPr>
             <w:r/>
             <w:r>
               <w:rPr>
@@ -4281,6 +4607,9 @@
             <w:tcW w:type="dxa" w:w="1038"/>
           </w:tcPr>
           <w:p>
+            <w:pPr>
+              <w:wordWrap w:val="0"/>
+            </w:pPr>
             <w:r/>
             <w:r>
               <w:rPr>
@@ -4298,6 +4627,9 @@
             <w:tcW w:type="dxa" w:w="1038"/>
           </w:tcPr>
           <w:p>
+            <w:pPr>
+              <w:wordWrap w:val="0"/>
+            </w:pPr>
             <w:r/>
             <w:r>
               <w:rPr>
@@ -4315,6 +4647,9 @@
             <w:tcW w:type="dxa" w:w="1038"/>
           </w:tcPr>
           <w:p>
+            <w:pPr>
+              <w:wordWrap w:val="0"/>
+            </w:pPr>
             <w:r/>
             <w:r>
               <w:rPr>
@@ -4332,6 +4667,9 @@
             <w:tcW w:type="dxa" w:w="1038"/>
           </w:tcPr>
           <w:p>
+            <w:pPr>
+              <w:wordWrap w:val="0"/>
+            </w:pPr>
             <w:r/>
             <w:r>
               <w:rPr>
@@ -4349,6 +4687,9 @@
             <w:tcW w:type="dxa" w:w="1038"/>
           </w:tcPr>
           <w:p>
+            <w:pPr>
+              <w:wordWrap w:val="0"/>
+            </w:pPr>
             <w:r/>
             <w:r>
               <w:rPr>
@@ -4366,6 +4707,9 @@
             <w:tcW w:type="dxa" w:w="1038"/>
           </w:tcPr>
           <w:p>
+            <w:pPr>
+              <w:wordWrap w:val="0"/>
+            </w:pPr>
             <w:r/>
             <w:r>
               <w:rPr>
@@ -4383,6 +4727,9 @@
             <w:tcW w:type="dxa" w:w="1038"/>
           </w:tcPr>
           <w:p>
+            <w:pPr>
+              <w:wordWrap w:val="0"/>
+            </w:pPr>
             <w:r/>
             <w:r>
               <w:rPr>
@@ -4400,6 +4747,9 @@
             <w:tcW w:type="dxa" w:w="1038"/>
           </w:tcPr>
           <w:p>
+            <w:pPr>
+              <w:wordWrap w:val="0"/>
+            </w:pPr>
             <w:r/>
             <w:r>
               <w:rPr>
@@ -4422,6 +4772,9 @@
             <w:tcW w:type="dxa" w:w="1038"/>
           </w:tcPr>
           <w:p>
+            <w:pPr>
+              <w:wordWrap w:val="0"/>
+            </w:pPr>
             <w:r/>
             <w:r>
               <w:rPr>
@@ -4439,6 +4792,9 @@
             <w:tcW w:type="dxa" w:w="1038"/>
           </w:tcPr>
           <w:p>
+            <w:pPr>
+              <w:wordWrap w:val="0"/>
+            </w:pPr>
             <w:r/>
             <w:r>
               <w:rPr>
@@ -4456,6 +4812,9 @@
             <w:tcW w:type="dxa" w:w="1038"/>
           </w:tcPr>
           <w:p>
+            <w:pPr>
+              <w:wordWrap w:val="0"/>
+            </w:pPr>
             <w:r/>
             <w:r>
               <w:rPr>
@@ -4473,6 +4832,9 @@
             <w:tcW w:type="dxa" w:w="1038"/>
           </w:tcPr>
           <w:p>
+            <w:pPr>
+              <w:wordWrap w:val="0"/>
+            </w:pPr>
             <w:r/>
             <w:r>
               <w:rPr>
@@ -4490,6 +4852,9 @@
             <w:tcW w:type="dxa" w:w="1038"/>
           </w:tcPr>
           <w:p>
+            <w:pPr>
+              <w:wordWrap w:val="0"/>
+            </w:pPr>
             <w:r/>
             <w:r>
               <w:rPr>
@@ -4507,6 +4872,9 @@
             <w:tcW w:type="dxa" w:w="1038"/>
           </w:tcPr>
           <w:p>
+            <w:pPr>
+              <w:wordWrap w:val="0"/>
+            </w:pPr>
             <w:r/>
             <w:r>
               <w:rPr>
@@ -4524,6 +4892,9 @@
             <w:tcW w:type="dxa" w:w="1038"/>
           </w:tcPr>
           <w:p>
+            <w:pPr>
+              <w:wordWrap w:val="0"/>
+            </w:pPr>
             <w:r/>
             <w:r>
               <w:rPr>
@@ -4541,6 +4912,9 @@
             <w:tcW w:type="dxa" w:w="1038"/>
           </w:tcPr>
           <w:p>
+            <w:pPr>
+              <w:wordWrap w:val="0"/>
+            </w:pPr>
             <w:r/>
             <w:r>
               <w:rPr>
@@ -4563,6 +4937,9 @@
             <w:tcW w:type="dxa" w:w="1038"/>
           </w:tcPr>
           <w:p>
+            <w:pPr>
+              <w:wordWrap w:val="0"/>
+            </w:pPr>
             <w:r/>
             <w:r>
               <w:rPr>
@@ -4580,6 +4957,9 @@
             <w:tcW w:type="dxa" w:w="1038"/>
           </w:tcPr>
           <w:p>
+            <w:pPr>
+              <w:wordWrap w:val="0"/>
+            </w:pPr>
             <w:r/>
             <w:r>
               <w:rPr>
@@ -4597,6 +4977,9 @@
             <w:tcW w:type="dxa" w:w="1038"/>
           </w:tcPr>
           <w:p>
+            <w:pPr>
+              <w:wordWrap w:val="0"/>
+            </w:pPr>
             <w:r/>
             <w:r>
               <w:rPr>
@@ -4614,6 +4997,9 @@
             <w:tcW w:type="dxa" w:w="1038"/>
           </w:tcPr>
           <w:p>
+            <w:pPr>
+              <w:wordWrap w:val="0"/>
+            </w:pPr>
             <w:r/>
             <w:r>
               <w:rPr>
@@ -4631,6 +5017,9 @@
             <w:tcW w:type="dxa" w:w="1038"/>
           </w:tcPr>
           <w:p>
+            <w:pPr>
+              <w:wordWrap w:val="0"/>
+            </w:pPr>
             <w:r/>
             <w:r>
               <w:rPr>
@@ -4648,6 +5037,9 @@
             <w:tcW w:type="dxa" w:w="1038"/>
           </w:tcPr>
           <w:p>
+            <w:pPr>
+              <w:wordWrap w:val="0"/>
+            </w:pPr>
             <w:r/>
             <w:r>
               <w:rPr>
@@ -4665,6 +5057,9 @@
             <w:tcW w:type="dxa" w:w="1038"/>
           </w:tcPr>
           <w:p>
+            <w:pPr>
+              <w:wordWrap w:val="0"/>
+            </w:pPr>
             <w:r/>
             <w:r>
               <w:rPr>
@@ -4682,6 +5077,9 @@
             <w:tcW w:type="dxa" w:w="1038"/>
           </w:tcPr>
           <w:p>
+            <w:pPr>
+              <w:wordWrap w:val="0"/>
+            </w:pPr>
             <w:r/>
             <w:r>
               <w:rPr>
@@ -4704,6 +5102,9 @@
             <w:tcW w:type="dxa" w:w="1038"/>
           </w:tcPr>
           <w:p>
+            <w:pPr>
+              <w:wordWrap w:val="0"/>
+            </w:pPr>
             <w:r/>
             <w:r>
               <w:rPr>
@@ -4721,6 +5122,9 @@
             <w:tcW w:type="dxa" w:w="1038"/>
           </w:tcPr>
           <w:p>
+            <w:pPr>
+              <w:wordWrap w:val="0"/>
+            </w:pPr>
             <w:r/>
             <w:r>
               <w:rPr>
@@ -4738,6 +5142,9 @@
             <w:tcW w:type="dxa" w:w="1038"/>
           </w:tcPr>
           <w:p>
+            <w:pPr>
+              <w:wordWrap w:val="0"/>
+            </w:pPr>
             <w:r/>
             <w:r>
               <w:rPr>
@@ -4755,6 +5162,9 @@
             <w:tcW w:type="dxa" w:w="1038"/>
           </w:tcPr>
           <w:p>
+            <w:pPr>
+              <w:wordWrap w:val="0"/>
+            </w:pPr>
             <w:r/>
             <w:r>
               <w:rPr>
@@ -4772,6 +5182,9 @@
             <w:tcW w:type="dxa" w:w="1038"/>
           </w:tcPr>
           <w:p>
+            <w:pPr>
+              <w:wordWrap w:val="0"/>
+            </w:pPr>
             <w:r/>
             <w:r>
               <w:rPr>
@@ -4789,6 +5202,9 @@
             <w:tcW w:type="dxa" w:w="1038"/>
           </w:tcPr>
           <w:p>
+            <w:pPr>
+              <w:wordWrap w:val="0"/>
+            </w:pPr>
             <w:r/>
             <w:r>
               <w:rPr>
@@ -4806,6 +5222,9 @@
             <w:tcW w:type="dxa" w:w="1038"/>
           </w:tcPr>
           <w:p>
+            <w:pPr>
+              <w:wordWrap w:val="0"/>
+            </w:pPr>
             <w:r/>
             <w:r>
               <w:rPr>
@@ -4823,6 +5242,9 @@
             <w:tcW w:type="dxa" w:w="1038"/>
           </w:tcPr>
           <w:p>
+            <w:pPr>
+              <w:wordWrap w:val="0"/>
+            </w:pPr>
             <w:r/>
             <w:r>
               <w:rPr>
@@ -5011,10 +5433,17 @@
     </w:p>
     <w:tbl>
       <w:tblPr>
-        <w:tblStyle w:val="TableGrid"/>
         <w:tblW w:type="auto" w:w="0"/>
-        <w:tblLayout w:type="autofit"/>
         <w:tblLook w:firstColumn="1" w:firstRow="1" w:lastColumn="0" w:lastRow="0" w:noHBand="0" w:noVBand="1" w:val="04A0"/>
+        <w:tblBorders>
+          <w:top w:val="single" w:sz="18" w:space="0" w:color="000000"/>
+          <w:left w:val="nil" w:sz="0" w:space="0" w:color="000000"/>
+          <w:right w:val="nil" w:sz="0" w:space="0" w:color="000000"/>
+          <w:bottom w:val="single" w:sz="18" w:space="0" w:color="000000"/>
+          <w:insideH w:val="nil" w:sz="0" w:space="0" w:color="000000"/>
+          <w:insideV w:val="nil" w:sz="0" w:space="0" w:color="000000"/>
+        </w:tblBorders>
+        <w:tblLayout w:type="fixed"/>
       </w:tblPr>
       <w:tblGrid>
         <w:gridCol w:w="2769"/>
@@ -5029,8 +5458,14 @@
         <w:tc>
           <w:tcPr>
             <w:tcW w:type="dxa" w:w="2769"/>
+            <w:tcBorders>
+              <w:bottom w:val="single" w:sz="2" w:space="0" w:color="000000"/>
+            </w:tcBorders>
           </w:tcPr>
           <w:p>
+            <w:pPr>
+              <w:wordWrap w:val="0"/>
+            </w:pPr>
             <w:r/>
             <w:r>
               <w:rPr>
@@ -5046,8 +5481,14 @@
         <w:tc>
           <w:tcPr>
             <w:tcW w:type="dxa" w:w="2769"/>
+            <w:tcBorders>
+              <w:bottom w:val="single" w:sz="2" w:space="0" w:color="000000"/>
+            </w:tcBorders>
           </w:tcPr>
           <w:p>
+            <w:pPr>
+              <w:wordWrap w:val="0"/>
+            </w:pPr>
             <w:r/>
             <w:r>
               <w:rPr>
@@ -5063,8 +5504,14 @@
         <w:tc>
           <w:tcPr>
             <w:tcW w:type="dxa" w:w="2769"/>
+            <w:tcBorders>
+              <w:bottom w:val="single" w:sz="2" w:space="0" w:color="000000"/>
+            </w:tcBorders>
           </w:tcPr>
           <w:p>
+            <w:pPr>
+              <w:wordWrap w:val="0"/>
+            </w:pPr>
             <w:r/>
             <w:r>
               <w:rPr>
@@ -5087,6 +5534,9 @@
             <w:tcW w:type="dxa" w:w="2769"/>
           </w:tcPr>
           <w:p>
+            <w:pPr>
+              <w:wordWrap w:val="0"/>
+            </w:pPr>
             <w:r/>
             <w:r>
               <w:rPr>
@@ -5104,6 +5554,9 @@
             <w:tcW w:type="dxa" w:w="2769"/>
           </w:tcPr>
           <w:p>
+            <w:pPr>
+              <w:wordWrap w:val="0"/>
+            </w:pPr>
             <w:r/>
             <w:r>
               <w:rPr>
@@ -5121,6 +5574,9 @@
             <w:tcW w:type="dxa" w:w="2769"/>
           </w:tcPr>
           <w:p>
+            <w:pPr>
+              <w:wordWrap w:val="0"/>
+            </w:pPr>
             <w:r/>
             <w:r>
               <w:rPr>
@@ -5143,6 +5599,9 @@
             <w:tcW w:type="dxa" w:w="2769"/>
           </w:tcPr>
           <w:p>
+            <w:pPr>
+              <w:wordWrap w:val="0"/>
+            </w:pPr>
             <w:r/>
             <w:r>
               <w:rPr>
@@ -5160,6 +5619,9 @@
             <w:tcW w:type="dxa" w:w="2769"/>
           </w:tcPr>
           <w:p>
+            <w:pPr>
+              <w:wordWrap w:val="0"/>
+            </w:pPr>
             <w:r/>
             <w:r>
               <w:rPr>
@@ -5177,6 +5639,9 @@
             <w:tcW w:type="dxa" w:w="2769"/>
           </w:tcPr>
           <w:p>
+            <w:pPr>
+              <w:wordWrap w:val="0"/>
+            </w:pPr>
             <w:r/>
             <w:r>
               <w:rPr>
@@ -5199,6 +5664,9 @@
             <w:tcW w:type="dxa" w:w="2769"/>
           </w:tcPr>
           <w:p>
+            <w:pPr>
+              <w:wordWrap w:val="0"/>
+            </w:pPr>
             <w:r/>
             <w:r>
               <w:rPr>
@@ -5216,6 +5684,9 @@
             <w:tcW w:type="dxa" w:w="2769"/>
           </w:tcPr>
           <w:p>
+            <w:pPr>
+              <w:wordWrap w:val="0"/>
+            </w:pPr>
             <w:r/>
             <w:r>
               <w:rPr>
@@ -5233,6 +5704,9 @@
             <w:tcW w:type="dxa" w:w="2769"/>
           </w:tcPr>
           <w:p>
+            <w:pPr>
+              <w:wordWrap w:val="0"/>
+            </w:pPr>
             <w:r/>
             <w:r>
               <w:rPr>
@@ -5255,6 +5729,9 @@
             <w:tcW w:type="dxa" w:w="2769"/>
           </w:tcPr>
           <w:p>
+            <w:pPr>
+              <w:wordWrap w:val="0"/>
+            </w:pPr>
             <w:r/>
             <w:r>
               <w:rPr>
@@ -5272,6 +5749,9 @@
             <w:tcW w:type="dxa" w:w="2769"/>
           </w:tcPr>
           <w:p>
+            <w:pPr>
+              <w:wordWrap w:val="0"/>
+            </w:pPr>
             <w:r/>
             <w:r>
               <w:rPr>
@@ -5289,6 +5769,9 @@
             <w:tcW w:type="dxa" w:w="2769"/>
           </w:tcPr>
           <w:p>
+            <w:pPr>
+              <w:wordWrap w:val="0"/>
+            </w:pPr>
             <w:r/>
             <w:r>
               <w:rPr>
@@ -5757,19 +6240,6 @@
     </w:p>
     <w:p>
       <w:pPr>
-        <w:spacing w:line="480" w:lineRule="auto" w:before="0" w:after="0"/>
-      </w:pPr>
-      <w:r>
-        <w:rPr>
-          <w:rFonts w:ascii="Georgia" w:hAnsi="Georgia" w:cs="Georgia"/>
-          <w:sz w:val="22"/>
-        </w:rPr>
-      </w:r>
-    </w:p>
-    <w:p/>
-    <w:p/>
-    <w:p>
-      <w:pPr>
         <w:pageBreakBefore/>
         <w:keepNext/>
         <w:keepLines/>
@@ -6440,19 +6910,6 @@
     </w:p>
     <w:p>
       <w:pPr>
-        <w:spacing w:line="480" w:lineRule="auto" w:before="0" w:after="0"/>
-      </w:pPr>
-      <w:r>
-        <w:rPr>
-          <w:rFonts w:ascii="Georgia" w:hAnsi="Georgia" w:cs="Georgia"/>
-          <w:sz w:val="22"/>
-        </w:rPr>
-      </w:r>
-    </w:p>
-    <w:p/>
-    <w:p/>
-    <w:p>
-      <w:pPr>
         <w:pageBreakBefore/>
         <w:keepNext/>
         <w:keepLines/>
@@ -7268,9 +7725,7 @@
     </w:p>
     <w:tbl>
       <w:tblPr>
-        <w:tblStyle w:val="TableGrid"/>
         <w:tblW w:type="auto" w:w="0"/>
-        <w:tblLayout w:type="fixed"/>
         <w:tblLook w:firstColumn="1" w:firstRow="1" w:lastColumn="0" w:lastRow="0" w:noHBand="0" w:noVBand="1" w:val="04A0"/>
         <w:tblLayout w:type="fixed"/>
         <w:tblCellMar>
@@ -7279,6 +7734,15 @@
           <w:bottom w:w="20" w:type="dxa"/>
           <w:right w:w="40" w:type="dxa"/>
         </w:tblCellMar>
+        <w:tblBorders>
+          <w:top w:val="single" w:sz="18" w:space="0" w:color="000000"/>
+          <w:left w:val="nil" w:sz="0" w:space="0" w:color="000000"/>
+          <w:right w:val="nil" w:sz="0" w:space="0" w:color="000000"/>
+          <w:bottom w:val="single" w:sz="18" w:space="0" w:color="000000"/>
+          <w:insideH w:val="nil" w:sz="0" w:space="0" w:color="000000"/>
+          <w:insideV w:val="nil" w:sz="0" w:space="0" w:color="000000"/>
+        </w:tblBorders>
+        <w:tblLayout w:type="fixed"/>
       </w:tblPr>
       <w:tblGrid>
         <w:gridCol w:w="2076"/>
@@ -7296,11 +7760,15 @@
             <w:tcW w:type="dxa" w:w="2076"/>
             <w:shd w:val="clear" w:color="auto" w:fill="F2F4F6"/>
             <w:tcW w:w="900" w:type="dxa"/>
+            <w:tcBorders>
+              <w:bottom w:val="single" w:sz="2" w:space="0" w:color="000000"/>
+            </w:tcBorders>
           </w:tcPr>
           <w:p>
             <w:pPr>
               <w:spacing w:before="40" w:after="40" w:line="240" w:lineRule="auto"/>
               <w:jc w:val="left"/>
+              <w:wordWrap w:val="0"/>
             </w:pPr>
             <w:r>
               <w:rPr>
@@ -7317,11 +7785,15 @@
             <w:tcW w:type="dxa" w:w="2076"/>
             <w:shd w:val="clear" w:color="auto" w:fill="F2F4F6"/>
             <w:tcW w:w="1600" w:type="dxa"/>
+            <w:tcBorders>
+              <w:bottom w:val="single" w:sz="2" w:space="0" w:color="000000"/>
+            </w:tcBorders>
           </w:tcPr>
           <w:p>
             <w:pPr>
               <w:spacing w:before="40" w:after="40" w:line="240" w:lineRule="auto"/>
               <w:jc w:val="left"/>
+              <w:wordWrap w:val="0"/>
             </w:pPr>
             <w:r>
               <w:rPr>
@@ -7338,11 +7810,15 @@
             <w:tcW w:type="dxa" w:w="2076"/>
             <w:shd w:val="clear" w:color="auto" w:fill="F2F4F6"/>
             <w:tcW w:w="2700" w:type="dxa"/>
+            <w:tcBorders>
+              <w:bottom w:val="single" w:sz="2" w:space="0" w:color="000000"/>
+            </w:tcBorders>
           </w:tcPr>
           <w:p>
             <w:pPr>
               <w:spacing w:before="40" w:after="40" w:line="240" w:lineRule="auto"/>
               <w:jc w:val="left"/>
+              <w:wordWrap w:val="0"/>
             </w:pPr>
             <w:r>
               <w:rPr>
@@ -7359,11 +7835,15 @@
             <w:tcW w:type="dxa" w:w="2076"/>
             <w:shd w:val="clear" w:color="auto" w:fill="F2F4F6"/>
             <w:tcW w:w="2300" w:type="dxa"/>
+            <w:tcBorders>
+              <w:bottom w:val="single" w:sz="2" w:space="0" w:color="000000"/>
+            </w:tcBorders>
           </w:tcPr>
           <w:p>
             <w:pPr>
               <w:spacing w:before="40" w:after="40" w:line="240" w:lineRule="auto"/>
               <w:jc w:val="left"/>
+              <w:wordWrap w:val="0"/>
             </w:pPr>
             <w:r>
               <w:rPr>
@@ -7390,11 +7870,12 @@
             <w:pPr>
               <w:spacing w:before="40" w:after="40" w:line="240" w:lineRule="auto"/>
               <w:jc w:val="left"/>
+              <w:wordWrap w:val="0"/>
             </w:pPr>
             <w:r>
               <w:rPr>
                 <w:rFonts w:ascii="Georgia" w:hAnsi="Georgia" w:eastAsia="Georgia"/>
-                <w:sz w:val="22"/>
+                <w:sz w:val="20"/>
                 <w:shd w:val="clear" w:color="auto" w:fill="00B0F0"/>
               </w:rPr>
               <w:t xml:space="preserve">      </w:t>
@@ -7410,6 +7891,7 @@
             <w:pPr>
               <w:spacing w:before="40" w:after="40" w:line="240" w:lineRule="auto"/>
               <w:jc w:val="left"/>
+              <w:wordWrap w:val="0"/>
             </w:pPr>
             <w:r>
               <w:rPr>
@@ -7429,6 +7911,7 @@
             <w:pPr>
               <w:spacing w:before="40" w:after="40" w:line="240" w:lineRule="auto"/>
               <w:jc w:val="left"/>
+              <w:wordWrap w:val="0"/>
             </w:pPr>
             <w:r>
               <w:rPr>
@@ -7448,6 +7931,7 @@
             <w:pPr>
               <w:spacing w:before="40" w:after="40" w:line="240" w:lineRule="auto"/>
               <w:jc w:val="left"/>
+              <w:wordWrap w:val="0"/>
             </w:pPr>
             <w:r>
               <w:rPr>
@@ -7497,11 +7981,12 @@
             <w:pPr>
               <w:spacing w:before="40" w:after="40" w:line="240" w:lineRule="auto"/>
               <w:jc w:val="left"/>
+              <w:wordWrap w:val="0"/>
             </w:pPr>
             <w:r>
               <w:rPr>
                 <w:rFonts w:ascii="Georgia" w:hAnsi="Georgia" w:eastAsia="Georgia"/>
-                <w:sz w:val="22"/>
+                <w:sz w:val="20"/>
                 <w:shd w:val="clear" w:color="auto" w:fill="FF0000"/>
               </w:rPr>
               <w:t xml:space="preserve">      </w:t>
@@ -7517,6 +8002,7 @@
             <w:pPr>
               <w:spacing w:before="40" w:after="40" w:line="240" w:lineRule="auto"/>
               <w:jc w:val="left"/>
+              <w:wordWrap w:val="0"/>
             </w:pPr>
             <w:r>
               <w:rPr>
@@ -7536,6 +8022,7 @@
             <w:pPr>
               <w:spacing w:before="40" w:after="40" w:line="240" w:lineRule="auto"/>
               <w:jc w:val="left"/>
+              <w:wordWrap w:val="0"/>
             </w:pPr>
             <w:r>
               <w:rPr>
@@ -7555,6 +8042,7 @@
             <w:pPr>
               <w:spacing w:before="40" w:after="40" w:line="240" w:lineRule="auto"/>
               <w:jc w:val="left"/>
+              <w:wordWrap w:val="0"/>
             </w:pPr>
             <w:r>
               <w:rPr>
@@ -7604,11 +8092,12 @@
             <w:pPr>
               <w:spacing w:before="40" w:after="40" w:line="240" w:lineRule="auto"/>
               <w:jc w:val="left"/>
+              <w:wordWrap w:val="0"/>
             </w:pPr>
             <w:r>
               <w:rPr>
                 <w:rFonts w:ascii="Georgia" w:hAnsi="Georgia" w:eastAsia="Georgia"/>
-                <w:sz w:val="22"/>
+                <w:sz w:val="20"/>
                 <w:shd w:val="clear" w:color="auto" w:fill="FFFF00"/>
               </w:rPr>
               <w:t xml:space="preserve">      </w:t>
@@ -7624,6 +8113,7 @@
             <w:pPr>
               <w:spacing w:before="40" w:after="40" w:line="240" w:lineRule="auto"/>
               <w:jc w:val="left"/>
+              <w:wordWrap w:val="0"/>
             </w:pPr>
             <w:r>
               <w:rPr>
@@ -7643,6 +8133,7 @@
             <w:pPr>
               <w:spacing w:before="40" w:after="40" w:line="240" w:lineRule="auto"/>
               <w:jc w:val="left"/>
+              <w:wordWrap w:val="0"/>
             </w:pPr>
             <w:r>
               <w:rPr>
@@ -7662,6 +8153,7 @@
             <w:pPr>
               <w:spacing w:before="40" w:after="40" w:line="240" w:lineRule="auto"/>
               <w:jc w:val="left"/>
+              <w:wordWrap w:val="0"/>
             </w:pPr>
             <w:r>
               <w:rPr>
@@ -7711,11 +8203,12 @@
             <w:pPr>
               <w:spacing w:before="40" w:after="40" w:line="240" w:lineRule="auto"/>
               <w:jc w:val="left"/>
+              <w:wordWrap w:val="0"/>
             </w:pPr>
             <w:r>
               <w:rPr>
                 <w:rFonts w:ascii="Georgia" w:hAnsi="Georgia" w:eastAsia="Georgia"/>
-                <w:sz w:val="22"/>
+                <w:sz w:val="20"/>
                 <w:shd w:val="clear" w:color="auto" w:fill="00B050"/>
               </w:rPr>
               <w:t xml:space="preserve">      </w:t>
@@ -7731,6 +8224,7 @@
             <w:pPr>
               <w:spacing w:before="40" w:after="40" w:line="240" w:lineRule="auto"/>
               <w:jc w:val="left"/>
+              <w:wordWrap w:val="0"/>
             </w:pPr>
             <w:r>
               <w:rPr>
@@ -7750,6 +8244,7 @@
             <w:pPr>
               <w:spacing w:before="40" w:after="40" w:line="240" w:lineRule="auto"/>
               <w:jc w:val="left"/>
+              <w:wordWrap w:val="0"/>
             </w:pPr>
             <w:r>
               <w:rPr>
@@ -7769,6 +8264,7 @@
             <w:pPr>
               <w:spacing w:before="40" w:after="40" w:line="240" w:lineRule="auto"/>
               <w:jc w:val="left"/>
+              <w:wordWrap w:val="0"/>
             </w:pPr>
             <w:r>
               <w:rPr>
@@ -8057,9 +8553,7 @@
     </w:p>
     <w:tbl>
       <w:tblPr>
-        <w:tblStyle w:val="TableGrid"/>
         <w:tblW w:type="auto" w:w="0"/>
-        <w:tblLayout w:type="fixed"/>
         <w:tblLook w:firstColumn="1" w:firstRow="1" w:lastColumn="0" w:lastRow="0" w:noHBand="0" w:noVBand="1" w:val="04A0"/>
         <w:tblLayout w:type="fixed"/>
         <w:tblCellMar>
@@ -8068,6 +8562,15 @@
           <w:bottom w:w="20" w:type="dxa"/>
           <w:right w:w="40" w:type="dxa"/>
         </w:tblCellMar>
+        <w:tblBorders>
+          <w:top w:val="single" w:sz="18" w:space="0" w:color="000000"/>
+          <w:left w:val="nil" w:sz="0" w:space="0" w:color="000000"/>
+          <w:right w:val="nil" w:sz="0" w:space="0" w:color="000000"/>
+          <w:bottom w:val="single" w:sz="18" w:space="0" w:color="000000"/>
+          <w:insideH w:val="nil" w:sz="0" w:space="0" w:color="000000"/>
+          <w:insideV w:val="nil" w:sz="0" w:space="0" w:color="000000"/>
+        </w:tblBorders>
+        <w:tblLayout w:type="fixed"/>
       </w:tblPr>
       <w:tblGrid>
         <w:gridCol w:w="2076"/>
@@ -8085,11 +8588,15 @@
             <w:tcW w:type="dxa" w:w="2076"/>
             <w:shd w:val="clear" w:color="auto" w:fill="F2F4F6"/>
             <w:tcW w:w="700" w:type="dxa"/>
+            <w:tcBorders>
+              <w:bottom w:val="single" w:sz="2" w:space="0" w:color="000000"/>
+            </w:tcBorders>
           </w:tcPr>
           <w:p>
             <w:pPr>
               <w:spacing w:before="40" w:after="40" w:line="240" w:lineRule="auto"/>
               <w:jc w:val="left"/>
+              <w:wordWrap w:val="0"/>
             </w:pPr>
             <w:r>
               <w:rPr>
@@ -8106,11 +8613,15 @@
             <w:tcW w:type="dxa" w:w="2076"/>
             <w:shd w:val="clear" w:color="auto" w:fill="F2F4F6"/>
             <w:tcW w:w="1800" w:type="dxa"/>
+            <w:tcBorders>
+              <w:bottom w:val="single" w:sz="2" w:space="0" w:color="000000"/>
+            </w:tcBorders>
           </w:tcPr>
           <w:p>
             <w:pPr>
               <w:spacing w:before="40" w:after="40" w:line="240" w:lineRule="auto"/>
               <w:jc w:val="left"/>
+              <w:wordWrap w:val="0"/>
             </w:pPr>
             <w:r>
               <w:rPr>
@@ -8127,11 +8638,15 @@
             <w:tcW w:type="dxa" w:w="2076"/>
             <w:shd w:val="clear" w:color="auto" w:fill="F2F4F6"/>
             <w:tcW w:w="2400" w:type="dxa"/>
+            <w:tcBorders>
+              <w:bottom w:val="single" w:sz="2" w:space="0" w:color="000000"/>
+            </w:tcBorders>
           </w:tcPr>
           <w:p>
             <w:pPr>
               <w:spacing w:before="40" w:after="40" w:line="240" w:lineRule="auto"/>
               <w:jc w:val="left"/>
+              <w:wordWrap w:val="0"/>
             </w:pPr>
             <w:r>
               <w:rPr>
@@ -8148,11 +8663,15 @@
             <w:tcW w:type="dxa" w:w="2076"/>
             <w:shd w:val="clear" w:color="auto" w:fill="F2F4F6"/>
             <w:tcW w:w="2600" w:type="dxa"/>
+            <w:tcBorders>
+              <w:bottom w:val="single" w:sz="2" w:space="0" w:color="000000"/>
+            </w:tcBorders>
           </w:tcPr>
           <w:p>
             <w:pPr>
               <w:spacing w:before="40" w:after="40" w:line="240" w:lineRule="auto"/>
               <w:jc w:val="left"/>
+              <w:wordWrap w:val="0"/>
             </w:pPr>
             <w:r>
               <w:rPr>
@@ -8178,6 +8697,7 @@
             <w:pPr>
               <w:spacing w:before="40" w:after="40" w:line="240" w:lineRule="auto"/>
               <w:jc w:val="left"/>
+              <w:wordWrap w:val="0"/>
             </w:pPr>
             <w:r>
               <w:rPr>
@@ -8200,6 +8720,7 @@
             <w:pPr>
               <w:spacing w:before="40" w:after="40" w:line="240" w:lineRule="auto"/>
               <w:jc w:val="left"/>
+              <w:wordWrap w:val="0"/>
             </w:pPr>
             <w:r>
               <w:rPr>
@@ -8219,6 +8740,7 @@
             <w:pPr>
               <w:spacing w:before="40" w:after="40" w:line="240" w:lineRule="auto"/>
               <w:jc w:val="left"/>
+              <w:wordWrap w:val="0"/>
             </w:pPr>
             <w:r>
               <w:rPr>
@@ -8238,6 +8760,7 @@
             <w:pPr>
               <w:spacing w:before="40" w:after="40" w:line="240" w:lineRule="auto"/>
               <w:jc w:val="left"/>
+              <w:wordWrap w:val="0"/>
             </w:pPr>
             <w:r>
               <w:rPr>
@@ -8306,6 +8829,7 @@
             <w:pPr>
               <w:spacing w:before="40" w:after="40" w:line="240" w:lineRule="auto"/>
               <w:jc w:val="left"/>
+              <w:wordWrap w:val="0"/>
             </w:pPr>
             <w:r>
               <w:rPr>
@@ -8328,6 +8852,7 @@
             <w:pPr>
               <w:spacing w:before="40" w:after="40" w:line="240" w:lineRule="auto"/>
               <w:jc w:val="left"/>
+              <w:wordWrap w:val="0"/>
             </w:pPr>
             <w:r>
               <w:rPr>
@@ -8347,6 +8872,7 @@
             <w:pPr>
               <w:spacing w:before="40" w:after="40" w:line="240" w:lineRule="auto"/>
               <w:jc w:val="left"/>
+              <w:wordWrap w:val="0"/>
             </w:pPr>
             <w:r>
               <w:rPr>
@@ -8366,6 +8892,7 @@
             <w:pPr>
               <w:spacing w:before="40" w:after="40" w:line="240" w:lineRule="auto"/>
               <w:jc w:val="left"/>
+              <w:wordWrap w:val="0"/>
             </w:pPr>
             <w:r>
               <w:rPr>
@@ -8434,6 +8961,7 @@
             <w:pPr>
               <w:spacing w:before="40" w:after="40" w:line="240" w:lineRule="auto"/>
               <w:jc w:val="left"/>
+              <w:wordWrap w:val="0"/>
             </w:pPr>
             <w:r>
               <w:rPr>
@@ -8456,6 +8984,7 @@
             <w:pPr>
               <w:spacing w:before="40" w:after="40" w:line="240" w:lineRule="auto"/>
               <w:jc w:val="left"/>
+              <w:wordWrap w:val="0"/>
             </w:pPr>
             <w:r>
               <w:rPr>
@@ -8475,6 +9004,7 @@
             <w:pPr>
               <w:spacing w:before="40" w:after="40" w:line="240" w:lineRule="auto"/>
               <w:jc w:val="left"/>
+              <w:wordWrap w:val="0"/>
             </w:pPr>
             <w:r>
               <w:rPr>
@@ -8494,6 +9024,7 @@
             <w:pPr>
               <w:spacing w:before="40" w:after="40" w:line="240" w:lineRule="auto"/>
               <w:jc w:val="left"/>
+              <w:wordWrap w:val="0"/>
             </w:pPr>
             <w:r>
               <w:rPr>
@@ -8585,9 +9116,7 @@
     </w:p>
     <w:tbl>
       <w:tblPr>
-        <w:tblStyle w:val="TableGrid"/>
         <w:tblW w:type="auto" w:w="0"/>
-        <w:tblLayout w:type="fixed"/>
         <w:tblLook w:firstColumn="1" w:firstRow="1" w:lastColumn="0" w:lastRow="0" w:noHBand="0" w:noVBand="1" w:val="04A0"/>
         <w:tblLayout w:type="fixed"/>
         <w:tblCellMar>
@@ -8596,6 +9125,15 @@
           <w:bottom w:w="20" w:type="dxa"/>
           <w:right w:w="40" w:type="dxa"/>
         </w:tblCellMar>
+        <w:tblBorders>
+          <w:top w:val="single" w:sz="18" w:space="0" w:color="000000"/>
+          <w:left w:val="nil" w:sz="0" w:space="0" w:color="000000"/>
+          <w:right w:val="nil" w:sz="0" w:space="0" w:color="000000"/>
+          <w:bottom w:val="single" w:sz="18" w:space="0" w:color="000000"/>
+          <w:insideH w:val="nil" w:sz="0" w:space="0" w:color="000000"/>
+          <w:insideV w:val="nil" w:sz="0" w:space="0" w:color="000000"/>
+        </w:tblBorders>
+        <w:tblLayout w:type="fixed"/>
       </w:tblPr>
       <w:tblGrid>
         <w:gridCol w:w="2769"/>
@@ -8612,11 +9150,15 @@
             <w:tcW w:type="dxa" w:w="2769"/>
             <w:shd w:val="clear" w:color="auto" w:fill="F2F4F6"/>
             <w:tcW w:w="2000" w:type="dxa"/>
+            <w:tcBorders>
+              <w:bottom w:val="single" w:sz="2" w:space="0" w:color="000000"/>
+            </w:tcBorders>
           </w:tcPr>
           <w:p>
             <w:pPr>
               <w:spacing w:before="40" w:after="40" w:line="240" w:lineRule="auto"/>
               <w:jc w:val="left"/>
+              <w:wordWrap w:val="0"/>
             </w:pPr>
             <w:r>
               <w:rPr>
@@ -8633,11 +9175,15 @@
             <w:tcW w:type="dxa" w:w="2769"/>
             <w:shd w:val="clear" w:color="auto" w:fill="F2F4F6"/>
             <w:tcW w:w="2750" w:type="dxa"/>
+            <w:tcBorders>
+              <w:bottom w:val="single" w:sz="2" w:space="0" w:color="000000"/>
+            </w:tcBorders>
           </w:tcPr>
           <w:p>
             <w:pPr>
               <w:spacing w:before="40" w:after="40" w:line="240" w:lineRule="auto"/>
               <w:jc w:val="left"/>
+              <w:wordWrap w:val="0"/>
             </w:pPr>
             <w:r>
               <w:rPr>
@@ -8654,11 +9200,15 @@
             <w:tcW w:type="dxa" w:w="2769"/>
             <w:shd w:val="clear" w:color="auto" w:fill="F2F4F6"/>
             <w:tcW w:w="2750" w:type="dxa"/>
+            <w:tcBorders>
+              <w:bottom w:val="single" w:sz="2" w:space="0" w:color="000000"/>
+            </w:tcBorders>
           </w:tcPr>
           <w:p>
             <w:pPr>
               <w:spacing w:before="40" w:after="40" w:line="240" w:lineRule="auto"/>
               <w:jc w:val="left"/>
+              <w:wordWrap w:val="0"/>
             </w:pPr>
             <w:r>
               <w:rPr>
@@ -8684,6 +9234,7 @@
             <w:pPr>
               <w:spacing w:before="40" w:after="40" w:line="240" w:lineRule="auto"/>
               <w:jc w:val="left"/>
+              <w:wordWrap w:val="0"/>
             </w:pPr>
             <w:r>
               <w:rPr>
@@ -8706,6 +9257,7 @@
             <w:pPr>
               <w:spacing w:before="40" w:after="40" w:line="240" w:lineRule="auto"/>
               <w:jc w:val="left"/>
+              <w:wordWrap w:val="0"/>
             </w:pPr>
             <w:r>
               <w:rPr>
@@ -8725,6 +9277,7 @@
             <w:pPr>
               <w:spacing w:before="40" w:after="40" w:line="240" w:lineRule="auto"/>
               <w:jc w:val="left"/>
+              <w:wordWrap w:val="0"/>
             </w:pPr>
             <w:r>
               <w:rPr>
@@ -8749,6 +9302,7 @@
             <w:pPr>
               <w:spacing w:before="40" w:after="40" w:line="240" w:lineRule="auto"/>
               <w:jc w:val="left"/>
+              <w:wordWrap w:val="0"/>
             </w:pPr>
             <w:r>
               <w:rPr>
@@ -8771,6 +9325,7 @@
             <w:pPr>
               <w:spacing w:before="40" w:after="40" w:line="240" w:lineRule="auto"/>
               <w:jc w:val="left"/>
+              <w:wordWrap w:val="0"/>
             </w:pPr>
             <w:r>
               <w:rPr>
@@ -8790,6 +9345,7 @@
             <w:pPr>
               <w:spacing w:before="40" w:after="40" w:line="240" w:lineRule="auto"/>
               <w:jc w:val="left"/>
+              <w:wordWrap w:val="0"/>
             </w:pPr>
             <w:r>
               <w:rPr>
@@ -8814,6 +9370,7 @@
             <w:pPr>
               <w:spacing w:before="40" w:after="40" w:line="240" w:lineRule="auto"/>
               <w:jc w:val="left"/>
+              <w:wordWrap w:val="0"/>
             </w:pPr>
             <w:r>
               <w:rPr>
@@ -8836,6 +9393,7 @@
             <w:pPr>
               <w:spacing w:before="40" w:after="40" w:line="240" w:lineRule="auto"/>
               <w:jc w:val="left"/>
+              <w:wordWrap w:val="0"/>
             </w:pPr>
             <w:r>
               <w:rPr>
@@ -8855,6 +9413,7 @@
             <w:pPr>
               <w:spacing w:before="40" w:after="40" w:line="240" w:lineRule="auto"/>
               <w:jc w:val="left"/>
+              <w:wordWrap w:val="0"/>
             </w:pPr>
             <w:r>
               <w:rPr>
@@ -8879,6 +9438,7 @@
             <w:pPr>
               <w:spacing w:before="40" w:after="40" w:line="240" w:lineRule="auto"/>
               <w:jc w:val="left"/>
+              <w:wordWrap w:val="0"/>
             </w:pPr>
             <w:r>
               <w:rPr>
@@ -8901,6 +9461,7 @@
             <w:pPr>
               <w:spacing w:before="40" w:after="40" w:line="240" w:lineRule="auto"/>
               <w:jc w:val="left"/>
+              <w:wordWrap w:val="0"/>
             </w:pPr>
             <w:r>
               <w:rPr>
@@ -8920,6 +9481,7 @@
             <w:pPr>
               <w:spacing w:before="40" w:after="40" w:line="240" w:lineRule="auto"/>
               <w:jc w:val="left"/>
+              <w:wordWrap w:val="0"/>
             </w:pPr>
             <w:r>
               <w:rPr>
@@ -8944,6 +9506,7 @@
             <w:pPr>
               <w:spacing w:before="40" w:after="40" w:line="240" w:lineRule="auto"/>
               <w:jc w:val="left"/>
+              <w:wordWrap w:val="0"/>
             </w:pPr>
             <w:r>
               <w:rPr>
@@ -8966,6 +9529,7 @@
             <w:pPr>
               <w:spacing w:before="40" w:after="40" w:line="240" w:lineRule="auto"/>
               <w:jc w:val="left"/>
+              <w:wordWrap w:val="0"/>
             </w:pPr>
             <w:r>
               <w:rPr>
@@ -8985,6 +9549,7 @@
             <w:pPr>
               <w:spacing w:before="40" w:after="40" w:line="240" w:lineRule="auto"/>
               <w:jc w:val="left"/>
+              <w:wordWrap w:val="0"/>
             </w:pPr>
             <w:r>
               <w:rPr>
@@ -9009,6 +9574,7 @@
             <w:pPr>
               <w:spacing w:before="40" w:after="40" w:line="240" w:lineRule="auto"/>
               <w:jc w:val="left"/>
+              <w:wordWrap w:val="0"/>
             </w:pPr>
             <w:r>
               <w:rPr>
@@ -9031,6 +9597,7 @@
             <w:pPr>
               <w:spacing w:before="40" w:after="40" w:line="240" w:lineRule="auto"/>
               <w:jc w:val="left"/>
+              <w:wordWrap w:val="0"/>
             </w:pPr>
             <w:r>
               <w:rPr>
@@ -9050,6 +9617,7 @@
             <w:pPr>
               <w:spacing w:before="40" w:after="40" w:line="240" w:lineRule="auto"/>
               <w:jc w:val="left"/>
+              <w:wordWrap w:val="0"/>
             </w:pPr>
             <w:r>
               <w:rPr>
@@ -9074,6 +9642,7 @@
             <w:pPr>
               <w:spacing w:before="40" w:after="40" w:line="240" w:lineRule="auto"/>
               <w:jc w:val="left"/>
+              <w:wordWrap w:val="0"/>
             </w:pPr>
             <w:r>
               <w:rPr>
@@ -9096,6 +9665,7 @@
             <w:pPr>
               <w:spacing w:before="40" w:after="40" w:line="240" w:lineRule="auto"/>
               <w:jc w:val="left"/>
+              <w:wordWrap w:val="0"/>
             </w:pPr>
             <w:r>
               <w:rPr>
@@ -9115,6 +9685,7 @@
             <w:pPr>
               <w:spacing w:before="40" w:after="40" w:line="240" w:lineRule="auto"/>
               <w:jc w:val="left"/>
+              <w:wordWrap w:val="0"/>
             </w:pPr>
             <w:r>
               <w:rPr>
@@ -9139,6 +9710,7 @@
             <w:pPr>
               <w:spacing w:before="40" w:after="40" w:line="240" w:lineRule="auto"/>
               <w:jc w:val="left"/>
+              <w:wordWrap w:val="0"/>
             </w:pPr>
             <w:r>
               <w:rPr>
@@ -9161,6 +9733,7 @@
             <w:pPr>
               <w:spacing w:before="40" w:after="40" w:line="240" w:lineRule="auto"/>
               <w:jc w:val="left"/>
+              <w:wordWrap w:val="0"/>
             </w:pPr>
             <w:r>
               <w:rPr>
@@ -9180,6 +9753,7 @@
             <w:pPr>
               <w:spacing w:before="40" w:after="40" w:line="240" w:lineRule="auto"/>
               <w:jc w:val="left"/>
+              <w:wordWrap w:val="0"/>
             </w:pPr>
             <w:r>
               <w:rPr>
@@ -9304,9 +9878,7 @@
     </w:p>
     <w:tbl>
       <w:tblPr>
-        <w:tblStyle w:val="TableGrid"/>
         <w:tblW w:type="auto" w:w="0"/>
-        <w:tblLayout w:type="fixed"/>
         <w:tblLook w:firstColumn="1" w:firstRow="1" w:lastColumn="0" w:lastRow="0" w:noHBand="0" w:noVBand="1" w:val="04A0"/>
         <w:tblLayout w:type="fixed"/>
         <w:tblCellMar>
@@ -9315,6 +9887,15 @@
           <w:bottom w:w="20" w:type="dxa"/>
           <w:right w:w="40" w:type="dxa"/>
         </w:tblCellMar>
+        <w:tblBorders>
+          <w:top w:val="single" w:sz="18" w:space="0" w:color="000000"/>
+          <w:left w:val="nil" w:sz="0" w:space="0" w:color="000000"/>
+          <w:right w:val="nil" w:sz="0" w:space="0" w:color="000000"/>
+          <w:bottom w:val="single" w:sz="18" w:space="0" w:color="000000"/>
+          <w:insideH w:val="nil" w:sz="0" w:space="0" w:color="000000"/>
+          <w:insideV w:val="nil" w:sz="0" w:space="0" w:color="000000"/>
+        </w:tblBorders>
+        <w:tblLayout w:type="fixed"/>
       </w:tblPr>
       <w:tblGrid>
         <w:gridCol w:w="2769"/>
@@ -9331,11 +9912,15 @@
             <w:tcW w:type="dxa" w:w="2769"/>
             <w:shd w:val="clear" w:color="auto" w:fill="F2F4F6"/>
             <w:tcW w:w="1000" w:type="dxa"/>
+            <w:tcBorders>
+              <w:bottom w:val="single" w:sz="2" w:space="0" w:color="000000"/>
+            </w:tcBorders>
           </w:tcPr>
           <w:p>
             <w:pPr>
               <w:spacing w:before="40" w:after="40" w:line="240" w:lineRule="auto"/>
               <w:jc w:val="left"/>
+              <w:wordWrap w:val="0"/>
             </w:pPr>
             <w:r>
               <w:rPr>
@@ -9352,11 +9937,15 @@
             <w:tcW w:type="dxa" w:w="2769"/>
             <w:shd w:val="clear" w:color="auto" w:fill="F2F4F6"/>
             <w:tcW w:w="3600" w:type="dxa"/>
+            <w:tcBorders>
+              <w:bottom w:val="single" w:sz="2" w:space="0" w:color="000000"/>
+            </w:tcBorders>
           </w:tcPr>
           <w:p>
             <w:pPr>
               <w:spacing w:before="40" w:after="40" w:line="240" w:lineRule="auto"/>
               <w:jc w:val="left"/>
+              <w:wordWrap w:val="0"/>
             </w:pPr>
             <w:r>
               <w:rPr>
@@ -9373,11 +9962,15 @@
             <w:tcW w:type="dxa" w:w="2769"/>
             <w:shd w:val="clear" w:color="auto" w:fill="F2F4F6"/>
             <w:tcW w:w="2900" w:type="dxa"/>
+            <w:tcBorders>
+              <w:bottom w:val="single" w:sz="2" w:space="0" w:color="000000"/>
+            </w:tcBorders>
           </w:tcPr>
           <w:p>
             <w:pPr>
               <w:spacing w:before="40" w:after="40" w:line="240" w:lineRule="auto"/>
               <w:jc w:val="left"/>
+              <w:wordWrap w:val="0"/>
             </w:pPr>
             <w:r>
               <w:rPr>
@@ -9403,6 +9996,7 @@
             <w:pPr>
               <w:spacing w:before="40" w:after="40" w:line="240" w:lineRule="auto"/>
               <w:jc w:val="left"/>
+              <w:wordWrap w:val="0"/>
             </w:pPr>
             <w:r>
               <w:rPr>
@@ -9425,6 +10019,7 @@
             <w:pPr>
               <w:spacing w:before="40" w:after="40" w:line="240" w:lineRule="auto"/>
               <w:jc w:val="left"/>
+              <w:wordWrap w:val="0"/>
             </w:pPr>
             <w:r>
               <w:rPr>
@@ -9444,6 +10039,7 @@
             <w:pPr>
               <w:spacing w:before="40" w:after="40" w:line="240" w:lineRule="auto"/>
               <w:jc w:val="left"/>
+              <w:wordWrap w:val="0"/>
             </w:pPr>
             <w:r>
               <w:rPr>
@@ -9491,6 +10087,7 @@
             <w:pPr>
               <w:spacing w:before="40" w:after="40" w:line="240" w:lineRule="auto"/>
               <w:jc w:val="left"/>
+              <w:wordWrap w:val="0"/>
             </w:pPr>
             <w:r>
               <w:rPr>
@@ -9513,6 +10110,7 @@
             <w:pPr>
               <w:spacing w:before="40" w:after="40" w:line="240" w:lineRule="auto"/>
               <w:jc w:val="left"/>
+              <w:wordWrap w:val="0"/>
             </w:pPr>
             <w:r>
               <w:rPr>
@@ -9532,6 +10130,7 @@
             <w:pPr>
               <w:spacing w:before="40" w:after="40" w:line="240" w:lineRule="auto"/>
               <w:jc w:val="left"/>
+              <w:wordWrap w:val="0"/>
             </w:pPr>
             <w:r>
               <w:rPr>
@@ -9579,6 +10178,7 @@
             <w:pPr>
               <w:spacing w:before="40" w:after="40" w:line="240" w:lineRule="auto"/>
               <w:jc w:val="left"/>
+              <w:wordWrap w:val="0"/>
             </w:pPr>
             <w:r>
               <w:rPr>
@@ -9601,6 +10201,7 @@
             <w:pPr>
               <w:spacing w:before="40" w:after="40" w:line="240" w:lineRule="auto"/>
               <w:jc w:val="left"/>
+              <w:wordWrap w:val="0"/>
             </w:pPr>
             <w:r>
               <w:rPr>
@@ -9620,6 +10221,7 @@
             <w:pPr>
               <w:spacing w:before="40" w:after="40" w:line="240" w:lineRule="auto"/>
               <w:jc w:val="left"/>
+              <w:wordWrap w:val="0"/>
             </w:pPr>
             <w:r>
               <w:rPr>
@@ -9667,6 +10269,7 @@
             <w:pPr>
               <w:spacing w:before="40" w:after="40" w:line="240" w:lineRule="auto"/>
               <w:jc w:val="left"/>
+              <w:wordWrap w:val="0"/>
             </w:pPr>
             <w:r>
               <w:rPr>
@@ -9689,6 +10292,7 @@
             <w:pPr>
               <w:spacing w:before="40" w:after="40" w:line="240" w:lineRule="auto"/>
               <w:jc w:val="left"/>
+              <w:wordWrap w:val="0"/>
             </w:pPr>
             <w:r>
               <w:rPr>
@@ -9708,6 +10312,7 @@
             <w:pPr>
               <w:spacing w:before="40" w:after="40" w:line="240" w:lineRule="auto"/>
               <w:jc w:val="left"/>
+              <w:wordWrap w:val="0"/>
             </w:pPr>
             <w:r>
               <w:rPr>
@@ -9755,6 +10360,7 @@
             <w:pPr>
               <w:spacing w:before="40" w:after="40" w:line="240" w:lineRule="auto"/>
               <w:jc w:val="left"/>
+              <w:wordWrap w:val="0"/>
             </w:pPr>
             <w:r>
               <w:rPr>
@@ -9777,6 +10383,7 @@
             <w:pPr>
               <w:spacing w:before="40" w:after="40" w:line="240" w:lineRule="auto"/>
               <w:jc w:val="left"/>
+              <w:wordWrap w:val="0"/>
             </w:pPr>
             <w:r>
               <w:rPr>
@@ -9796,6 +10403,7 @@
             <w:pPr>
               <w:spacing w:before="40" w:after="40" w:line="240" w:lineRule="auto"/>
               <w:jc w:val="left"/>
+              <w:wordWrap w:val="0"/>
             </w:pPr>
             <w:r>
               <w:rPr>
@@ -9907,9 +10515,7 @@
     </w:p>
     <w:tbl>
       <w:tblPr>
-        <w:tblStyle w:val="TableGrid"/>
         <w:tblW w:type="auto" w:w="0"/>
-        <w:tblLayout w:type="fixed"/>
         <w:tblLook w:firstColumn="1" w:firstRow="1" w:lastColumn="0" w:lastRow="0" w:noHBand="0" w:noVBand="1" w:val="04A0"/>
         <w:tblLayout w:type="fixed"/>
         <w:tblCellMar>
@@ -9918,6 +10524,15 @@
           <w:bottom w:w="20" w:type="dxa"/>
           <w:right w:w="40" w:type="dxa"/>
         </w:tblCellMar>
+        <w:tblBorders>
+          <w:top w:val="single" w:sz="18" w:space="0" w:color="000000"/>
+          <w:left w:val="nil" w:sz="0" w:space="0" w:color="000000"/>
+          <w:right w:val="nil" w:sz="0" w:space="0" w:color="000000"/>
+          <w:bottom w:val="single" w:sz="18" w:space="0" w:color="000000"/>
+          <w:insideH w:val="nil" w:sz="0" w:space="0" w:color="000000"/>
+          <w:insideV w:val="nil" w:sz="0" w:space="0" w:color="000000"/>
+        </w:tblBorders>
+        <w:tblLayout w:type="fixed"/>
       </w:tblPr>
       <w:tblGrid>
         <w:gridCol w:w="2076"/>
@@ -9935,11 +10550,15 @@
             <w:tcW w:type="dxa" w:w="2076"/>
             <w:shd w:val="clear" w:color="auto" w:fill="F2F4F6"/>
             <w:tcW w:w="900" w:type="dxa"/>
+            <w:tcBorders>
+              <w:bottom w:val="single" w:sz="2" w:space="0" w:color="000000"/>
+            </w:tcBorders>
           </w:tcPr>
           <w:p>
             <w:pPr>
               <w:spacing w:before="40" w:after="40" w:line="240" w:lineRule="auto"/>
               <w:jc w:val="left"/>
+              <w:wordWrap w:val="0"/>
             </w:pPr>
             <w:r>
               <w:rPr>
@@ -9956,11 +10575,15 @@
             <w:tcW w:type="dxa" w:w="2076"/>
             <w:shd w:val="clear" w:color="auto" w:fill="F2F4F6"/>
             <w:tcW w:w="1600" w:type="dxa"/>
+            <w:tcBorders>
+              <w:bottom w:val="single" w:sz="2" w:space="0" w:color="000000"/>
+            </w:tcBorders>
           </w:tcPr>
           <w:p>
             <w:pPr>
               <w:spacing w:before="40" w:after="40" w:line="240" w:lineRule="auto"/>
               <w:jc w:val="left"/>
+              <w:wordWrap w:val="0"/>
             </w:pPr>
             <w:r>
               <w:rPr>
@@ -9977,11 +10600,15 @@
             <w:tcW w:type="dxa" w:w="2076"/>
             <w:shd w:val="clear" w:color="auto" w:fill="F2F4F6"/>
             <w:tcW w:w="2500" w:type="dxa"/>
+            <w:tcBorders>
+              <w:bottom w:val="single" w:sz="2" w:space="0" w:color="000000"/>
+            </w:tcBorders>
           </w:tcPr>
           <w:p>
             <w:pPr>
               <w:spacing w:before="40" w:after="40" w:line="240" w:lineRule="auto"/>
               <w:jc w:val="left"/>
+              <w:wordWrap w:val="0"/>
             </w:pPr>
             <w:r>
               <w:rPr>
@@ -9998,11 +10625,15 @@
             <w:tcW w:type="dxa" w:w="2076"/>
             <w:shd w:val="clear" w:color="auto" w:fill="F2F4F6"/>
             <w:tcW w:w="2500" w:type="dxa"/>
+            <w:tcBorders>
+              <w:bottom w:val="single" w:sz="2" w:space="0" w:color="000000"/>
+            </w:tcBorders>
           </w:tcPr>
           <w:p>
             <w:pPr>
               <w:spacing w:before="40" w:after="40" w:line="240" w:lineRule="auto"/>
               <w:jc w:val="left"/>
+              <w:wordWrap w:val="0"/>
             </w:pPr>
             <w:r>
               <w:rPr>
@@ -10029,11 +10660,12 @@
             <w:pPr>
               <w:spacing w:before="40" w:after="40" w:line="240" w:lineRule="auto"/>
               <w:jc w:val="left"/>
+              <w:wordWrap w:val="0"/>
             </w:pPr>
             <w:r>
               <w:rPr>
                 <w:rFonts w:ascii="Georgia" w:hAnsi="Georgia" w:eastAsia="Georgia"/>
-                <w:sz w:val="22"/>
+                <w:sz w:val="20"/>
                 <w:shd w:val="clear" w:color="auto" w:fill="BFBFBF"/>
               </w:rPr>
               <w:t xml:space="preserve">      </w:t>
@@ -10049,6 +10681,7 @@
             <w:pPr>
               <w:spacing w:before="40" w:after="40" w:line="240" w:lineRule="auto"/>
               <w:jc w:val="left"/>
+              <w:wordWrap w:val="0"/>
             </w:pPr>
             <w:r>
               <w:rPr>
@@ -10068,6 +10701,7 @@
             <w:pPr>
               <w:spacing w:before="40" w:after="40" w:line="240" w:lineRule="auto"/>
               <w:jc w:val="left"/>
+              <w:wordWrap w:val="0"/>
             </w:pPr>
             <w:r>
               <w:rPr>
@@ -10087,6 +10721,7 @@
             <w:pPr>
               <w:spacing w:before="40" w:after="40" w:line="240" w:lineRule="auto"/>
               <w:jc w:val="left"/>
+              <w:wordWrap w:val="0"/>
             </w:pPr>
             <w:r>
               <w:rPr>
@@ -10136,11 +10771,12 @@
             <w:pPr>
               <w:spacing w:before="40" w:after="40" w:line="240" w:lineRule="auto"/>
               <w:jc w:val="left"/>
+              <w:wordWrap w:val="0"/>
             </w:pPr>
             <w:r>
               <w:rPr>
                 <w:rFonts w:ascii="Georgia" w:hAnsi="Georgia" w:eastAsia="Georgia"/>
-                <w:sz w:val="22"/>
+                <w:sz w:val="20"/>
                 <w:shd w:val="clear" w:color="auto" w:fill="BFBFBF"/>
               </w:rPr>
               <w:t xml:space="preserve">      </w:t>
@@ -10156,6 +10792,7 @@
             <w:pPr>
               <w:spacing w:before="40" w:after="40" w:line="240" w:lineRule="auto"/>
               <w:jc w:val="left"/>
+              <w:wordWrap w:val="0"/>
             </w:pPr>
             <w:r>
               <w:rPr>
@@ -10175,6 +10812,7 @@
             <w:pPr>
               <w:spacing w:before="40" w:after="40" w:line="240" w:lineRule="auto"/>
               <w:jc w:val="left"/>
+              <w:wordWrap w:val="0"/>
             </w:pPr>
             <w:r>
               <w:rPr>
@@ -10194,6 +10832,7 @@
             <w:pPr>
               <w:spacing w:before="40" w:after="40" w:line="240" w:lineRule="auto"/>
               <w:jc w:val="left"/>
+              <w:wordWrap w:val="0"/>
             </w:pPr>
             <w:r>
               <w:rPr>
@@ -10243,11 +10882,12 @@
             <w:pPr>
               <w:spacing w:before="40" w:after="40" w:line="240" w:lineRule="auto"/>
               <w:jc w:val="left"/>
+              <w:wordWrap w:val="0"/>
             </w:pPr>
             <w:r>
               <w:rPr>
                 <w:rFonts w:ascii="Georgia" w:hAnsi="Georgia" w:eastAsia="Georgia"/>
-                <w:sz w:val="22"/>
+                <w:sz w:val="20"/>
                 <w:shd w:val="clear" w:color="auto" w:fill="BFBFBF"/>
               </w:rPr>
               <w:t xml:space="preserve">      </w:t>
@@ -10263,6 +10903,7 @@
             <w:pPr>
               <w:spacing w:before="40" w:after="40" w:line="240" w:lineRule="auto"/>
               <w:jc w:val="left"/>
+              <w:wordWrap w:val="0"/>
             </w:pPr>
             <w:r>
               <w:rPr>
@@ -10282,6 +10923,7 @@
             <w:pPr>
               <w:spacing w:before="40" w:after="40" w:line="240" w:lineRule="auto"/>
               <w:jc w:val="left"/>
+              <w:wordWrap w:val="0"/>
             </w:pPr>
             <w:r>
               <w:rPr>
@@ -10301,6 +10943,7 @@
             <w:pPr>
               <w:spacing w:before="40" w:after="40" w:line="240" w:lineRule="auto"/>
               <w:jc w:val="left"/>
+              <w:wordWrap w:val="0"/>
             </w:pPr>
             <w:r>
               <w:rPr>
@@ -10372,9 +11015,7 @@
     </w:p>
     <w:tbl>
       <w:tblPr>
-        <w:tblStyle w:val="TableGrid"/>
         <w:tblW w:type="auto" w:w="0"/>
-        <w:tblLayout w:type="fixed"/>
         <w:tblLook w:firstColumn="1" w:firstRow="1" w:lastColumn="0" w:lastRow="0" w:noHBand="0" w:noVBand="1" w:val="04A0"/>
         <w:tblLayout w:type="fixed"/>
         <w:tblCellMar>
@@ -10383,6 +11024,15 @@
           <w:bottom w:w="20" w:type="dxa"/>
           <w:right w:w="40" w:type="dxa"/>
         </w:tblCellMar>
+        <w:tblBorders>
+          <w:top w:val="single" w:sz="18" w:space="0" w:color="000000"/>
+          <w:left w:val="nil" w:sz="0" w:space="0" w:color="000000"/>
+          <w:right w:val="nil" w:sz="0" w:space="0" w:color="000000"/>
+          <w:bottom w:val="single" w:sz="18" w:space="0" w:color="000000"/>
+          <w:insideH w:val="nil" w:sz="0" w:space="0" w:color="000000"/>
+          <w:insideV w:val="nil" w:sz="0" w:space="0" w:color="000000"/>
+        </w:tblBorders>
+        <w:tblLayout w:type="fixed"/>
       </w:tblPr>
       <w:tblGrid>
         <w:gridCol w:w="4153"/>
@@ -10398,11 +11048,15 @@
             <w:tcW w:type="dxa" w:w="4153"/>
             <w:shd w:val="clear" w:color="auto" w:fill="F2F4F6"/>
             <w:tcW w:w="3750" w:type="dxa"/>
+            <w:tcBorders>
+              <w:bottom w:val="single" w:sz="2" w:space="0" w:color="000000"/>
+            </w:tcBorders>
           </w:tcPr>
           <w:p>
             <w:pPr>
               <w:spacing w:before="40" w:after="40" w:line="240" w:lineRule="auto"/>
               <w:jc w:val="left"/>
+              <w:wordWrap w:val="0"/>
             </w:pPr>
             <w:r>
               <w:rPr>
@@ -10419,11 +11073,15 @@
             <w:tcW w:type="dxa" w:w="4153"/>
             <w:shd w:val="clear" w:color="auto" w:fill="F2F4F6"/>
             <w:tcW w:w="3750" w:type="dxa"/>
+            <w:tcBorders>
+              <w:bottom w:val="single" w:sz="2" w:space="0" w:color="000000"/>
+            </w:tcBorders>
           </w:tcPr>
           <w:p>
             <w:pPr>
               <w:spacing w:before="40" w:after="40" w:line="240" w:lineRule="auto"/>
               <w:jc w:val="left"/>
+              <w:wordWrap w:val="0"/>
             </w:pPr>
             <w:r>
               <w:rPr>
@@ -10449,11 +11107,12 @@
             <w:pPr>
               <w:spacing w:before="40" w:after="40" w:line="240" w:lineRule="auto"/>
               <w:jc w:val="left"/>
+              <w:wordWrap w:val="0"/>
             </w:pPr>
             <w:r>
               <w:rPr>
                 <w:rFonts w:ascii="Georgia" w:hAnsi="Georgia" w:eastAsia="Georgia"/>
-                <w:sz w:val="22"/>
+                <w:sz w:val="20"/>
                 <w:shd w:val="clear" w:color="auto" w:fill="00B0F0"/>
               </w:rPr>
               <w:t xml:space="preserve">      </w:t>
@@ -10473,11 +11132,12 @@
             <w:pPr>
               <w:spacing w:before="40" w:after="40" w:line="240" w:lineRule="auto"/>
               <w:jc w:val="left"/>
+              <w:wordWrap w:val="0"/>
             </w:pPr>
             <w:r>
               <w:rPr>
                 <w:rFonts w:ascii="Georgia" w:hAnsi="Georgia" w:eastAsia="Georgia"/>
-                <w:sz w:val="22"/>
+                <w:sz w:val="20"/>
                 <w:shd w:val="clear" w:color="auto" w:fill="FF0000"/>
               </w:rPr>
               <w:t xml:space="preserve">      </w:t>
@@ -10497,11 +11157,12 @@
             <w:pPr>
               <w:spacing w:before="40" w:after="40" w:line="240" w:lineRule="auto"/>
               <w:jc w:val="left"/>
+              <w:wordWrap w:val="0"/>
             </w:pPr>
             <w:r>
               <w:rPr>
                 <w:rFonts w:ascii="Georgia" w:hAnsi="Georgia" w:eastAsia="Georgia"/>
-                <w:sz w:val="22"/>
+                <w:sz w:val="20"/>
                 <w:shd w:val="clear" w:color="auto" w:fill="FFFF00"/>
               </w:rPr>
               <w:t xml:space="preserve">      </w:t>
@@ -10521,11 +11182,12 @@
             <w:pPr>
               <w:spacing w:before="40" w:after="40" w:line="240" w:lineRule="auto"/>
               <w:jc w:val="left"/>
+              <w:wordWrap w:val="0"/>
             </w:pPr>
             <w:r>
               <w:rPr>
                 <w:rFonts w:ascii="Georgia" w:hAnsi="Georgia" w:eastAsia="Georgia"/>
-                <w:sz w:val="22"/>
+                <w:sz w:val="20"/>
                 <w:shd w:val="clear" w:color="auto" w:fill="00B050"/>
               </w:rPr>
               <w:t xml:space="preserve">      </w:t>
@@ -10551,6 +11213,7 @@
             <w:pPr>
               <w:spacing w:before="40" w:after="40" w:line="240" w:lineRule="auto"/>
               <w:jc w:val="left"/>
+              <w:wordWrap w:val="0"/>
             </w:pPr>
             <w:r>
               <w:rPr>
@@ -10577,6 +11240,7 @@
             <w:pPr>
               <w:spacing w:before="40" w:after="40" w:line="240" w:lineRule="auto"/>
               <w:jc w:val="left"/>
+              <w:wordWrap w:val="0"/>
             </w:pPr>
             <w:r>
               <w:rPr>
@@ -10603,6 +11267,7 @@
             <w:pPr>
               <w:spacing w:before="40" w:after="40" w:line="240" w:lineRule="auto"/>
               <w:jc w:val="left"/>
+              <w:wordWrap w:val="0"/>
             </w:pPr>
             <w:r>
               <w:rPr>
@@ -10640,6 +11305,7 @@
             <w:pPr>
               <w:spacing w:before="40" w:after="40" w:line="240" w:lineRule="auto"/>
               <w:jc w:val="left"/>
+              <w:wordWrap w:val="0"/>
             </w:pPr>
             <w:r>
               <w:rPr>
@@ -10656,11 +11322,12 @@
             <w:pPr>
               <w:spacing w:before="40" w:after="40" w:line="240" w:lineRule="auto"/>
               <w:jc w:val="left"/>
+              <w:wordWrap w:val="0"/>
             </w:pPr>
             <w:r>
               <w:rPr>
                 <w:rFonts w:ascii="Georgia" w:hAnsi="Georgia" w:eastAsia="Georgia"/>
-                <w:sz w:val="22"/>
+                <w:sz w:val="20"/>
                 <w:shd w:val="clear" w:color="auto" w:fill="BFBFBF"/>
               </w:rPr>
               <w:t xml:space="preserve">      </w:t>
@@ -10686,6 +11353,7 @@
             <w:pPr>
               <w:spacing w:before="40" w:after="40" w:line="240" w:lineRule="auto"/>
               <w:jc w:val="left"/>
+              <w:wordWrap w:val="0"/>
             </w:pPr>
             <w:r>
               <w:rPr>
@@ -10702,6 +11370,7 @@
             <w:pPr>
               <w:spacing w:before="40" w:after="40" w:line="240" w:lineRule="auto"/>
               <w:jc w:val="left"/>
+              <w:wordWrap w:val="0"/>
             </w:pPr>
             <w:r>
               <w:rPr>
@@ -10975,9 +11644,7 @@
     </w:p>
     <w:tbl>
       <w:tblPr>
-        <w:tblStyle w:val="TableGrid"/>
         <w:tblW w:type="auto" w:w="0"/>
-        <w:tblLayout w:type="fixed"/>
         <w:tblLook w:firstColumn="1" w:firstRow="1" w:lastColumn="0" w:lastRow="0" w:noHBand="0" w:noVBand="1" w:val="04A0"/>
         <w:tblLayout w:type="fixed"/>
         <w:tblCellMar>
@@ -10986,6 +11653,15 @@
           <w:bottom w:w="20" w:type="dxa"/>
           <w:right w:w="40" w:type="dxa"/>
         </w:tblCellMar>
+        <w:tblBorders>
+          <w:top w:val="single" w:sz="18" w:space="0" w:color="000000"/>
+          <w:left w:val="nil" w:sz="0" w:space="0" w:color="000000"/>
+          <w:right w:val="nil" w:sz="0" w:space="0" w:color="000000"/>
+          <w:bottom w:val="single" w:sz="18" w:space="0" w:color="000000"/>
+          <w:insideH w:val="nil" w:sz="0" w:space="0" w:color="000000"/>
+          <w:insideV w:val="nil" w:sz="0" w:space="0" w:color="000000"/>
+        </w:tblBorders>
+        <w:tblLayout w:type="fixed"/>
       </w:tblPr>
       <w:tblGrid>
         <w:gridCol w:w="1038"/>
@@ -11007,11 +11683,15 @@
             <w:tcW w:type="dxa" w:w="1038"/>
             <w:shd w:val="clear" w:color="auto" w:fill="F2F4F6"/>
             <w:tcW w:w="1100" w:type="dxa"/>
+            <w:tcBorders>
+              <w:bottom w:val="single" w:sz="2" w:space="0" w:color="000000"/>
+            </w:tcBorders>
           </w:tcPr>
           <w:p>
             <w:pPr>
               <w:spacing w:before="40" w:after="40" w:line="240" w:lineRule="auto"/>
               <w:jc w:val="left"/>
+              <w:wordWrap w:val="0"/>
             </w:pPr>
             <w:r>
               <w:rPr>
@@ -11028,11 +11708,15 @@
             <w:tcW w:type="dxa" w:w="1038"/>
             <w:shd w:val="clear" w:color="auto" w:fill="F2F4F6"/>
             <w:tcW w:w="800" w:type="dxa"/>
+            <w:tcBorders>
+              <w:bottom w:val="single" w:sz="2" w:space="0" w:color="000000"/>
+            </w:tcBorders>
           </w:tcPr>
           <w:p>
             <w:pPr>
               <w:spacing w:before="40" w:after="40" w:line="240" w:lineRule="auto"/>
               <w:jc w:val="left"/>
+              <w:wordWrap w:val="0"/>
             </w:pPr>
             <w:r>
               <w:rPr>
@@ -11049,11 +11733,15 @@
             <w:tcW w:type="dxa" w:w="1038"/>
             <w:shd w:val="clear" w:color="auto" w:fill="F2F4F6"/>
             <w:tcW w:w="1500" w:type="dxa"/>
+            <w:tcBorders>
+              <w:bottom w:val="single" w:sz="2" w:space="0" w:color="000000"/>
+            </w:tcBorders>
           </w:tcPr>
           <w:p>
             <w:pPr>
               <w:spacing w:before="40" w:after="40" w:line="240" w:lineRule="auto"/>
               <w:jc w:val="left"/>
+              <w:wordWrap w:val="0"/>
             </w:pPr>
             <w:r>
               <w:rPr>
@@ -11070,11 +11758,15 @@
             <w:tcW w:type="dxa" w:w="1038"/>
             <w:shd w:val="clear" w:color="auto" w:fill="F2F4F6"/>
             <w:tcW w:w="1100" w:type="dxa"/>
+            <w:tcBorders>
+              <w:bottom w:val="single" w:sz="2" w:space="0" w:color="000000"/>
+            </w:tcBorders>
           </w:tcPr>
           <w:p>
             <w:pPr>
               <w:spacing w:before="40" w:after="40" w:line="240" w:lineRule="auto"/>
               <w:jc w:val="left"/>
+              <w:wordWrap w:val="0"/>
             </w:pPr>
             <w:r>
               <w:rPr>
@@ -11091,11 +11783,15 @@
             <w:tcW w:type="dxa" w:w="1038"/>
             <w:shd w:val="clear" w:color="auto" w:fill="F2F4F6"/>
             <w:tcW w:w="800" w:type="dxa"/>
+            <w:tcBorders>
+              <w:bottom w:val="single" w:sz="2" w:space="0" w:color="000000"/>
+            </w:tcBorders>
           </w:tcPr>
           <w:p>
             <w:pPr>
               <w:spacing w:before="40" w:after="40" w:line="240" w:lineRule="auto"/>
               <w:jc w:val="left"/>
+              <w:wordWrap w:val="0"/>
             </w:pPr>
             <w:r>
               <w:rPr>
@@ -11112,11 +11808,15 @@
             <w:tcW w:type="dxa" w:w="1038"/>
             <w:shd w:val="clear" w:color="auto" w:fill="F2F4F6"/>
             <w:tcW w:w="800" w:type="dxa"/>
+            <w:tcBorders>
+              <w:bottom w:val="single" w:sz="2" w:space="0" w:color="000000"/>
+            </w:tcBorders>
           </w:tcPr>
           <w:p>
             <w:pPr>
               <w:spacing w:before="40" w:after="40" w:line="240" w:lineRule="auto"/>
               <w:jc w:val="left"/>
+              <w:wordWrap w:val="0"/>
             </w:pPr>
             <w:r>
               <w:rPr>
@@ -11133,11 +11833,15 @@
             <w:tcW w:type="dxa" w:w="1038"/>
             <w:shd w:val="clear" w:color="auto" w:fill="F2F4F6"/>
             <w:tcW w:w="700" w:type="dxa"/>
+            <w:tcBorders>
+              <w:bottom w:val="single" w:sz="2" w:space="0" w:color="000000"/>
+            </w:tcBorders>
           </w:tcPr>
           <w:p>
             <w:pPr>
               <w:spacing w:before="40" w:after="40" w:line="240" w:lineRule="auto"/>
               <w:jc w:val="left"/>
+              <w:wordWrap w:val="0"/>
             </w:pPr>
             <w:r>
               <w:rPr>
@@ -11154,11 +11858,15 @@
             <w:tcW w:type="dxa" w:w="1038"/>
             <w:shd w:val="clear" w:color="auto" w:fill="F2F4F6"/>
             <w:tcW w:w="700" w:type="dxa"/>
+            <w:tcBorders>
+              <w:bottom w:val="single" w:sz="2" w:space="0" w:color="000000"/>
+            </w:tcBorders>
           </w:tcPr>
           <w:p>
             <w:pPr>
               <w:spacing w:before="40" w:after="40" w:line="240" w:lineRule="auto"/>
               <w:jc w:val="left"/>
+              <w:wordWrap w:val="0"/>
             </w:pPr>
             <w:r>
               <w:rPr>
@@ -11184,6 +11892,7 @@
             <w:pPr>
               <w:spacing w:before="40" w:after="40" w:line="240" w:lineRule="auto"/>
               <w:jc w:val="left"/>
+              <w:wordWrap w:val="0"/>
             </w:pPr>
             <w:r>
               <w:rPr>
@@ -11203,6 +11912,7 @@
             <w:pPr>
               <w:spacing w:before="40" w:after="40" w:line="240" w:lineRule="auto"/>
               <w:jc w:val="left"/>
+              <w:wordWrap w:val="0"/>
             </w:pPr>
             <w:r>
               <w:rPr>
@@ -11222,6 +11932,7 @@
             <w:pPr>
               <w:spacing w:before="40" w:after="40" w:line="240" w:lineRule="auto"/>
               <w:jc w:val="left"/>
+              <w:wordWrap w:val="0"/>
             </w:pPr>
             <w:r>
               <w:rPr>
@@ -11241,6 +11952,7 @@
             <w:pPr>
               <w:spacing w:before="40" w:after="40" w:line="240" w:lineRule="auto"/>
               <w:jc w:val="left"/>
+              <w:wordWrap w:val="0"/>
             </w:pPr>
             <w:r>
               <w:rPr>
@@ -11260,6 +11972,7 @@
             <w:pPr>
               <w:spacing w:before="40" w:after="40" w:line="240" w:lineRule="auto"/>
               <w:jc w:val="left"/>
+              <w:wordWrap w:val="0"/>
             </w:pPr>
             <w:r>
               <w:rPr>
@@ -11279,6 +11992,7 @@
             <w:pPr>
               <w:spacing w:before="40" w:after="40" w:line="240" w:lineRule="auto"/>
               <w:jc w:val="left"/>
+              <w:wordWrap w:val="0"/>
             </w:pPr>
             <w:r>
               <w:rPr>
@@ -11298,6 +12012,7 @@
             <w:pPr>
               <w:spacing w:before="40" w:after="40" w:line="240" w:lineRule="auto"/>
               <w:jc w:val="left"/>
+              <w:wordWrap w:val="0"/>
             </w:pPr>
             <w:r>
               <w:rPr>
@@ -11317,6 +12032,7 @@
             <w:pPr>
               <w:spacing w:before="40" w:after="40" w:line="240" w:lineRule="auto"/>
               <w:jc w:val="left"/>
+              <w:wordWrap w:val="0"/>
             </w:pPr>
             <w:r>
               <w:rPr>
@@ -11395,9 +12111,7 @@
     </w:p>
     <w:tbl>
       <w:tblPr>
-        <w:tblStyle w:val="TableGrid"/>
         <w:tblW w:type="auto" w:w="0"/>
-        <w:tblLayout w:type="fixed"/>
         <w:tblLook w:firstColumn="1" w:firstRow="1" w:lastColumn="0" w:lastRow="0" w:noHBand="0" w:noVBand="1" w:val="04A0"/>
         <w:tblLayout w:type="fixed"/>
         <w:tblCellMar>
@@ -11406,6 +12120,15 @@
           <w:bottom w:w="20" w:type="dxa"/>
           <w:right w:w="40" w:type="dxa"/>
         </w:tblCellMar>
+        <w:tblBorders>
+          <w:top w:val="single" w:sz="18" w:space="0" w:color="000000"/>
+          <w:left w:val="nil" w:sz="0" w:space="0" w:color="000000"/>
+          <w:right w:val="nil" w:sz="0" w:space="0" w:color="000000"/>
+          <w:bottom w:val="single" w:sz="18" w:space="0" w:color="000000"/>
+          <w:insideH w:val="nil" w:sz="0" w:space="0" w:color="000000"/>
+          <w:insideV w:val="nil" w:sz="0" w:space="0" w:color="000000"/>
+        </w:tblBorders>
+        <w:tblLayout w:type="fixed"/>
       </w:tblPr>
       <w:tblGrid>
         <w:gridCol w:w="1384"/>
@@ -11425,11 +12148,15 @@
             <w:tcW w:type="dxa" w:w="1384"/>
             <w:shd w:val="clear" w:color="auto" w:fill="F2F4F6"/>
             <w:tcW w:w="1200" w:type="dxa"/>
+            <w:tcBorders>
+              <w:bottom w:val="single" w:sz="2" w:space="0" w:color="000000"/>
+            </w:tcBorders>
           </w:tcPr>
           <w:p>
             <w:pPr>
               <w:spacing w:before="40" w:after="40" w:line="240" w:lineRule="auto"/>
               <w:jc w:val="left"/>
+              <w:wordWrap w:val="0"/>
             </w:pPr>
             <w:r>
               <w:rPr>
@@ -11446,11 +12173,15 @@
             <w:tcW w:type="dxa" w:w="1384"/>
             <w:shd w:val="clear" w:color="auto" w:fill="F2F4F6"/>
             <w:tcW w:w="800" w:type="dxa"/>
+            <w:tcBorders>
+              <w:bottom w:val="single" w:sz="2" w:space="0" w:color="000000"/>
+            </w:tcBorders>
           </w:tcPr>
           <w:p>
             <w:pPr>
               <w:spacing w:before="40" w:after="40" w:line="240" w:lineRule="auto"/>
               <w:jc w:val="left"/>
+              <w:wordWrap w:val="0"/>
             </w:pPr>
             <w:r>
               <w:rPr>
@@ -11467,11 +12198,15 @@
             <w:tcW w:type="dxa" w:w="1384"/>
             <w:shd w:val="clear" w:color="auto" w:fill="F2F4F6"/>
             <w:tcW w:w="1800" w:type="dxa"/>
+            <w:tcBorders>
+              <w:bottom w:val="single" w:sz="2" w:space="0" w:color="000000"/>
+            </w:tcBorders>
           </w:tcPr>
           <w:p>
             <w:pPr>
               <w:spacing w:before="40" w:after="40" w:line="240" w:lineRule="auto"/>
               <w:jc w:val="left"/>
+              <w:wordWrap w:val="0"/>
             </w:pPr>
             <w:r>
               <w:rPr>
@@ -11488,11 +12223,15 @@
             <w:tcW w:type="dxa" w:w="1384"/>
             <w:shd w:val="clear" w:color="auto" w:fill="F2F4F6"/>
             <w:tcW w:w="1200" w:type="dxa"/>
+            <w:tcBorders>
+              <w:bottom w:val="single" w:sz="2" w:space="0" w:color="000000"/>
+            </w:tcBorders>
           </w:tcPr>
           <w:p>
             <w:pPr>
               <w:spacing w:before="40" w:after="40" w:line="240" w:lineRule="auto"/>
               <w:jc w:val="left"/>
+              <w:wordWrap w:val="0"/>
             </w:pPr>
             <w:r>
               <w:rPr>
@@ -11509,11 +12248,15 @@
             <w:tcW w:type="dxa" w:w="1384"/>
             <w:shd w:val="clear" w:color="auto" w:fill="F2F4F6"/>
             <w:tcW w:w="1350" w:type="dxa"/>
+            <w:tcBorders>
+              <w:bottom w:val="single" w:sz="2" w:space="0" w:color="000000"/>
+            </w:tcBorders>
           </w:tcPr>
           <w:p>
             <w:pPr>
               <w:spacing w:before="40" w:after="40" w:line="240" w:lineRule="auto"/>
               <w:jc w:val="left"/>
+              <w:wordWrap w:val="0"/>
             </w:pPr>
             <w:r>
               <w:rPr>
@@ -11530,11 +12273,15 @@
             <w:tcW w:type="dxa" w:w="1384"/>
             <w:shd w:val="clear" w:color="auto" w:fill="F2F4F6"/>
             <w:tcW w:w="1150" w:type="dxa"/>
+            <w:tcBorders>
+              <w:bottom w:val="single" w:sz="2" w:space="0" w:color="000000"/>
+            </w:tcBorders>
           </w:tcPr>
           <w:p>
             <w:pPr>
               <w:spacing w:before="40" w:after="40" w:line="240" w:lineRule="auto"/>
               <w:jc w:val="left"/>
+              <w:wordWrap w:val="0"/>
             </w:pPr>
             <w:r>
               <w:rPr>
@@ -11560,6 +12307,7 @@
             <w:pPr>
               <w:spacing w:before="40" w:after="40" w:line="240" w:lineRule="auto"/>
               <w:jc w:val="left"/>
+              <w:wordWrap w:val="0"/>
             </w:pPr>
             <w:r>
               <w:rPr>
@@ -11579,6 +12327,7 @@
             <w:pPr>
               <w:spacing w:before="40" w:after="40" w:line="240" w:lineRule="auto"/>
               <w:jc w:val="left"/>
+              <w:wordWrap w:val="0"/>
             </w:pPr>
             <w:r>
               <w:rPr>
@@ -11598,6 +12347,7 @@
             <w:pPr>
               <w:spacing w:before="40" w:after="40" w:line="240" w:lineRule="auto"/>
               <w:jc w:val="left"/>
+              <w:wordWrap w:val="0"/>
             </w:pPr>
             <w:r>
               <w:rPr>
@@ -11617,6 +12367,7 @@
             <w:pPr>
               <w:spacing w:before="40" w:after="40" w:line="240" w:lineRule="auto"/>
               <w:jc w:val="left"/>
+              <w:wordWrap w:val="0"/>
             </w:pPr>
             <w:r>
               <w:rPr>
@@ -11636,6 +12387,7 @@
             <w:pPr>
               <w:spacing w:before="40" w:after="40" w:line="240" w:lineRule="auto"/>
               <w:jc w:val="left"/>
+              <w:wordWrap w:val="0"/>
             </w:pPr>
             <w:r>
               <w:rPr>
@@ -11655,6 +12407,7 @@
             <w:pPr>
               <w:spacing w:before="40" w:after="40" w:line="240" w:lineRule="auto"/>
               <w:jc w:val="left"/>
+              <w:wordWrap w:val="0"/>
             </w:pPr>
             <w:r>
               <w:rPr>
@@ -11702,9 +12455,7 @@
     </w:p>
     <w:tbl>
       <w:tblPr>
-        <w:tblStyle w:val="TableGrid"/>
         <w:tblW w:type="auto" w:w="0"/>
-        <w:tblLayout w:type="fixed"/>
         <w:tblLook w:firstColumn="1" w:firstRow="1" w:lastColumn="0" w:lastRow="0" w:noHBand="0" w:noVBand="1" w:val="04A0"/>
         <w:tblLayout w:type="fixed"/>
         <w:tblCellMar>
@@ -11713,6 +12464,15 @@
           <w:bottom w:w="20" w:type="dxa"/>
           <w:right w:w="40" w:type="dxa"/>
         </w:tblCellMar>
+        <w:tblBorders>
+          <w:top w:val="single" w:sz="18" w:space="0" w:color="000000"/>
+          <w:left w:val="nil" w:sz="0" w:space="0" w:color="000000"/>
+          <w:right w:val="nil" w:sz="0" w:space="0" w:color="000000"/>
+          <w:bottom w:val="single" w:sz="18" w:space="0" w:color="000000"/>
+          <w:insideH w:val="nil" w:sz="0" w:space="0" w:color="000000"/>
+          <w:insideV w:val="nil" w:sz="0" w:space="0" w:color="000000"/>
+        </w:tblBorders>
+        <w:tblLayout w:type="fixed"/>
       </w:tblPr>
       <w:tblGrid>
         <w:gridCol w:w="1384"/>
@@ -11732,11 +12492,15 @@
             <w:tcW w:type="dxa" w:w="1384"/>
             <w:shd w:val="clear" w:color="auto" w:fill="F2F4F6"/>
             <w:tcW w:w="1200" w:type="dxa"/>
+            <w:tcBorders>
+              <w:bottom w:val="single" w:sz="2" w:space="0" w:color="000000"/>
+            </w:tcBorders>
           </w:tcPr>
           <w:p>
             <w:pPr>
               <w:spacing w:before="40" w:after="40" w:line="240" w:lineRule="auto"/>
               <w:jc w:val="left"/>
+              <w:wordWrap w:val="0"/>
             </w:pPr>
             <w:r>
               <w:rPr>
@@ -11753,11 +12517,15 @@
             <w:tcW w:type="dxa" w:w="1384"/>
             <w:shd w:val="clear" w:color="auto" w:fill="F2F4F6"/>
             <w:tcW w:w="800" w:type="dxa"/>
+            <w:tcBorders>
+              <w:bottom w:val="single" w:sz="2" w:space="0" w:color="000000"/>
+            </w:tcBorders>
           </w:tcPr>
           <w:p>
             <w:pPr>
               <w:spacing w:before="40" w:after="40" w:line="240" w:lineRule="auto"/>
               <w:jc w:val="left"/>
+              <w:wordWrap w:val="0"/>
             </w:pPr>
             <w:r>
               <w:rPr>
@@ -11774,11 +12542,15 @@
             <w:tcW w:type="dxa" w:w="1384"/>
             <w:shd w:val="clear" w:color="auto" w:fill="F2F4F6"/>
             <w:tcW w:w="1800" w:type="dxa"/>
+            <w:tcBorders>
+              <w:bottom w:val="single" w:sz="2" w:space="0" w:color="000000"/>
+            </w:tcBorders>
           </w:tcPr>
           <w:p>
             <w:pPr>
               <w:spacing w:before="40" w:after="40" w:line="240" w:lineRule="auto"/>
               <w:jc w:val="left"/>
+              <w:wordWrap w:val="0"/>
             </w:pPr>
             <w:r>
               <w:rPr>
@@ -11795,11 +12567,15 @@
             <w:tcW w:type="dxa" w:w="1384"/>
             <w:shd w:val="clear" w:color="auto" w:fill="F2F4F6"/>
             <w:tcW w:w="1350" w:type="dxa"/>
+            <w:tcBorders>
+              <w:bottom w:val="single" w:sz="2" w:space="0" w:color="000000"/>
+            </w:tcBorders>
           </w:tcPr>
           <w:p>
             <w:pPr>
               <w:spacing w:before="40" w:after="40" w:line="240" w:lineRule="auto"/>
               <w:jc w:val="left"/>
+              <w:wordWrap w:val="0"/>
             </w:pPr>
             <w:r>
               <w:rPr>
@@ -11816,11 +12592,15 @@
             <w:tcW w:type="dxa" w:w="1384"/>
             <w:shd w:val="clear" w:color="auto" w:fill="F2F4F6"/>
             <w:tcW w:w="1200" w:type="dxa"/>
+            <w:tcBorders>
+              <w:bottom w:val="single" w:sz="2" w:space="0" w:color="000000"/>
+            </w:tcBorders>
           </w:tcPr>
           <w:p>
             <w:pPr>
               <w:spacing w:before="40" w:after="40" w:line="240" w:lineRule="auto"/>
               <w:jc w:val="left"/>
+              <w:wordWrap w:val="0"/>
             </w:pPr>
             <w:r>
               <w:rPr>
@@ -11837,11 +12617,15 @@
             <w:tcW w:type="dxa" w:w="1384"/>
             <w:shd w:val="clear" w:color="auto" w:fill="F2F4F6"/>
             <w:tcW w:w="1150" w:type="dxa"/>
+            <w:tcBorders>
+              <w:bottom w:val="single" w:sz="2" w:space="0" w:color="000000"/>
+            </w:tcBorders>
           </w:tcPr>
           <w:p>
             <w:pPr>
               <w:spacing w:before="40" w:after="40" w:line="240" w:lineRule="auto"/>
               <w:jc w:val="left"/>
+              <w:wordWrap w:val="0"/>
             </w:pPr>
             <w:r>
               <w:rPr>
@@ -11867,6 +12651,7 @@
             <w:pPr>
               <w:spacing w:before="40" w:after="40" w:line="240" w:lineRule="auto"/>
               <w:jc w:val="left"/>
+              <w:wordWrap w:val="0"/>
             </w:pPr>
             <w:r>
               <w:rPr>
@@ -11886,6 +12671,7 @@
             <w:pPr>
               <w:spacing w:before="40" w:after="40" w:line="240" w:lineRule="auto"/>
               <w:jc w:val="left"/>
+              <w:wordWrap w:val="0"/>
             </w:pPr>
             <w:r>
               <w:rPr>
@@ -11905,6 +12691,7 @@
             <w:pPr>
               <w:spacing w:before="40" w:after="40" w:line="240" w:lineRule="auto"/>
               <w:jc w:val="left"/>
+              <w:wordWrap w:val="0"/>
             </w:pPr>
             <w:r>
               <w:rPr>
@@ -11924,6 +12711,7 @@
             <w:pPr>
               <w:spacing w:before="40" w:after="40" w:line="240" w:lineRule="auto"/>
               <w:jc w:val="left"/>
+              <w:wordWrap w:val="0"/>
             </w:pPr>
             <w:r>
               <w:rPr>
@@ -11943,6 +12731,7 @@
             <w:pPr>
               <w:spacing w:before="40" w:after="40" w:line="240" w:lineRule="auto"/>
               <w:jc w:val="left"/>
+              <w:wordWrap w:val="0"/>
             </w:pPr>
             <w:r>
               <w:rPr>
@@ -11962,6 +12751,7 @@
             <w:pPr>
               <w:spacing w:before="40" w:after="40" w:line="240" w:lineRule="auto"/>
               <w:jc w:val="left"/>
+              <w:wordWrap w:val="0"/>
             </w:pPr>
             <w:r>
               <w:rPr>
@@ -12543,20 +13333,6 @@
         </w:sectPr>
       </w:pPr>
     </w:p>
-    <w:p>
-      <w:pPr>
-        <w:spacing w:before="0" w:after="0" w:line="240" w:lineRule="auto"/>
-      </w:pPr>
-      <w:r>
-        <w:rPr>
-          <w:rFonts w:ascii="Georgia" w:hAnsi="Georgia" w:eastAsia="Georgia"/>
-          <w:b w:val="0"/>
-          <w:i w:val="0"/>
-          <w:sz w:val="22"/>
-        </w:rPr>
-      </w:r>
-    </w:p>
-    <w:p/>
     <w:p>
       <w:pPr>
         <w:pageBreakBefore/>

</xml_diff>

<commit_message>
Draft_012 (in place): restore D5 title page spacing exactly (8 top empties, 4 after title, 5 before By, 10 between By and author)
</commit_message>
<xml_diff>
--- a/thesis/003_ThesisProposal_Draft_012.docx
+++ b/thesis/003_ThesisProposal_Draft_012.docx
@@ -28,6 +28,12 @@
         </w:rPr>
       </w:r>
     </w:p>
+    <w:p/>
+    <w:p/>
+    <w:p/>
+    <w:p/>
+    <w:p/>
+    <w:p/>
     <w:p>
       <w:pPr>
         <w:spacing w:after="0" w:line="240" w:lineRule="auto"/>
@@ -84,6 +90,8 @@
         </w:rPr>
       </w:r>
     </w:p>
+    <w:p/>
+    <w:p/>
     <w:p>
       <w:pPr>
         <w:spacing w:after="0" w:line="240" w:lineRule="auto"/>
@@ -271,6 +279,9 @@
         </w:rPr>
       </w:r>
     </w:p>
+    <w:p/>
+    <w:p/>
+    <w:p/>
     <w:p>
       <w:pPr>
         <w:spacing w:after="0" w:line="240" w:lineRule="auto"/>
@@ -312,6 +323,14 @@
         </w:rPr>
       </w:r>
     </w:p>
+    <w:p/>
+    <w:p/>
+    <w:p/>
+    <w:p/>
+    <w:p/>
+    <w:p/>
+    <w:p/>
+    <w:p/>
     <w:p>
       <w:pPr>
         <w:spacing w:after="0" w:line="240" w:lineRule="auto"/>

</xml_diff>

<commit_message>
Draft_012 (in place): apply uniform 3-before-3-after heading spacing rule; fix title page body-paragraph spacing to match
</commit_message>
<xml_diff>
--- a/thesis/003_ThesisProposal_Draft_012.docx
+++ b/thesis/003_ThesisProposal_Draft_012.docx
@@ -29,10 +29,62 @@
       </w:r>
     </w:p>
     <w:p/>
-    <w:p/>
-    <w:p/>
-    <w:p/>
-    <w:p/>
+    <w:p>
+      <w:pPr>
+        <w:spacing w:after="0" w:line="240" w:lineRule="auto"/>
+        <w:jc w:val="center"/>
+      </w:pPr>
+      <w:r>
+        <w:rPr>
+          <w:rFonts w:ascii="Georgia" w:hAnsi="Georgia" w:eastAsia="Georgia"/>
+          <w:b/>
+          <w:i w:val="0"/>
+          <w:sz w:val="28"/>
+        </w:rPr>
+        <w:t>THE USE OF HEDGES IN RESEARCH ABSTRACTS</w:t>
+      </w:r>
+    </w:p>
+    <w:p>
+      <w:pPr>
+        <w:spacing w:after="0" w:line="240" w:lineRule="auto"/>
+        <w:jc w:val="center"/>
+      </w:pPr>
+      <w:r>
+        <w:rPr>
+          <w:rFonts w:ascii="Georgia" w:hAnsi="Georgia" w:eastAsia="Georgia"/>
+          <w:b/>
+          <w:i w:val="0"/>
+          <w:sz w:val="28"/>
+        </w:rPr>
+        <w:t>ACROSS APPLIED LIFE SCIENCES</w:t>
+      </w:r>
+    </w:p>
+    <w:p>
+      <w:pPr>
+        <w:spacing w:before="0" w:after="0" w:line="240" w:lineRule="auto"/>
+      </w:pPr>
+      <w:r>
+        <w:rPr>
+          <w:rFonts w:ascii="Georgia" w:hAnsi="Georgia" w:eastAsia="Georgia"/>
+          <w:b w:val="0"/>
+          <w:i w:val="0"/>
+          <w:sz w:val="22"/>
+        </w:rPr>
+      </w:r>
+    </w:p>
+    <w:p>
+      <w:pPr>
+        <w:spacing w:before="0" w:after="0" w:line="240" w:lineRule="auto"/>
+      </w:pPr>
+      <w:r>
+        <w:rPr>
+          <w:rFonts w:ascii="Georgia" w:hAnsi="Georgia" w:eastAsia="Georgia"/>
+          <w:b w:val="0"/>
+          <w:i w:val="0"/>
+          <w:sz w:val="22"/>
+        </w:rPr>
+      </w:r>
+    </w:p>
     <w:p/>
     <w:p>
       <w:pPr>
@@ -42,11 +94,11 @@
       <w:r>
         <w:rPr>
           <w:rFonts w:ascii="Georgia" w:hAnsi="Georgia" w:eastAsia="Georgia"/>
-          <w:b/>
-          <w:i w:val="0"/>
-          <w:sz w:val="28"/>
-        </w:rPr>
-        <w:t>THE USE OF HEDGES IN RESEARCH ABSTRACTS</w:t>
+          <w:b w:val="0"/>
+          <w:i w:val="0"/>
+          <w:sz w:val="24"/>
+        </w:rPr>
+        <w:t>A Thesis</w:t>
       </w:r>
     </w:p>
     <w:p>
@@ -57,28 +109,88 @@
       <w:r>
         <w:rPr>
           <w:rFonts w:ascii="Georgia" w:hAnsi="Georgia" w:eastAsia="Georgia"/>
-          <w:b/>
-          <w:i w:val="0"/>
-          <w:sz w:val="28"/>
-        </w:rPr>
-        <w:t>ACROSS APPLIED LIFE SCIENCES</w:t>
+          <w:b w:val="0"/>
+          <w:i w:val="0"/>
+          <w:sz w:val="24"/>
+        </w:rPr>
+        <w:t>Presented to the Faculty of</w:t>
       </w:r>
     </w:p>
     <w:p>
       <w:pPr>
-        <w:spacing w:before="0" w:after="0" w:line="240" w:lineRule="auto"/>
-      </w:pPr>
-      <w:r>
-        <w:rPr>
-          <w:rFonts w:ascii="Georgia" w:hAnsi="Georgia" w:eastAsia="Georgia"/>
-          <w:b w:val="0"/>
-          <w:i w:val="0"/>
-          <w:sz w:val="22"/>
-        </w:rPr>
+        <w:spacing w:after="0" w:line="240" w:lineRule="auto"/>
+        <w:jc w:val="center"/>
+      </w:pPr>
+      <w:r>
+        <w:rPr>
+          <w:rFonts w:ascii="Georgia" w:hAnsi="Georgia" w:eastAsia="Georgia"/>
+          <w:b w:val="0"/>
+          <w:i w:val="0"/>
+          <w:sz w:val="24"/>
+        </w:rPr>
+        <w:t>Department of English</w:t>
       </w:r>
     </w:p>
     <w:p>
       <w:pPr>
+        <w:spacing w:after="0" w:line="240" w:lineRule="auto"/>
+        <w:jc w:val="center"/>
+      </w:pPr>
+      <w:r>
+        <w:rPr>
+          <w:rFonts w:ascii="Georgia" w:hAnsi="Georgia" w:eastAsia="Georgia"/>
+          <w:b w:val="0"/>
+          <w:i w:val="0"/>
+          <w:sz w:val="24"/>
+        </w:rPr>
+        <w:t>College of Arts and Sciences</w:t>
+      </w:r>
+    </w:p>
+    <w:p>
+      <w:pPr>
+        <w:spacing w:after="0" w:line="240" w:lineRule="auto"/>
+        <w:jc w:val="center"/>
+      </w:pPr>
+      <w:r>
+        <w:rPr>
+          <w:rFonts w:ascii="Georgia" w:hAnsi="Georgia" w:eastAsia="Georgia"/>
+          <w:b w:val="0"/>
+          <w:i w:val="0"/>
+          <w:sz w:val="24"/>
+        </w:rPr>
+        <w:t>Pampanga State Agricultural University</w:t>
+      </w:r>
+    </w:p>
+    <w:p>
+      <w:pPr>
+        <w:spacing w:after="0" w:line="240" w:lineRule="auto"/>
+        <w:jc w:val="center"/>
+      </w:pPr>
+      <w:r>
+        <w:rPr>
+          <w:rFonts w:ascii="Georgia" w:hAnsi="Georgia" w:eastAsia="Georgia"/>
+          <w:b w:val="0"/>
+          <w:i w:val="0"/>
+          <w:sz w:val="24"/>
+        </w:rPr>
+        <w:t>Magalang, Pampanga</w:t>
+      </w:r>
+    </w:p>
+    <w:p>
+      <w:pPr>
+        <w:spacing w:before="0" w:after="0" w:line="240" w:lineRule="auto"/>
+      </w:pPr>
+      <w:r>
+        <w:rPr>
+          <w:rFonts w:ascii="Georgia" w:hAnsi="Georgia" w:eastAsia="Georgia"/>
+          <w:b w:val="0"/>
+          <w:i w:val="0"/>
+          <w:sz w:val="22"/>
+        </w:rPr>
+      </w:r>
+    </w:p>
+    <w:p>
+      <w:pPr>
         <w:spacing w:before="0" w:after="0" w:line="240" w:lineRule="auto"/>
       </w:pPr>
       <w:r>
@@ -91,6 +203,77 @@
       </w:r>
     </w:p>
     <w:p/>
+    <w:p>
+      <w:pPr>
+        <w:spacing w:after="0" w:line="240" w:lineRule="auto"/>
+        <w:jc w:val="center"/>
+      </w:pPr>
+      <w:r>
+        <w:rPr>
+          <w:rFonts w:ascii="Georgia" w:hAnsi="Georgia" w:eastAsia="Georgia"/>
+          <w:b w:val="0"/>
+          <w:i w:val="0"/>
+          <w:sz w:val="24"/>
+        </w:rPr>
+        <w:t>In Partial Fulfillment</w:t>
+      </w:r>
+    </w:p>
+    <w:p>
+      <w:pPr>
+        <w:spacing w:after="0" w:line="240" w:lineRule="auto"/>
+        <w:jc w:val="center"/>
+      </w:pPr>
+      <w:r>
+        <w:rPr>
+          <w:rFonts w:ascii="Georgia" w:hAnsi="Georgia" w:eastAsia="Georgia"/>
+          <w:b w:val="0"/>
+          <w:i w:val="0"/>
+          <w:sz w:val="24"/>
+        </w:rPr>
+        <w:t>of the Requirements for the Degree</w:t>
+      </w:r>
+    </w:p>
+    <w:p>
+      <w:pPr>
+        <w:spacing w:after="0" w:line="240" w:lineRule="auto"/>
+        <w:jc w:val="center"/>
+      </w:pPr>
+      <w:r>
+        <w:rPr>
+          <w:rFonts w:ascii="Georgia" w:hAnsi="Georgia" w:eastAsia="Georgia"/>
+          <w:b w:val="0"/>
+          <w:i w:val="0"/>
+          <w:sz w:val="24"/>
+        </w:rPr>
+        <w:t>BACHELOR OF ARTS IN ENGLISH LANGUAGE STUDIES</w:t>
+      </w:r>
+    </w:p>
+    <w:p>
+      <w:pPr>
+        <w:spacing w:before="0" w:after="0" w:line="240" w:lineRule="auto"/>
+      </w:pPr>
+      <w:r>
+        <w:rPr>
+          <w:rFonts w:ascii="Georgia" w:hAnsi="Georgia" w:eastAsia="Georgia"/>
+          <w:b w:val="0"/>
+          <w:i w:val="0"/>
+          <w:sz w:val="22"/>
+        </w:rPr>
+      </w:r>
+    </w:p>
+    <w:p>
+      <w:pPr>
+        <w:spacing w:before="0" w:after="0" w:line="240" w:lineRule="auto"/>
+      </w:pPr>
+      <w:r>
+        <w:rPr>
+          <w:rFonts w:ascii="Georgia" w:hAnsi="Georgia" w:eastAsia="Georgia"/>
+          <w:b w:val="0"/>
+          <w:i w:val="0"/>
+          <w:sz w:val="22"/>
+        </w:rPr>
+      </w:r>
+    </w:p>
     <w:p/>
     <w:p>
       <w:pPr>
@@ -104,232 +287,35 @@
           <w:i w:val="0"/>
           <w:sz w:val="24"/>
         </w:rPr>
-        <w:t>A Thesis</w:t>
+        <w:t>By</w:t>
       </w:r>
     </w:p>
     <w:p>
       <w:pPr>
-        <w:spacing w:after="0" w:line="240" w:lineRule="auto"/>
-        <w:jc w:val="center"/>
-      </w:pPr>
-      <w:r>
-        <w:rPr>
-          <w:rFonts w:ascii="Georgia" w:hAnsi="Georgia" w:eastAsia="Georgia"/>
-          <w:b w:val="0"/>
-          <w:i w:val="0"/>
-          <w:sz w:val="24"/>
-        </w:rPr>
-        <w:t>Presented to the Faculty of</w:t>
+        <w:spacing w:before="0" w:after="0" w:line="240" w:lineRule="auto"/>
+      </w:pPr>
+      <w:r>
+        <w:rPr>
+          <w:rFonts w:ascii="Georgia" w:hAnsi="Georgia" w:eastAsia="Georgia"/>
+          <w:b w:val="0"/>
+          <w:i w:val="0"/>
+          <w:sz w:val="22"/>
+        </w:rPr>
       </w:r>
     </w:p>
     <w:p>
       <w:pPr>
-        <w:spacing w:after="0" w:line="240" w:lineRule="auto"/>
-        <w:jc w:val="center"/>
-      </w:pPr>
-      <w:r>
-        <w:rPr>
-          <w:rFonts w:ascii="Georgia" w:hAnsi="Georgia" w:eastAsia="Georgia"/>
-          <w:b w:val="0"/>
-          <w:i w:val="0"/>
-          <w:sz w:val="24"/>
-        </w:rPr>
-        <w:t>Department of English</w:t>
+        <w:spacing w:before="0" w:after="0" w:line="240" w:lineRule="auto"/>
+      </w:pPr>
+      <w:r>
+        <w:rPr>
+          <w:rFonts w:ascii="Georgia" w:hAnsi="Georgia" w:eastAsia="Georgia"/>
+          <w:b w:val="0"/>
+          <w:i w:val="0"/>
+          <w:sz w:val="22"/>
+        </w:rPr>
       </w:r>
     </w:p>
-    <w:p>
-      <w:pPr>
-        <w:spacing w:after="0" w:line="240" w:lineRule="auto"/>
-        <w:jc w:val="center"/>
-      </w:pPr>
-      <w:r>
-        <w:rPr>
-          <w:rFonts w:ascii="Georgia" w:hAnsi="Georgia" w:eastAsia="Georgia"/>
-          <w:b w:val="0"/>
-          <w:i w:val="0"/>
-          <w:sz w:val="24"/>
-        </w:rPr>
-        <w:t>College of Arts and Sciences</w:t>
-      </w:r>
-    </w:p>
-    <w:p>
-      <w:pPr>
-        <w:spacing w:after="0" w:line="240" w:lineRule="auto"/>
-        <w:jc w:val="center"/>
-      </w:pPr>
-      <w:r>
-        <w:rPr>
-          <w:rFonts w:ascii="Georgia" w:hAnsi="Georgia" w:eastAsia="Georgia"/>
-          <w:b w:val="0"/>
-          <w:i w:val="0"/>
-          <w:sz w:val="24"/>
-        </w:rPr>
-        <w:t>Pampanga State Agricultural University</w:t>
-      </w:r>
-    </w:p>
-    <w:p>
-      <w:pPr>
-        <w:spacing w:after="0" w:line="240" w:lineRule="auto"/>
-        <w:jc w:val="center"/>
-      </w:pPr>
-      <w:r>
-        <w:rPr>
-          <w:rFonts w:ascii="Georgia" w:hAnsi="Georgia" w:eastAsia="Georgia"/>
-          <w:b w:val="0"/>
-          <w:i w:val="0"/>
-          <w:sz w:val="24"/>
-        </w:rPr>
-        <w:t>Magalang, Pampanga</w:t>
-      </w:r>
-    </w:p>
-    <w:p>
-      <w:pPr>
-        <w:spacing w:before="0" w:after="0" w:line="240" w:lineRule="auto"/>
-      </w:pPr>
-      <w:r>
-        <w:rPr>
-          <w:rFonts w:ascii="Georgia" w:hAnsi="Georgia" w:eastAsia="Georgia"/>
-          <w:b w:val="0"/>
-          <w:i w:val="0"/>
-          <w:sz w:val="22"/>
-        </w:rPr>
-      </w:r>
-    </w:p>
-    <w:p>
-      <w:pPr>
-        <w:spacing w:before="0" w:after="0" w:line="240" w:lineRule="auto"/>
-      </w:pPr>
-      <w:r>
-        <w:rPr>
-          <w:rFonts w:ascii="Georgia" w:hAnsi="Georgia" w:eastAsia="Georgia"/>
-          <w:b w:val="0"/>
-          <w:i w:val="0"/>
-          <w:sz w:val="22"/>
-        </w:rPr>
-      </w:r>
-    </w:p>
-    <w:p>
-      <w:pPr>
-        <w:spacing w:after="0" w:line="240" w:lineRule="auto"/>
-        <w:jc w:val="center"/>
-      </w:pPr>
-      <w:r>
-        <w:rPr>
-          <w:rFonts w:ascii="Georgia" w:hAnsi="Georgia" w:eastAsia="Georgia"/>
-          <w:b w:val="0"/>
-          <w:i w:val="0"/>
-          <w:sz w:val="24"/>
-        </w:rPr>
-        <w:t>In Partial Fulfillment</w:t>
-      </w:r>
-    </w:p>
-    <w:p>
-      <w:pPr>
-        <w:spacing w:after="0" w:line="240" w:lineRule="auto"/>
-        <w:jc w:val="center"/>
-      </w:pPr>
-      <w:r>
-        <w:rPr>
-          <w:rFonts w:ascii="Georgia" w:hAnsi="Georgia" w:eastAsia="Georgia"/>
-          <w:b w:val="0"/>
-          <w:i w:val="0"/>
-          <w:sz w:val="24"/>
-        </w:rPr>
-        <w:t>of the Requirements for the Degree</w:t>
-      </w:r>
-    </w:p>
-    <w:p>
-      <w:pPr>
-        <w:spacing w:after="0" w:line="240" w:lineRule="auto"/>
-        <w:jc w:val="center"/>
-      </w:pPr>
-      <w:r>
-        <w:rPr>
-          <w:rFonts w:ascii="Georgia" w:hAnsi="Georgia" w:eastAsia="Georgia"/>
-          <w:b w:val="0"/>
-          <w:i w:val="0"/>
-          <w:sz w:val="24"/>
-        </w:rPr>
-        <w:t>BACHELOR OF ARTS IN ENGLISH LANGUAGE STUDIES</w:t>
-      </w:r>
-    </w:p>
-    <w:p>
-      <w:pPr>
-        <w:spacing w:before="0" w:after="0" w:line="240" w:lineRule="auto"/>
-      </w:pPr>
-      <w:r>
-        <w:rPr>
-          <w:rFonts w:ascii="Georgia" w:hAnsi="Georgia" w:eastAsia="Georgia"/>
-          <w:b w:val="0"/>
-          <w:i w:val="0"/>
-          <w:sz w:val="22"/>
-        </w:rPr>
-      </w:r>
-    </w:p>
-    <w:p>
-      <w:pPr>
-        <w:spacing w:before="0" w:after="0" w:line="240" w:lineRule="auto"/>
-      </w:pPr>
-      <w:r>
-        <w:rPr>
-          <w:rFonts w:ascii="Georgia" w:hAnsi="Georgia" w:eastAsia="Georgia"/>
-          <w:b w:val="0"/>
-          <w:i w:val="0"/>
-          <w:sz w:val="22"/>
-        </w:rPr>
-      </w:r>
-    </w:p>
-    <w:p/>
-    <w:p/>
-    <w:p/>
-    <w:p>
-      <w:pPr>
-        <w:spacing w:after="0" w:line="240" w:lineRule="auto"/>
-        <w:jc w:val="center"/>
-      </w:pPr>
-      <w:r>
-        <w:rPr>
-          <w:rFonts w:ascii="Georgia" w:hAnsi="Georgia" w:eastAsia="Georgia"/>
-          <w:b w:val="0"/>
-          <w:i w:val="0"/>
-          <w:sz w:val="24"/>
-        </w:rPr>
-        <w:t>By</w:t>
-      </w:r>
-    </w:p>
-    <w:p>
-      <w:pPr>
-        <w:spacing w:before="0" w:after="0" w:line="240" w:lineRule="auto"/>
-      </w:pPr>
-      <w:r>
-        <w:rPr>
-          <w:rFonts w:ascii="Georgia" w:hAnsi="Georgia" w:eastAsia="Georgia"/>
-          <w:b w:val="0"/>
-          <w:i w:val="0"/>
-          <w:sz w:val="22"/>
-        </w:rPr>
-      </w:r>
-    </w:p>
-    <w:p>
-      <w:pPr>
-        <w:spacing w:before="0" w:after="0" w:line="240" w:lineRule="auto"/>
-      </w:pPr>
-      <w:r>
-        <w:rPr>
-          <w:rFonts w:ascii="Georgia" w:hAnsi="Georgia" w:eastAsia="Georgia"/>
-          <w:b w:val="0"/>
-          <w:i w:val="0"/>
-          <w:sz w:val="22"/>
-        </w:rPr>
-      </w:r>
-    </w:p>
-    <w:p/>
-    <w:p/>
-    <w:p/>
-    <w:p/>
-    <w:p/>
-    <w:p/>
-    <w:p/>
     <w:p/>
     <w:p>
       <w:pPr>
@@ -433,6 +419,9 @@
         <w:t>BACKGROUND OF THE STUDY</w:t>
       </w:r>
     </w:p>
+    <w:p/>
+    <w:p/>
+    <w:p/>
     <w:p>
       <w:pPr>
         <w:spacing w:line="480" w:lineRule="auto" w:before="0" w:after="0"/>
@@ -497,6 +486,9 @@
         <w:t xml:space="preserve">This study examines undergraduate thesis abstracts from three programs at Pampanga State Agricultural University (PSAU): Agriculture, Veterinary Medicine, and Biology. These fields share an institutional context but differ in how they typically handle evidence. Agricultural research often involves field conditions outside the researcher’s control. Biological studies frequently take place under controlled laboratory conditions. Veterinary medicine manages clinical variables tied to individual patient outcomes. The boundaries are not absolute—agricultural work can be lab-based, biology can be field-based—but the different epistemic orientations may still shape hedging. If disciplinary norms appear at the undergraduate level, they should show up here. If they do not, the shared pattern is equally informative for instruction.</w:t>
       </w:r>
     </w:p>
+    <w:p/>
+    <w:p/>
+    <w:p/>
     <w:p>
       <w:pPr>
         <w:keepNext/>
@@ -514,6 +506,9 @@
         <w:t>Hedging in Undergraduate Writing</w:t>
       </w:r>
     </w:p>
+    <w:p/>
+    <w:p/>
+    <w:p/>
     <w:p>
       <w:pPr>
         <w:spacing w:line="480" w:lineRule="auto" w:before="0" w:after="0"/>
@@ -546,6 +541,9 @@
         <w:t xml:space="preserve">These studies leave two gaps for the present work. Only Khunasathitchai et al. examined abstracts specifically; the others analyzed discussion sections or full papers, where rhetorical space is wider. None is set in a Philippine L2 context.</w:t>
       </w:r>
     </w:p>
+    <w:p/>
+    <w:p/>
+    <w:p/>
     <w:p>
       <w:pPr>
         <w:keepNext/>
@@ -563,6 +561,9 @@
         <w:t>Disciplinary Variation in Scientific and Medical Writing</w:t>
       </w:r>
     </w:p>
+    <w:p/>
+    <w:p/>
+    <w:p/>
     <w:p>
       <w:pPr>
         <w:spacing w:line="480" w:lineRule="auto" w:before="0" w:after="0"/>
@@ -595,6 +596,9 @@
         <w:t xml:space="preserve">These findings are not necessarily contradictory. Afshar et al. and Mohammed compare different disciplinary pairings and use different hedge taxonomies—Afshar the full Salager-Meyer (1994) scheme, Mohammed a lexical-hedge focus—so the contrast is evidence that hedging density tracks specific epistemic demands rather than a single hard/soft axis. Salager-Meyer (1994) frames hedging as claim-responsibility management: writers distribute responsibility for a claim’s truth, accuracy, or applicability among themselves, their data, and external conditions. That framing predicts that Agriculture, Veterinary Medicine, and Biology may produce distinct patterns not because one field is “harder,” but because each requires writers to manage different kinds of responsibility.</w:t>
       </w:r>
     </w:p>
+    <w:p/>
+    <w:p/>
+    <w:p/>
     <w:p>
       <w:pPr>
         <w:keepNext/>
@@ -612,6 +616,9 @@
         <w:t>Hedging in L2 and EFL Contexts</w:t>
       </w:r>
     </w:p>
+    <w:p/>
+    <w:p/>
+    <w:p/>
     <w:p>
       <w:pPr>
         <w:spacing w:line="480" w:lineRule="auto" w:before="0" w:after="0"/>
@@ -644,6 +651,9 @@
         <w:t xml:space="preserve">Because this study does not measure English proficiency independently, observed patterns may reflect L2 constraints, disciplinary socialization, or both. The aim is a descriptive baseline, not a causal account.</w:t>
       </w:r>
     </w:p>
+    <w:p/>
+    <w:p/>
+    <w:p/>
     <w:p>
       <w:pPr>
         <w:keepNext/>
@@ -661,6 +671,9 @@
         <w:t>Hedging in Philippine Academic Writing Contexts</w:t>
       </w:r>
     </w:p>
+    <w:p/>
+    <w:p/>
+    <w:p/>
     <w:p>
       <w:pPr>
         <w:spacing w:line="480" w:lineRule="auto" w:before="0" w:after="0"/>
@@ -677,6 +690,9 @@
         <w:t xml:space="preserve">Philippine and regional findings align with this picture. Ningrum, Puspita, and Mulyadi (2024), using the ICNALE learner corpus across ten ASEAN contexts including the Philippines, found a preference for boosters over hedges, with overuse of forms such as completely, really, and always. Escalona (2025) examined essays by AB-English and BS-Information Technology students at Bukidnon State University. Major-field differences were not statistically significant, though descriptive patterns showed IT students using slightly more hedges and English majors slightly more boosters. Lopez et al. (2025) analyzed 50 argumentative essays by English Language Studies majors at a northern Philippine state university and found developing-stage proficiency with epistemic modal verbs most frequent across levels. Villanueva (2014) documented hedging in Philippine newspaper editorials as a means of managing accountability in politically sensitive claims—different genre, same point that hedging is context-sensitive.</w:t>
       </w:r>
     </w:p>
+    <w:p/>
+    <w:p/>
+    <w:p/>
     <w:p>
       <w:pPr>
         <w:keepNext/>
@@ -694,6 +710,9 @@
         <w:t>Disciplinary Variation in Abstracts and Undergraduate Theses</w:t>
       </w:r>
     </w:p>
+    <w:p/>
+    <w:p/>
+    <w:p/>
     <w:p>
       <w:pPr>
         <w:spacing w:line="480" w:lineRule="auto" w:before="0" w:after="0"/>
@@ -758,6 +777,9 @@
         <w:t xml:space="preserve">No published study identified in this review has examined hedging in undergraduate thesis abstracts from applied science disciplines in a Philippine L2 context. This study addresses that intersection at PSAU by mapping hedging patterns across three applied life sciences programs that share an institution but differ in their relationship to evidence.</w:t>
       </w:r>
     </w:p>
+    <w:p/>
+    <w:p/>
+    <w:p/>
     <w:p>
       <w:pPr>
         <w:keepNext/>
@@ -775,6 +797,9 @@
         <w:t>STATEMENT OF THE PROBLEM</w:t>
       </w:r>
     </w:p>
+    <w:p/>
+    <w:p/>
+    <w:p/>
     <w:p>
       <w:pPr>
         <w:spacing w:line="480" w:lineRule="auto" w:before="0" w:after="0"/>
@@ -867,6 +892,9 @@
         <w:t>4. What do the frequency and functional patterns suggest about the construction of epistemic stance through hedging among developing researchers?</w:t>
       </w:r>
     </w:p>
+    <w:p/>
+    <w:p/>
+    <w:p/>
     <w:p>
       <w:pPr>
         <w:keepNext/>
@@ -884,6 +912,9 @@
         <w:t>RESEARCH FRAMEWORK</w:t>
       </w:r>
     </w:p>
+    <w:p/>
+    <w:p/>
+    <w:p/>
     <w:p>
       <w:pPr>
         <w:spacing w:line="480" w:lineRule="auto" w:before="0" w:after="0"/>
@@ -1018,6 +1049,9 @@
         </w:drawing>
       </w:r>
     </w:p>
+    <w:p/>
+    <w:p/>
+    <w:p/>
     <w:p>
       <w:pPr>
         <w:keepNext/>
@@ -1035,6 +1069,9 @@
         <w:t>SIGNIFICANCE OF THE STUDY</w:t>
       </w:r>
     </w:p>
+    <w:p/>
+    <w:p/>
+    <w:p/>
     <w:p>
       <w:pPr>
         <w:spacing w:line="480" w:lineRule="auto" w:before="0" w:after="0"/>
@@ -1126,6 +1163,9 @@
         <w:t/>
       </w:r>
     </w:p>
+    <w:p/>
+    <w:p/>
+    <w:p/>
     <w:p>
       <w:pPr>
         <w:keepNext/>
@@ -1143,6 +1183,9 @@
         <w:t>SCOPE AND LIMITATIONS</w:t>
       </w:r>
     </w:p>
+    <w:p/>
+    <w:p/>
+    <w:p/>
     <w:p>
       <w:pPr>
         <w:spacing w:line="480" w:lineRule="auto" w:before="0" w:after="0"/>
@@ -1243,6 +1286,9 @@
         <w:t>Crucially, this study analyzes the archived thesis abstract as a ratified textual product rather than a measure of individual cognition. Undergraduate theses are heavily supervised, and abstracts are often the product of multiple revisions guided by advisers. Consequently, observed hedging patterns do not solely reflect the independent rhetorical choices or internalized norms of developing researchers; rather, they reflect the standards of the disciplinary community as enforced by faculty advisers. Therefore, while the study investigates patterns within texts produced by developing researchers, its claims are limited to the epistemic stance constructed in the final abstracts and the departmental standards they represent, rather than the internal cognitive processes of the writers themselves. The findings are strictly descriptive of the observed patterns within the PSAU context.</w:t>
       </w:r>
     </w:p>
+    <w:p/>
+    <w:p/>
+    <w:p/>
     <w:p>
       <w:pPr>
         <w:keepNext/>
@@ -1260,6 +1306,9 @@
         <w:t>DEFINITION OF TERMS</w:t>
       </w:r>
     </w:p>
+    <w:p/>
+    <w:p/>
+    <w:p/>
     <w:p>
       <w:pPr>
         <w:spacing w:line="480" w:lineRule="auto" w:before="0" w:after="0"/>
@@ -1688,6 +1737,9 @@
         <w:t>This chapter describes the research design, institutional context, data collection process, and corpus selection for the study. Each methodological decision was justified by the nature of the research questions and the practical constraints of an undergraduate thesis.</w:t>
       </w:r>
     </w:p>
+    <w:p/>
+    <w:p/>
+    <w:p/>
     <w:p>
       <w:pPr>
         <w:keepNext/>
@@ -1705,6 +1757,9 @@
         <w:t>RESEARCH CONTEXT</w:t>
       </w:r>
     </w:p>
+    <w:p/>
+    <w:p/>
+    <w:p/>
     <w:p>
       <w:pPr>
         <w:spacing w:line="480" w:lineRule="auto" w:before="0" w:after="0"/>
@@ -1753,6 +1808,9 @@
         <w:t>The PSAU thesis guidelines prescribed standard formatting but did not impose a rigid rhetorical template for abstracts. This allowed for disciplinary and individual variation in linguistic choices, ensuring that observed hedging patterns reflected negotiated textual choices rather than rigid institutional constraints.</w:t>
       </w:r>
     </w:p>
+    <w:p/>
+    <w:p/>
+    <w:p/>
     <w:p>
       <w:pPr>
         <w:keepNext/>
@@ -1770,6 +1828,9 @@
         <w:t>RESEARCH DESIGN</w:t>
       </w:r>
     </w:p>
+    <w:p/>
+    <w:p/>
+    <w:p/>
     <w:p>
       <w:pPr>
         <w:spacing w:line="480" w:lineRule="auto" w:before="0" w:after="0"/>
@@ -1786,6 +1847,9 @@
         <w:t>This study employed a descriptive mixed-methods design combining quantitative frequency analysis with qualitative functional interpretation (Biber et al., 1998). The quantitative layer identified hedging type and distribution patterns through frequency counts normalized per 100 words. This enabled cross-disciplinary comparison on a common scale. The qualitative layer involved functional coding using Hyland’s (1998) framework to assign rhetorical purposes to the identified hedges. The interpretation of disciplinary patterns was then informed by two theoretical lenses. These are Salager-Meyer’s (1994) concept of claim-responsibility and Hyland’s (2005) model of stance and engagement. All coding was conducted manually using Google Sheets. This prioritized researcher judgment over automated processing for functional coding decisions, since automated tools cannot reliably assign hedge function from context, which was central to this study’s research questions.</w:t>
       </w:r>
     </w:p>
+    <w:p/>
+    <w:p/>
+    <w:p/>
     <w:p>
       <w:pPr>
         <w:keepNext/>
@@ -1803,6 +1867,9 @@
         <w:t>RESEARCH PROCESS</w:t>
       </w:r>
     </w:p>
+    <w:p/>
+    <w:p/>
+    <w:p/>
     <w:p>
       <w:pPr>
         <w:spacing w:line="480" w:lineRule="auto" w:before="0" w:after="0"/>
@@ -1969,6 +2036,9 @@
         <w:t>Permission and library access: 1 week. Corpus construction and on-site photography: 3 weeks. OCR verification and text preparation: 2 weeks. Pilot testing and coding finalization: 2 weeks. Full coding and frequency analysis: 8 weeks (approximately 10 hours per week). Writing and revision: 8 weeks. Total timeframe: approximately 5.5 months (24 weeks).</w:t>
       </w:r>
     </w:p>
+    <w:p/>
+    <w:p/>
+    <w:p/>
     <w:p>
       <w:pPr>
         <w:keepNext/>
@@ -1986,6 +2056,9 @@
         <w:t>CODING REVISIONS AND BORDERLINE CASES</w:t>
       </w:r>
     </w:p>
+    <w:p/>
+    <w:p/>
+    <w:p/>
     <w:p>
       <w:pPr>
         <w:spacing w:line="480" w:lineRule="auto" w:before="0" w:after="0"/>
@@ -2002,6 +2075,9 @@
         <w:t>Following an initial coding pass, borderline tokens were re-examined using the contextual decision rules in Appendix A. Particular attention was given to potentially ambiguous forms such as can, potential, indicating, and possibility, because these forms may function either as epistemic hedges or as non-epistemic lexical items depending on context. Four rule refinements were applied during this revision pass. First, “can” combined with an active content verb describing a treatment effect (enhance, promote, reduce, help) was classified as capability (FP-Cap) regardless of whether it appeared inside a “suggests that” clause, because the Working Test showed that removing “can” alone did not change the epistemic weight of the clause when “suggests” was already carrying the hedge. Second, the “indicating” tautology test was extended beyond numeric restatement to cover field-standard interpretive thresholds: “non-toxic” from no mortality observed, “limited benefits” from poor performance, and “superior feed efficiency” from lower feed conversion ratio were all reclassified as operational restatements (FP-Gen) rather than inferential hedges. Third, the “potential + noun” topic-naming rule was extended to “possibility + noun” in aim and methods sentences. Fourth, a multi-hedge Working Test rule was added: when a sentence contains multiple hedge-like tokens, each token is tested individually in isolation, ignoring the other hedges in the sentence; a token counts only if removing it alone changes the epistemic weight of its own clause. The final corpus therefore reflects contextual rather than purely lexical classification, and the 63 rejected candidates document the decision trail for tokens that were considered but ultimately excluded. Additionally, the outlier abstract Acs2 was found to use a repeated hedging template (“This suggests that while X might not have been Y, Z could still [verb] beneficial effects”) twice with light variation, inflating its own token count through formulaic repetition rather than independent hedging decisions.</w:t>
       </w:r>
     </w:p>
+    <w:p/>
+    <w:p/>
+    <w:p/>
     <w:p>
       <w:pPr>
         <w:keepNext/>
@@ -2019,6 +2095,9 @@
         <w:t>RESEARCH CORPUS</w:t>
       </w:r>
     </w:p>
+    <w:p/>
+    <w:p/>
+    <w:p/>
     <w:p>
       <w:pPr>
         <w:spacing w:line="480" w:lineRule="auto" w:before="0" w:after="0"/>
@@ -3008,6 +3087,9 @@
         <w:t>This chapter presents the results, analysis, and discussion of the hedging patterns identified in the 60 undergraduate thesis abstracts across Agriculture, Veterinary Medicine, and Biology at Pampanga State Agricultural University. The chapter is organized into four parts, each corresponding to a research question. Part I presents the types of hedging devices found across the three disciplines. Part II examines how hedge frequency varies across Agriculture, Veterinary Medicine, and Biology. Part III identifies the rhetorical functions served by the hedging devices. Part IV discusses what the frequency and functional patterns suggest about the discipline-specific hedging profile of developing researchers.</w:t>
       </w:r>
     </w:p>
+    <w:p/>
+    <w:p/>
+    <w:p/>
     <w:p>
       <w:pPr>
         <w:keepNext/>
@@ -3025,6 +3107,9 @@
         <w:t>PART I: HEDGE TYPES ACROSS THE THREE DISCIPLINES</w:t>
       </w:r>
     </w:p>
+    <w:p/>
+    <w:p/>
+    <w:p/>
     <w:p>
       <w:pPr>
         <w:spacing w:line="480" w:lineRule="auto" w:before="0" w:after="0"/>
@@ -4342,6 +4427,9 @@
         <w:t>Booster analysis of the 28 zero-hedge abstracts revealed 88 booster tokens, averaging approximately 3.1 boosters per abstract. The most frequent boosters were showed (18 instances), revealed (13), observed (12), and highest (12). This density of assertive markers confirms that zero-hedge abstracts do not represent neutral reporting but rather an absence of overt hedging, where findings are stated with emphatic rather than tentative language.</w:t>
       </w:r>
     </w:p>
+    <w:p/>
+    <w:p/>
+    <w:p/>
     <w:p>
       <w:pPr>
         <w:keepNext/>
@@ -4359,6 +4447,9 @@
         <w:t>PART II: HEDGE FREQUENCY ACROSS DISCIPLINES</w:t>
       </w:r>
     </w:p>
+    <w:p/>
+    <w:p/>
+    <w:p/>
     <w:p>
       <w:pPr>
         <w:spacing w:line="480" w:lineRule="auto" w:before="0" w:after="0"/>
@@ -5389,6 +5480,9 @@
         <w:t>The false positive distribution also varies by discipline. Biology produced 35 false positives, far more than Agriculture (15) or Veterinary Medicine (13). This is partly because Biology abstracts contained more instances of “potential” in aim statements and “indicated by” evidential pointers, constructions that look like hedges but do not express uncertainty about a claim. The higher false positive count in Biology does not necessarily mean Biology writers hedge more. It means they use more hedge-like vocabulary in non-hedging functions.</w:t>
       </w:r>
     </w:p>
+    <w:p/>
+    <w:p/>
+    <w:p/>
     <w:p>
       <w:pPr>
         <w:keepNext/>
@@ -5406,6 +5500,9 @@
         <w:t>PART III: RHETORICAL FUNCTIONS OF HEDGING DEVICES</w:t>
       </w:r>
     </w:p>
+    <w:p/>
+    <w:p/>
+    <w:p/>
     <w:p>
       <w:pPr>
         <w:spacing w:line="480" w:lineRule="auto" w:before="0" w:after="0"/>
@@ -5872,6 +5969,9 @@
         <w:t>The relationship between hedge type and function further illuminates the patterns. Modal verbs (21 instances, all EC) were used almost exclusively to express possibility about results or implications, as in “the biosynthesis... may affect the overall development.” Lexical hedges (36 instances, all EC) were used to qualify the strength of findings, as in “results suggest that fermented banana peel... can significantly enhance growth.” The convergence of all hedge types on a single function reinforces the interpretation that these writers view hedging primarily as a tool for managing factual certainty, not for managing social or textual relationships.</w:t>
       </w:r>
     </w:p>
+    <w:p/>
+    <w:p/>
+    <w:p/>
     <w:p>
       <w:pPr>
         <w:keepNext/>
@@ -5889,6 +5989,9 @@
         <w:t>PART IV: DISCIPLINE-SPECIFIC HEDGING PROFILES</w:t>
       </w:r>
     </w:p>
+    <w:p/>
+    <w:p/>
+    <w:p/>
     <w:p>
       <w:pPr>
         <w:spacing w:line="480" w:lineRule="auto" w:before="0" w:after="0"/>
@@ -6020,7 +6123,6 @@
         </w:rPr>
       </w:r>
     </w:p>
-    <w:p/>
     <w:p/>
     <w:p>
       <w:pPr>
@@ -6053,6 +6155,8 @@
         </w:rPr>
       </w:r>
     </w:p>
+    <w:p/>
+    <w:p/>
     <w:p>
       <w:pPr>
         <w:spacing w:line="480" w:lineRule="auto" w:before="0" w:after="0"/>
@@ -6069,6 +6173,9 @@
         <w:t xml:space="preserve">This study mapped hedging in 60 undergraduate thesis abstracts across Agriculture, Veterinary Medicine, and Biology at PSAU.</w:t>
       </w:r>
     </w:p>
+    <w:p/>
+    <w:p/>
+    <w:p/>
     <w:p>
       <w:pPr>
         <w:keepNext/>
@@ -6086,6 +6193,9 @@
         <w:t>CONCLUSIONS</w:t>
       </w:r>
     </w:p>
+    <w:p/>
+    <w:p/>
+    <w:p/>
     <w:p>
       <w:pPr>
         <w:spacing w:line="480" w:lineRule="auto" w:before="0" w:after="0"/>
@@ -6118,6 +6228,9 @@
         <w:t>Disciplinary differentiation is present but uneven. Veterinary Medicine’s sparse, assertive profile is the clearest contrast. Agriculture’s edge over Biology is modest and outlier-sensitive. The patterns are consistent with field-specific epistemic demands (Salager-Meyer, 1994) among developing writers, but statistical evidence is borderline (Kruskal-Wallis p ≈ .052) and the sample is small. The study provides a local baseline, not a general law.</w:t>
       </w:r>
     </w:p>
+    <w:p/>
+    <w:p/>
+    <w:p/>
     <w:p>
       <w:pPr>
         <w:keepNext/>
@@ -6135,6 +6248,9 @@
         <w:t>RECOMMENDATIONS</w:t>
       </w:r>
     </w:p>
+    <w:p/>
+    <w:p/>
+    <w:p/>
     <w:p>
       <w:pPr>
         <w:spacing w:line="480" w:lineRule="auto" w:before="0" w:after="0"/>
@@ -6288,6 +6404,8 @@
         </w:rPr>
       </w:r>
     </w:p>
+    <w:p/>
+    <w:p/>
     <w:p>
       <w:pPr>
         <w:spacing w:line="480" w:lineRule="auto" w:before="0" w:after="0"/>
@@ -6994,6 +7112,9 @@
         <w:t>APPENDIX A: HEDGING CODEBOOK</w:t>
       </w:r>
     </w:p>
+    <w:p/>
+    <w:p/>
+    <w:p/>
     <w:p>
       <w:pPr>
         <w:spacing w:before="0" w:after="120" w:line="240" w:lineRule="auto"/>
@@ -7016,6 +7137,9 @@
         <w:t>This appendix is the full coding protocol used for the study. It opens with a one-page quick-reference, then gives the operational layers, decision rules, false-positive categories, and recording conventions.</w:t>
       </w:r>
     </w:p>
+    <w:p/>
+    <w:p/>
+    <w:p/>
     <w:p>
       <w:pPr>
         <w:spacing w:line="240" w:lineRule="auto" w:before="240" w:after="120"/>
@@ -7039,6 +7163,9 @@
         <w:t>QUICK-REFERENCE</w:t>
       </w:r>
     </w:p>
+    <w:p/>
+    <w:p/>
+    <w:p/>
     <w:p>
       <w:pPr>
         <w:keepNext/>
@@ -7491,6 +7618,9 @@
         <w:t>Ability, future procedure, and necessity (must / should in procedural contexts) are never hedges. Working Test: if removing the device does not change how certain or tentative the claim is, it is not a hedge.</w:t>
       </w:r>
     </w:p>
+    <w:p/>
+    <w:p/>
+    <w:p/>
     <w:p>
       <w:pPr>
         <w:spacing w:before="320" w:after="160" w:line="240" w:lineRule="auto"/>
@@ -7526,6 +7656,8 @@
         </w:rPr>
       </w:r>
     </w:p>
+    <w:p/>
+    <w:p/>
     <w:p>
       <w:pPr>
         <w:keepNext/>
@@ -7566,6 +7698,9 @@
         <w:t>This codebook turns Hyland’s (1998) framework into a practical coding scheme for the PSAU undergraduate thesis abstract corpus. Highlights are background colors applied by hand or digital highlighter on printed or PDF copies. They are not font colors and are not software-dependent. The marked hard copy is the primary record; any spreadsheet is only a derived tally.</w:t>
       </w:r>
     </w:p>
+    <w:p/>
+    <w:p/>
+    <w:p/>
     <w:p>
       <w:pPr>
         <w:keepNext/>
@@ -7583,6 +7718,9 @@
         <w:t>WORKING TEST</w:t>
       </w:r>
     </w:p>
+    <w:p/>
+    <w:p/>
+    <w:p/>
     <w:p>
       <w:pPr>
         <w:spacing w:line="240" w:lineRule="auto" w:before="0" w:after="120"/>
@@ -7709,6 +7847,9 @@
         <w:t>Coding order: read the sentence in full, check Decision Rules, apply the Working Test if unresolved, and log any case that still can’t be resolved in Coder Notes rather than guessing.</w:t>
       </w:r>
     </w:p>
+    <w:p/>
+    <w:p/>
+    <w:p/>
     <w:p>
       <w:pPr>
         <w:keepNext/>
@@ -7726,6 +7867,9 @@
         <w:t>LAYER 1: HEDGE TYPE (PRIMARY COLORS)</w:t>
       </w:r>
     </w:p>
+    <w:p/>
+    <w:p/>
+    <w:p/>
     <w:p>
       <w:pPr>
         <w:spacing w:line="240" w:lineRule="auto" w:before="0" w:after="120"/>
@@ -8537,6 +8681,9 @@
         <w:t>Stricter rule for “potential + noun” constructions: if the phrase sits in an introduction/rationale sentence (motivating why the topic matters, before any data is presented), treat as topic-naming (FP-Gen) regardless of the verb used. If it sits in a results/conclusion sentence qualifying a claim about findings, treat as a Lexical hedge (EC). The distinction is structural position, not verb choice.</w:t>
       </w:r>
     </w:p>
+    <w:p/>
+    <w:p/>
+    <w:p/>
     <w:p>
       <w:pPr>
         <w:keepNext/>
@@ -8554,6 +8701,9 @@
         <w:t>LAYER 2: HEDGE FUNCTION (COLORED TEXT LABELS)</w:t>
       </w:r>
     </w:p>
+    <w:p/>
+    <w:p/>
+    <w:p/>
     <w:p>
       <w:pPr>
         <w:spacing w:line="240" w:lineRule="auto" w:before="0" w:after="120"/>
@@ -9100,6 +9250,9 @@
         </w:tc>
       </w:tr>
     </w:tbl>
+    <w:p/>
+    <w:p/>
+    <w:p/>
     <w:p>
       <w:pPr>
         <w:keepNext/>
@@ -9117,6 +9270,9 @@
         <w:t>DECISION RULES FOR AMBIGUOUS CASES</w:t>
       </w:r>
     </w:p>
+    <w:p/>
+    <w:p/>
+    <w:p/>
     <w:p>
       <w:pPr>
         <w:spacing w:line="240" w:lineRule="auto" w:before="0" w:after="120"/>
@@ -9862,6 +10018,9 @@
         <w:t>: “Might this be true?” = hedge. “Should this be done?” = FP-Rec.</w:t>
       </w:r>
     </w:p>
+    <w:p/>
+    <w:p/>
+    <w:p/>
     <w:p>
       <w:pPr>
         <w:keepNext/>
@@ -9879,6 +10038,9 @@
         <w:t>MARKING FALSE POSITIVES</w:t>
       </w:r>
     </w:p>
+    <w:p/>
+    <w:p/>
+    <w:p/>
     <w:p>
       <w:pPr>
         <w:spacing w:line="240" w:lineRule="auto" w:before="0" w:after="120"/>
@@ -10458,6 +10620,9 @@
         </w:tc>
       </w:tr>
     </w:tbl>
+    <w:p/>
+    <w:p/>
+    <w:p/>
     <w:p>
       <w:pPr>
         <w:keepNext/>
@@ -10475,6 +10640,9 @@
         <w:t>LAYER 3 (OPTIONAL): UNHEDGED ASSERTION SITES (NEUTRAL GREY)</w:t>
       </w:r>
     </w:p>
+    <w:p/>
+    <w:p/>
+    <w:p/>
     <w:p>
       <w:pPr>
         <w:spacing w:line="240" w:lineRule="auto" w:before="0" w:after="120"/>
@@ -10999,6 +11167,9 @@
         </w:tc>
       </w:tr>
     </w:tbl>
+    <w:p/>
+    <w:p/>
+    <w:p/>
     <w:p>
       <w:pPr>
         <w:keepNext/>
@@ -11016,6 +11187,9 @@
         <w:t>QUICK-REFERENCE LEGEND</w:t>
       </w:r>
     </w:p>
+    <w:p/>
+    <w:p/>
+    <w:p/>
     <w:p>
       <w:pPr>
         <w:spacing w:line="240" w:lineRule="auto" w:before="0" w:after="120"/>
@@ -11405,6 +11579,9 @@
         </w:tc>
       </w:tr>
     </w:tbl>
+    <w:p/>
+    <w:p/>
+    <w:p/>
     <w:p>
       <w:pPr>
         <w:keepNext/>
@@ -11422,6 +11599,9 @@
         <w:t>COMBINED EXAMPLE</w:t>
       </w:r>
     </w:p>
+    <w:p/>
+    <w:p/>
+    <w:p/>
     <w:p>
       <w:pPr>
         <w:spacing w:line="240" w:lineRule="auto" w:before="0" w:after="120"/>
@@ -11628,6 +11808,9 @@
         <w:t>Blue and red highlights mark type. Orange text marks function. The strikethrough marks a rejected candidate. Grey highlight marks an unhedged site. Here, “potential” is struck because it names a research property, not a hedge on the claim.</w:t>
       </w:r>
     </w:p>
+    <w:p/>
+    <w:p/>
+    <w:p/>
     <w:p>
       <w:pPr>
         <w:keepNext/>
@@ -11645,6 +11828,9 @@
         <w:t>CODING SHEET COLUMNS</w:t>
       </w:r>
     </w:p>
+    <w:p/>
+    <w:p/>
+    <w:p/>
     <w:p>
       <w:pPr>
         <w:spacing w:line="240" w:lineRule="auto" w:before="0" w:after="120"/>
@@ -12111,6 +12297,9 @@
         <w:t>Layer 3 data, tracked separately so it never inflates RQ2 counts.</w:t>
       </w:r>
     </w:p>
+    <w:p/>
+    <w:p/>
+    <w:p/>
     <w:p>
       <w:pPr>
         <w:keepNext/>
@@ -12439,6 +12628,9 @@
         </w:tc>
       </w:tr>
     </w:tbl>
+    <w:p/>
+    <w:p/>
+    <w:p/>
     <w:p>
       <w:pPr>
         <w:keepNext/>
@@ -12456,6 +12648,9 @@
         <w:t>Optional Tab: Rejected Hedge Candidates</w:t>
       </w:r>
     </w:p>
+    <w:p/>
+    <w:p/>
+    <w:p/>
     <w:p>
       <w:pPr>
         <w:spacing w:line="240" w:lineRule="auto" w:before="0" w:after="120"/>
@@ -12815,6 +13010,8 @@
         </w:rPr>
       </w:r>
     </w:p>
+    <w:p/>
+    <w:p/>
     <w:p>
       <w:pPr>
         <w:spacing w:line="240" w:lineRule="auto" w:before="0" w:after="120"/>
@@ -12944,6 +13141,9 @@
         <w:t>“The result showed negative results that led to the conclusion that all shrimp farms were free…”</w:t>
       </w:r>
     </w:p>
+    <w:p/>
+    <w:p/>
+    <w:p/>
     <w:p>
       <w:pPr>
         <w:keepNext/>
@@ -12961,6 +13161,9 @@
         <w:t>Sample 2: Veterinary Medicine</w:t>
       </w:r>
     </w:p>
+    <w:p/>
+    <w:p/>
+    <w:p/>
     <w:p>
       <w:pPr>
         <w:spacing w:line="480" w:lineRule="auto" w:before="0" w:after="0"/>
@@ -13080,6 +13283,9 @@
         <w:t>“approximately two and one-half” (Procedural measurement, not epistemic).</w:t>
       </w:r>
     </w:p>
+    <w:p/>
+    <w:p/>
+    <w:p/>
     <w:p>
       <w:pPr>
         <w:keepNext/>
@@ -13097,6 +13303,9 @@
         <w:t>Sample 3: Agriculture (Animal Science)</w:t>
       </w:r>
     </w:p>
+    <w:p/>
+    <w:p/>
+    <w:p/>
     <w:p>
       <w:pPr>
         <w:spacing w:line="480" w:lineRule="auto" w:before="0" w:after="0"/>
@@ -13186,6 +13395,9 @@
         <w:t>“Results of the study showed that Comparison on Curing Methods…”</w:t>
       </w:r>
     </w:p>
+    <w:p/>
+    <w:p/>
+    <w:p/>
     <w:p>
       <w:pPr>
         <w:keepNext/>
@@ -13203,6 +13415,9 @@
         <w:t>Sample 4: Agriculture (Crop Science)</w:t>
       </w:r>
     </w:p>
+    <w:p/>
+    <w:p/>
+    <w:p/>
     <w:p>
       <w:pPr>
         <w:spacing w:line="480" w:lineRule="auto" w:before="0" w:after="0"/>
@@ -13388,6 +13603,8 @@
         </w:rPr>
       </w:r>
     </w:p>
+    <w:p/>
+    <w:p/>
     <w:p>
       <w:pPr>
         <w:spacing w:line="480" w:lineRule="auto" w:before="0" w:after="0"/>

</xml_diff>

<commit_message>
Draft_012 (in place): restore 10-empties title page author-name spacing (stylistic choice)
</commit_message>
<xml_diff>
--- a/thesis/003_ThesisProposal_Draft_012.docx
+++ b/thesis/003_ThesisProposal_Draft_012.docx
@@ -316,6 +316,13 @@
         </w:rPr>
       </w:r>
     </w:p>
+    <w:p/>
+    <w:p/>
+    <w:p/>
+    <w:p/>
+    <w:p/>
+    <w:p/>
+    <w:p/>
     <w:p/>
     <w:p>
       <w:pPr>

</xml_diff>

<commit_message>
Draft_012 (in place): fix subheading after-spacing — subheadings get 3 before, 0 after (body text immediately follows)
</commit_message>
<xml_diff>
--- a/thesis/003_ThesisProposal_Draft_012.docx
+++ b/thesis/003_ThesisProposal_Draft_012.docx
@@ -426,9 +426,6 @@
         <w:t>BACKGROUND OF THE STUDY</w:t>
       </w:r>
     </w:p>
-    <w:p/>
-    <w:p/>
-    <w:p/>
     <w:p>
       <w:pPr>
         <w:spacing w:line="480" w:lineRule="auto" w:before="0" w:after="0"/>
@@ -513,9 +510,6 @@
         <w:t>Hedging in Undergraduate Writing</w:t>
       </w:r>
     </w:p>
-    <w:p/>
-    <w:p/>
-    <w:p/>
     <w:p>
       <w:pPr>
         <w:spacing w:line="480" w:lineRule="auto" w:before="0" w:after="0"/>
@@ -568,9 +562,6 @@
         <w:t>Disciplinary Variation in Scientific and Medical Writing</w:t>
       </w:r>
     </w:p>
-    <w:p/>
-    <w:p/>
-    <w:p/>
     <w:p>
       <w:pPr>
         <w:spacing w:line="480" w:lineRule="auto" w:before="0" w:after="0"/>
@@ -623,9 +614,6 @@
         <w:t>Hedging in L2 and EFL Contexts</w:t>
       </w:r>
     </w:p>
-    <w:p/>
-    <w:p/>
-    <w:p/>
     <w:p>
       <w:pPr>
         <w:spacing w:line="480" w:lineRule="auto" w:before="0" w:after="0"/>
@@ -678,9 +666,6 @@
         <w:t>Hedging in Philippine Academic Writing Contexts</w:t>
       </w:r>
     </w:p>
-    <w:p/>
-    <w:p/>
-    <w:p/>
     <w:p>
       <w:pPr>
         <w:spacing w:line="480" w:lineRule="auto" w:before="0" w:after="0"/>
@@ -717,9 +702,6 @@
         <w:t>Disciplinary Variation in Abstracts and Undergraduate Theses</w:t>
       </w:r>
     </w:p>
-    <w:p/>
-    <w:p/>
-    <w:p/>
     <w:p>
       <w:pPr>
         <w:spacing w:line="480" w:lineRule="auto" w:before="0" w:after="0"/>
@@ -804,9 +786,6 @@
         <w:t>STATEMENT OF THE PROBLEM</w:t>
       </w:r>
     </w:p>
-    <w:p/>
-    <w:p/>
-    <w:p/>
     <w:p>
       <w:pPr>
         <w:spacing w:line="480" w:lineRule="auto" w:before="0" w:after="0"/>
@@ -919,9 +898,6 @@
         <w:t>RESEARCH FRAMEWORK</w:t>
       </w:r>
     </w:p>
-    <w:p/>
-    <w:p/>
-    <w:p/>
     <w:p>
       <w:pPr>
         <w:spacing w:line="480" w:lineRule="auto" w:before="0" w:after="0"/>
@@ -1076,9 +1052,6 @@
         <w:t>SIGNIFICANCE OF THE STUDY</w:t>
       </w:r>
     </w:p>
-    <w:p/>
-    <w:p/>
-    <w:p/>
     <w:p>
       <w:pPr>
         <w:spacing w:line="480" w:lineRule="auto" w:before="0" w:after="0"/>
@@ -1190,9 +1163,6 @@
         <w:t>SCOPE AND LIMITATIONS</w:t>
       </w:r>
     </w:p>
-    <w:p/>
-    <w:p/>
-    <w:p/>
     <w:p>
       <w:pPr>
         <w:spacing w:line="480" w:lineRule="auto" w:before="0" w:after="0"/>
@@ -1313,9 +1283,6 @@
         <w:t>DEFINITION OF TERMS</w:t>
       </w:r>
     </w:p>
-    <w:p/>
-    <w:p/>
-    <w:p/>
     <w:p>
       <w:pPr>
         <w:spacing w:line="480" w:lineRule="auto" w:before="0" w:after="0"/>
@@ -1764,9 +1731,6 @@
         <w:t>RESEARCH CONTEXT</w:t>
       </w:r>
     </w:p>
-    <w:p/>
-    <w:p/>
-    <w:p/>
     <w:p>
       <w:pPr>
         <w:spacing w:line="480" w:lineRule="auto" w:before="0" w:after="0"/>
@@ -1835,9 +1799,6 @@
         <w:t>RESEARCH DESIGN</w:t>
       </w:r>
     </w:p>
-    <w:p/>
-    <w:p/>
-    <w:p/>
     <w:p>
       <w:pPr>
         <w:spacing w:line="480" w:lineRule="auto" w:before="0" w:after="0"/>
@@ -1874,9 +1835,6 @@
         <w:t>RESEARCH PROCESS</w:t>
       </w:r>
     </w:p>
-    <w:p/>
-    <w:p/>
-    <w:p/>
     <w:p>
       <w:pPr>
         <w:spacing w:line="480" w:lineRule="auto" w:before="0" w:after="0"/>
@@ -2063,9 +2021,6 @@
         <w:t>CODING REVISIONS AND BORDERLINE CASES</w:t>
       </w:r>
     </w:p>
-    <w:p/>
-    <w:p/>
-    <w:p/>
     <w:p>
       <w:pPr>
         <w:spacing w:line="480" w:lineRule="auto" w:before="0" w:after="0"/>
@@ -2102,9 +2057,6 @@
         <w:t>RESEARCH CORPUS</w:t>
       </w:r>
     </w:p>
-    <w:p/>
-    <w:p/>
-    <w:p/>
     <w:p>
       <w:pPr>
         <w:spacing w:line="480" w:lineRule="auto" w:before="0" w:after="0"/>
@@ -3114,9 +3066,6 @@
         <w:t>PART I: HEDGE TYPES ACROSS THE THREE DISCIPLINES</w:t>
       </w:r>
     </w:p>
-    <w:p/>
-    <w:p/>
-    <w:p/>
     <w:p>
       <w:pPr>
         <w:spacing w:line="480" w:lineRule="auto" w:before="0" w:after="0"/>
@@ -4454,9 +4403,6 @@
         <w:t>PART II: HEDGE FREQUENCY ACROSS DISCIPLINES</w:t>
       </w:r>
     </w:p>
-    <w:p/>
-    <w:p/>
-    <w:p/>
     <w:p>
       <w:pPr>
         <w:spacing w:line="480" w:lineRule="auto" w:before="0" w:after="0"/>
@@ -5507,9 +5453,6 @@
         <w:t>PART III: RHETORICAL FUNCTIONS OF HEDGING DEVICES</w:t>
       </w:r>
     </w:p>
-    <w:p/>
-    <w:p/>
-    <w:p/>
     <w:p>
       <w:pPr>
         <w:spacing w:line="480" w:lineRule="auto" w:before="0" w:after="0"/>
@@ -5996,9 +5939,6 @@
         <w:t>PART IV: DISCIPLINE-SPECIFIC HEDGING PROFILES</w:t>
       </w:r>
     </w:p>
-    <w:p/>
-    <w:p/>
-    <w:p/>
     <w:p>
       <w:pPr>
         <w:spacing w:line="480" w:lineRule="auto" w:before="0" w:after="0"/>
@@ -6200,9 +6140,6 @@
         <w:t>CONCLUSIONS</w:t>
       </w:r>
     </w:p>
-    <w:p/>
-    <w:p/>
-    <w:p/>
     <w:p>
       <w:pPr>
         <w:spacing w:line="480" w:lineRule="auto" w:before="0" w:after="0"/>
@@ -6255,9 +6192,6 @@
         <w:t>RECOMMENDATIONS</w:t>
       </w:r>
     </w:p>
-    <w:p/>
-    <w:p/>
-    <w:p/>
     <w:p>
       <w:pPr>
         <w:spacing w:line="480" w:lineRule="auto" w:before="0" w:after="0"/>
@@ -7170,9 +7104,6 @@
         <w:t>QUICK-REFERENCE</w:t>
       </w:r>
     </w:p>
-    <w:p/>
-    <w:p/>
-    <w:p/>
     <w:p>
       <w:pPr>
         <w:keepNext/>
@@ -7652,21 +7583,6 @@
     </w:p>
     <w:p>
       <w:pPr>
-        <w:spacing w:before="0" w:after="0" w:line="240" w:lineRule="auto"/>
-      </w:pPr>
-      <w:r>
-        <w:rPr>
-          <w:rFonts w:ascii="Georgia" w:hAnsi="Georgia" w:eastAsia="Georgia"/>
-          <w:b w:val="0"/>
-          <w:i w:val="0"/>
-          <w:sz w:val="22"/>
-        </w:rPr>
-      </w:r>
-    </w:p>
-    <w:p/>
-    <w:p/>
-    <w:p>
-      <w:pPr>
         <w:keepNext/>
         <w:keepLines/>
         <w:spacing w:before="200" w:after="80" w:line="240" w:lineRule="auto"/>
@@ -7725,9 +7641,6 @@
         <w:t>WORKING TEST</w:t>
       </w:r>
     </w:p>
-    <w:p/>
-    <w:p/>
-    <w:p/>
     <w:p>
       <w:pPr>
         <w:spacing w:line="240" w:lineRule="auto" w:before="0" w:after="120"/>
@@ -7874,9 +7787,6 @@
         <w:t>LAYER 1: HEDGE TYPE (PRIMARY COLORS)</w:t>
       </w:r>
     </w:p>
-    <w:p/>
-    <w:p/>
-    <w:p/>
     <w:p>
       <w:pPr>
         <w:spacing w:line="240" w:lineRule="auto" w:before="0" w:after="120"/>
@@ -8708,9 +8618,6 @@
         <w:t>LAYER 2: HEDGE FUNCTION (COLORED TEXT LABELS)</w:t>
       </w:r>
     </w:p>
-    <w:p/>
-    <w:p/>
-    <w:p/>
     <w:p>
       <w:pPr>
         <w:spacing w:line="240" w:lineRule="auto" w:before="0" w:after="120"/>
@@ -9277,9 +9184,6 @@
         <w:t>DECISION RULES FOR AMBIGUOUS CASES</w:t>
       </w:r>
     </w:p>
-    <w:p/>
-    <w:p/>
-    <w:p/>
     <w:p>
       <w:pPr>
         <w:spacing w:line="240" w:lineRule="auto" w:before="0" w:after="120"/>
@@ -10045,9 +9949,6 @@
         <w:t>MARKING FALSE POSITIVES</w:t>
       </w:r>
     </w:p>
-    <w:p/>
-    <w:p/>
-    <w:p/>
     <w:p>
       <w:pPr>
         <w:spacing w:line="240" w:lineRule="auto" w:before="0" w:after="120"/>
@@ -10647,9 +10548,6 @@
         <w:t>LAYER 3 (OPTIONAL): UNHEDGED ASSERTION SITES (NEUTRAL GREY)</w:t>
       </w:r>
     </w:p>
-    <w:p/>
-    <w:p/>
-    <w:p/>
     <w:p>
       <w:pPr>
         <w:spacing w:line="240" w:lineRule="auto" w:before="0" w:after="120"/>
@@ -11194,9 +11092,6 @@
         <w:t>QUICK-REFERENCE LEGEND</w:t>
       </w:r>
     </w:p>
-    <w:p/>
-    <w:p/>
-    <w:p/>
     <w:p>
       <w:pPr>
         <w:spacing w:line="240" w:lineRule="auto" w:before="0" w:after="120"/>
@@ -11606,9 +11501,6 @@
         <w:t>COMBINED EXAMPLE</w:t>
       </w:r>
     </w:p>
-    <w:p/>
-    <w:p/>
-    <w:p/>
     <w:p>
       <w:pPr>
         <w:spacing w:line="240" w:lineRule="auto" w:before="0" w:after="120"/>
@@ -11835,9 +11727,6 @@
         <w:t>CODING SHEET COLUMNS</w:t>
       </w:r>
     </w:p>
-    <w:p/>
-    <w:p/>
-    <w:p/>
     <w:p>
       <w:pPr>
         <w:spacing w:line="240" w:lineRule="auto" w:before="0" w:after="120"/>
@@ -12655,9 +12544,6 @@
         <w:t>Optional Tab: Rejected Hedge Candidates</w:t>
       </w:r>
     </w:p>
-    <w:p/>
-    <w:p/>
-    <w:p/>
     <w:p>
       <w:pPr>
         <w:spacing w:line="240" w:lineRule="auto" w:before="0" w:after="120"/>
@@ -13168,9 +13054,6 @@
         <w:t>Sample 2: Veterinary Medicine</w:t>
       </w:r>
     </w:p>
-    <w:p/>
-    <w:p/>
-    <w:p/>
     <w:p>
       <w:pPr>
         <w:spacing w:line="480" w:lineRule="auto" w:before="0" w:after="0"/>
@@ -13310,9 +13193,6 @@
         <w:t>Sample 3: Agriculture (Animal Science)</w:t>
       </w:r>
     </w:p>
-    <w:p/>
-    <w:p/>
-    <w:p/>
     <w:p>
       <w:pPr>
         <w:spacing w:line="480" w:lineRule="auto" w:before="0" w:after="0"/>
@@ -13422,9 +13302,6 @@
         <w:t>Sample 4: Agriculture (Crop Science)</w:t>
       </w:r>
     </w:p>
-    <w:p/>
-    <w:p/>
-    <w:p/>
     <w:p>
       <w:pPr>
         <w:spacing w:line="480" w:lineRule="auto" w:before="0" w:after="0"/>

</xml_diff>

<commit_message>
Draft_012 (in place): apply spacing rule per companion guide — major headings 3-3, sub-headings 1-0
</commit_message>
<xml_diff>
--- a/thesis/003_ThesisProposal_Draft_012.docx
+++ b/thesis/003_ThesisProposal_Draft_012.docx
@@ -407,8 +407,6 @@
         </w:rPr>
       </w:r>
     </w:p>
-    <w:p/>
-    <w:p/>
     <w:p>
       <w:pPr>
         <w:keepNext/>
@@ -491,8 +489,6 @@
       </w:r>
     </w:p>
     <w:p/>
-    <w:p/>
-    <w:p/>
     <w:p>
       <w:pPr>
         <w:keepNext/>
@@ -543,8 +539,6 @@
       </w:r>
     </w:p>
     <w:p/>
-    <w:p/>
-    <w:p/>
     <w:p>
       <w:pPr>
         <w:keepNext/>
@@ -595,8 +589,6 @@
       </w:r>
     </w:p>
     <w:p/>
-    <w:p/>
-    <w:p/>
     <w:p>
       <w:pPr>
         <w:keepNext/>
@@ -647,8 +639,6 @@
       </w:r>
     </w:p>
     <w:p/>
-    <w:p/>
-    <w:p/>
     <w:p>
       <w:pPr>
         <w:keepNext/>
@@ -683,8 +673,6 @@
       </w:r>
     </w:p>
     <w:p/>
-    <w:p/>
-    <w:p/>
     <w:p>
       <w:pPr>
         <w:keepNext/>
@@ -767,8 +755,6 @@
       </w:r>
     </w:p>
     <w:p/>
-    <w:p/>
-    <w:p/>
     <w:p>
       <w:pPr>
         <w:keepNext/>
@@ -878,8 +864,6 @@
         <w:t>4. What do the frequency and functional patterns suggest about the construction of epistemic stance through hedging among developing researchers?</w:t>
       </w:r>
     </w:p>
-    <w:p/>
-    <w:p/>
     <w:p/>
     <w:p>
       <w:pPr>
@@ -1033,8 +1017,6 @@
       </w:r>
     </w:p>
     <w:p/>
-    <w:p/>
-    <w:p/>
     <w:p>
       <w:pPr>
         <w:keepNext/>
@@ -1144,8 +1126,6 @@
       </w:r>
     </w:p>
     <w:p/>
-    <w:p/>
-    <w:p/>
     <w:p>
       <w:pPr>
         <w:keepNext/>
@@ -1263,8 +1243,6 @@
         <w:t>Crucially, this study analyzes the archived thesis abstract as a ratified textual product rather than a measure of individual cognition. Undergraduate theses are heavily supervised, and abstracts are often the product of multiple revisions guided by advisers. Consequently, observed hedging patterns do not solely reflect the independent rhetorical choices or internalized norms of developing researchers; rather, they reflect the standards of the disciplinary community as enforced by faculty advisers. Therefore, while the study investigates patterns within texts produced by developing researchers, its claims are limited to the epistemic stance constructed in the final abstracts and the departmental standards they represent, rather than the internal cognitive processes of the writers themselves. The findings are strictly descriptive of the observed patterns within the PSAU context.</w:t>
       </w:r>
     </w:p>
-    <w:p/>
-    <w:p/>
     <w:p/>
     <w:p>
       <w:pPr>
@@ -1712,8 +1690,6 @@
       </w:r>
     </w:p>
     <w:p/>
-    <w:p/>
-    <w:p/>
     <w:p>
       <w:pPr>
         <w:keepNext/>
@@ -1780,8 +1756,6 @@
       </w:r>
     </w:p>
     <w:p/>
-    <w:p/>
-    <w:p/>
     <w:p>
       <w:pPr>
         <w:keepNext/>
@@ -1816,8 +1790,6 @@
       </w:r>
     </w:p>
     <w:p/>
-    <w:p/>
-    <w:p/>
     <w:p>
       <w:pPr>
         <w:keepNext/>
@@ -2002,8 +1974,6 @@
       </w:r>
     </w:p>
     <w:p/>
-    <w:p/>
-    <w:p/>
     <w:p>
       <w:pPr>
         <w:keepNext/>
@@ -2037,8 +2007,6 @@
         <w:t>Following an initial coding pass, borderline tokens were re-examined using the contextual decision rules in Appendix A. Particular attention was given to potentially ambiguous forms such as can, potential, indicating, and possibility, because these forms may function either as epistemic hedges or as non-epistemic lexical items depending on context. Four rule refinements were applied during this revision pass. First, “can” combined with an active content verb describing a treatment effect (enhance, promote, reduce, help) was classified as capability (FP-Cap) regardless of whether it appeared inside a “suggests that” clause, because the Working Test showed that removing “can” alone did not change the epistemic weight of the clause when “suggests” was already carrying the hedge. Second, the “indicating” tautology test was extended beyond numeric restatement to cover field-standard interpretive thresholds: “non-toxic” from no mortality observed, “limited benefits” from poor performance, and “superior feed efficiency” from lower feed conversion ratio were all reclassified as operational restatements (FP-Gen) rather than inferential hedges. Third, the “potential + noun” topic-naming rule was extended to “possibility + noun” in aim and methods sentences. Fourth, a multi-hedge Working Test rule was added: when a sentence contains multiple hedge-like tokens, each token is tested individually in isolation, ignoring the other hedges in the sentence; a token counts only if removing it alone changes the epistemic weight of its own clause. The final corpus therefore reflects contextual rather than purely lexical classification, and the 63 rejected candidates document the decision trail for tokens that were considered but ultimately excluded. Additionally, the outlier abstract Acs2 was found to use a repeated hedging template (“This suggests that while X might not have been Y, Z could still [verb] beneficial effects”) twice with light variation, inflating its own token count through formulaic repetition rather than independent hedging decisions.</w:t>
       </w:r>
     </w:p>
-    <w:p/>
-    <w:p/>
     <w:p/>
     <w:p>
       <w:pPr>
@@ -3047,8 +3015,6 @@
       </w:r>
     </w:p>
     <w:p/>
-    <w:p/>
-    <w:p/>
     <w:p>
       <w:pPr>
         <w:keepNext/>
@@ -4383,8 +4349,6 @@
         <w:t>Booster analysis of the 28 zero-hedge abstracts revealed 88 booster tokens, averaging approximately 3.1 boosters per abstract. The most frequent boosters were showed (18 instances), revealed (13), observed (12), and highest (12). This density of assertive markers confirms that zero-hedge abstracts do not represent neutral reporting but rather an absence of overt hedging, where findings are stated with emphatic rather than tentative language.</w:t>
       </w:r>
     </w:p>
-    <w:p/>
-    <w:p/>
     <w:p/>
     <w:p>
       <w:pPr>
@@ -5434,8 +5398,6 @@
       </w:r>
     </w:p>
     <w:p/>
-    <w:p/>
-    <w:p/>
     <w:p>
       <w:pPr>
         <w:keepNext/>
@@ -5920,8 +5882,6 @@
       </w:r>
     </w:p>
     <w:p/>
-    <w:p/>
-    <w:p/>
     <w:p>
       <w:pPr>
         <w:keepNext/>
@@ -6121,8 +6081,6 @@
       </w:r>
     </w:p>
     <w:p/>
-    <w:p/>
-    <w:p/>
     <w:p>
       <w:pPr>
         <w:keepNext/>
@@ -6172,8 +6130,6 @@
         <w:t>Disciplinary differentiation is present but uneven. Veterinary Medicine’s sparse, assertive profile is the clearest contrast. Agriculture’s edge over Biology is modest and outlier-sensitive. The patterns are consistent with field-specific epistemic demands (Salager-Meyer, 1994) among developing writers, but statistical evidence is borderline (Kruskal-Wallis p ≈ .052) and the sample is small. The study provides a local baseline, not a general law.</w:t>
       </w:r>
     </w:p>
-    <w:p/>
-    <w:p/>
     <w:p/>
     <w:p>
       <w:pPr>
@@ -7079,8 +7035,6 @@
       </w:r>
     </w:p>
     <w:p/>
-    <w:p/>
-    <w:p/>
     <w:p>
       <w:pPr>
         <w:spacing w:line="240" w:lineRule="auto" w:before="240" w:after="120"/>
@@ -7557,8 +7511,6 @@
       </w:r>
     </w:p>
     <w:p/>
-    <w:p/>
-    <w:p/>
     <w:p>
       <w:pPr>
         <w:spacing w:before="320" w:after="160" w:line="240" w:lineRule="auto"/>
@@ -7622,8 +7574,6 @@
       </w:r>
     </w:p>
     <w:p/>
-    <w:p/>
-    <w:p/>
     <w:p>
       <w:pPr>
         <w:keepNext/>
@@ -7767,8 +7717,6 @@
         <w:t>Coding order: read the sentence in full, check Decision Rules, apply the Working Test if unresolved, and log any case that still can’t be resolved in Coder Notes rather than guessing.</w:t>
       </w:r>
     </w:p>
-    <w:p/>
-    <w:p/>
     <w:p/>
     <w:p>
       <w:pPr>
@@ -8599,8 +8547,6 @@
       </w:r>
     </w:p>
     <w:p/>
-    <w:p/>
-    <w:p/>
     <w:p>
       <w:pPr>
         <w:keepNext/>
@@ -9164,8 +9110,6 @@
         </w:tc>
       </w:tr>
     </w:tbl>
-    <w:p/>
-    <w:p/>
     <w:p/>
     <w:p>
       <w:pPr>
@@ -9930,8 +9874,6 @@
       </w:r>
     </w:p>
     <w:p/>
-    <w:p/>
-    <w:p/>
     <w:p>
       <w:pPr>
         <w:keepNext/>
@@ -10529,8 +10471,6 @@
       </w:tr>
     </w:tbl>
     <w:p/>
-    <w:p/>
-    <w:p/>
     <w:p>
       <w:pPr>
         <w:keepNext/>
@@ -11073,8 +11013,6 @@
       </w:tr>
     </w:tbl>
     <w:p/>
-    <w:p/>
-    <w:p/>
     <w:p>
       <w:pPr>
         <w:keepNext/>
@@ -11482,8 +11420,6 @@
       </w:tr>
     </w:tbl>
     <w:p/>
-    <w:p/>
-    <w:p/>
     <w:p>
       <w:pPr>
         <w:keepNext/>
@@ -11707,8 +11643,6 @@
         <w:t>Blue and red highlights mark type. Orange text marks function. The strikethrough marks a rejected candidate. Grey highlight marks an unhedged site. Here, “potential” is struck because it names a research property, not a hedge on the claim.</w:t>
       </w:r>
     </w:p>
-    <w:p/>
-    <w:p/>
     <w:p/>
     <w:p>
       <w:pPr>
@@ -12194,8 +12128,6 @@
       </w:r>
     </w:p>
     <w:p/>
-    <w:p/>
-    <w:p/>
     <w:p>
       <w:pPr>
         <w:keepNext/>
@@ -12524,8 +12456,6 @@
         </w:tc>
       </w:tr>
     </w:tbl>
-    <w:p/>
-    <w:p/>
     <w:p/>
     <w:p>
       <w:pPr>
@@ -13035,8 +12965,6 @@
       </w:r>
     </w:p>
     <w:p/>
-    <w:p/>
-    <w:p/>
     <w:p>
       <w:pPr>
         <w:keepNext/>
@@ -13174,8 +13102,6 @@
       </w:r>
     </w:p>
     <w:p/>
-    <w:p/>
-    <w:p/>
     <w:p>
       <w:pPr>
         <w:keepNext/>
@@ -13282,8 +13208,6 @@
         <w:t>“Results of the study showed that Comparison on Curing Methods…”</w:t>
       </w:r>
     </w:p>
-    <w:p/>
-    <w:p/>
     <w:p/>
     <w:p>
       <w:pPr>

</xml_diff>

<commit_message>
Draft_012 (in place): apply 3-before to ALL major headings (including section-break-adjacent); when major immediately precedes sub-heading, gap is 3 (major's after wins)
</commit_message>
<xml_diff>
--- a/thesis/003_ThesisProposal_Draft_012.docx
+++ b/thesis/003_ThesisProposal_Draft_012.docx
@@ -377,6 +377,9 @@
         </w:sectPr>
       </w:pPr>
     </w:p>
+    <w:p/>
+    <w:p/>
+    <w:p/>
     <w:p>
       <w:pPr>
         <w:keepNext/>
@@ -407,6 +410,8 @@
         </w:rPr>
       </w:r>
     </w:p>
+    <w:p/>
+    <w:p/>
     <w:p>
       <w:pPr>
         <w:keepNext/>
@@ -1640,6 +1645,9 @@
         </w:sectPr>
       </w:pPr>
     </w:p>
+    <w:p/>
+    <w:p/>
+    <w:p/>
     <w:p>
       <w:pPr>
         <w:pageBreakBefore/>
@@ -2965,6 +2973,9 @@
         </w:sectPr>
       </w:pPr>
     </w:p>
+    <w:p/>
+    <w:p/>
+    <w:p/>
     <w:p>
       <w:pPr>
         <w:pageBreakBefore/>
@@ -6270,6 +6281,9 @@
         </w:sectPr>
       </w:pPr>
     </w:p>
+    <w:p/>
+    <w:p/>
+    <w:p/>
     <w:p>
       <w:pPr>
         <w:pageBreakBefore/>
@@ -6942,6 +6956,9 @@
         </w:sectPr>
       </w:pPr>
     </w:p>
+    <w:p/>
+    <w:p/>
+    <w:p/>
     <w:p>
       <w:pPr>
         <w:pageBreakBefore/>
@@ -13375,6 +13392,9 @@
         </w:sectPr>
       </w:pPr>
     </w:p>
+    <w:p/>
+    <w:p/>
+    <w:p/>
     <w:p>
       <w:pPr>
         <w:pageBreakBefore/>

</xml_diff>

<commit_message>
Draft_012 (in place): bold first clause in SIGNIFICANCE OF THE STUDY; remove leading empties before section-break-adjacent major headings (was creating blank pages)
</commit_message>
<xml_diff>
--- a/thesis/003_ThesisProposal_Draft_012.docx
+++ b/thesis/003_ThesisProposal_Draft_012.docx
@@ -377,9 +377,6 @@
         </w:sectPr>
       </w:pPr>
     </w:p>
-    <w:p/>
-    <w:p/>
-    <w:p/>
     <w:p>
       <w:pPr>
         <w:keepNext/>
@@ -1047,12 +1044,15 @@
       </w:pPr>
       <w:r>
         <w:rPr>
-          <w:rFonts w:ascii="Georgia" w:hAnsi="Georgia" w:eastAsia="Georgia"/>
-          <w:b w:val="0"/>
-          <w:i w:val="0"/>
-          <w:sz w:val="22"/>
-        </w:rPr>
-        <w:t xml:space="preserve">For writing instructors and thesis advisers at PSAU, the study provides an empirical baseline of how developing researchers in three applied life sciences programs currently manage uncertainty in abstracts. That baseline can support more targeted feedback than generic advice to “be cautious.”</w:t>
+          <w:b/>
+        </w:rPr>
+        <w:t>For writing instructors and thesis advisers at PSAU,</w:t>
+      </w:r>
+      <w:r>
+        <w:rPr>
+          <w:b w:val="0"/>
+        </w:rPr>
+        <w:t xml:space="preserve"> the study provides an empirical baseline of how developing researchers in three applied life sciences programs currently manage uncertainty in abstracts. That baseline can support more targeted feedback than generic advice to “be cautious.”</w:t>
       </w:r>
     </w:p>
     <w:p>
@@ -1063,21 +1063,15 @@
       </w:pPr>
       <w:r>
         <w:rPr>
-          <w:rFonts w:ascii="Georgia" w:hAnsi="Georgia" w:eastAsia="Georgia"/>
-          <w:b w:val="0"/>
-          <w:i w:val="0"/>
-          <w:sz w:val="22"/>
-        </w:rPr>
-        <w:t xml:space="preserve">For academic writing researchers, it adds Philippine applied-science abstract data to a body of work that has drawn mainly from other regional and disciplinary settings.</w:t>
-      </w:r>
-      <w:r>
-        <w:rPr>
-          <w:rFonts w:ascii="Georgia" w:hAnsi="Georgia" w:eastAsia="Georgia"/>
-          <w:b w:val="0"/>
-          <w:i w:val="0"/>
-          <w:sz w:val="22"/>
-        </w:rPr>
-        <w:t/>
+          <w:b/>
+        </w:rPr>
+        <w:t>For academic writing researchers,</w:t>
+      </w:r>
+      <w:r>
+        <w:rPr>
+          <w:b w:val="0"/>
+        </w:rPr>
+        <w:t xml:space="preserve"> it adds Philippine applied-science abstract data to a body of work that has drawn mainly from other regional and disciplinary settings.</w:t>
       </w:r>
     </w:p>
     <w:p>
@@ -1088,21 +1082,15 @@
       </w:pPr>
       <w:r>
         <w:rPr>
-          <w:rFonts w:ascii="Georgia" w:hAnsi="Georgia" w:eastAsia="Georgia"/>
-          <w:b w:val="0"/>
-          <w:i w:val="0"/>
-          <w:sz w:val="22"/>
-        </w:rPr>
-        <w:t xml:space="preserve">For the BAELS program, it shows that corpus-assisted discourse analysis is a viable undergraduate thesis methodology and yields findings usable in local writing pedagogy.</w:t>
-      </w:r>
-      <w:r>
-        <w:rPr>
-          <w:rFonts w:ascii="Georgia" w:hAnsi="Georgia" w:eastAsia="Georgia"/>
-          <w:b w:val="0"/>
-          <w:i w:val="0"/>
-          <w:sz w:val="22"/>
-        </w:rPr>
-        <w:t/>
+          <w:b/>
+        </w:rPr>
+        <w:t>For the BAELS program,</w:t>
+      </w:r>
+      <w:r>
+        <w:rPr>
+          <w:b w:val="0"/>
+        </w:rPr>
+        <w:t xml:space="preserve"> it shows that corpus-assisted discourse analysis is a viable undergraduate thesis methodology and yields findings usable in local writing pedagogy.</w:t>
       </w:r>
     </w:p>
     <w:p>
@@ -1113,21 +1101,15 @@
       </w:pPr>
       <w:r>
         <w:rPr>
-          <w:rFonts w:ascii="Georgia" w:hAnsi="Georgia" w:eastAsia="Georgia"/>
-          <w:b w:val="0"/>
-          <w:i w:val="0"/>
-          <w:sz w:val="22"/>
-        </w:rPr>
-        <w:t xml:space="preserve">For future researchers, the sampling design, coding decision rules, and false-positive log offer a replicable protocol for similar corpus studies.</w:t>
-      </w:r>
-      <w:r>
-        <w:rPr>
-          <w:rFonts w:ascii="Georgia" w:hAnsi="Georgia" w:eastAsia="Georgia"/>
-          <w:b w:val="0"/>
-          <w:i w:val="0"/>
-          <w:sz w:val="22"/>
-        </w:rPr>
-        <w:t/>
+          <w:b/>
+        </w:rPr>
+        <w:t>For future researchers,</w:t>
+      </w:r>
+      <w:r>
+        <w:rPr>
+          <w:b w:val="0"/>
+        </w:rPr>
+        <w:t xml:space="preserve"> the sampling design, coding decision rules, and false-positive log offer a replicable protocol for similar corpus studies.</w:t>
       </w:r>
     </w:p>
     <w:p/>
@@ -1645,9 +1627,6 @@
         </w:sectPr>
       </w:pPr>
     </w:p>
-    <w:p/>
-    <w:p/>
-    <w:p/>
     <w:p>
       <w:pPr>
         <w:pageBreakBefore/>
@@ -2973,9 +2952,6 @@
         </w:sectPr>
       </w:pPr>
     </w:p>
-    <w:p/>
-    <w:p/>
-    <w:p/>
     <w:p>
       <w:pPr>
         <w:pageBreakBefore/>
@@ -6281,9 +6257,6 @@
         </w:sectPr>
       </w:pPr>
     </w:p>
-    <w:p/>
-    <w:p/>
-    <w:p/>
     <w:p>
       <w:pPr>
         <w:pageBreakBefore/>
@@ -6956,9 +6929,6 @@
         </w:sectPr>
       </w:pPr>
     </w:p>
-    <w:p/>
-    <w:p/>
-    <w:p/>
     <w:p>
       <w:pPr>
         <w:pageBreakBefore/>
@@ -13392,9 +13362,6 @@
         </w:sectPr>
       </w:pPr>
     </w:p>
-    <w:p/>
-    <w:p/>
-    <w:p/>
     <w:p>
       <w:pPr>
         <w:pageBreakBefore/>

</xml_diff>

<commit_message>
Draft_012 (in place): fix Table 4 mid-word breaks (widen col 0, narrow others, 9pt font); restore 3-before for section-break-adjacent major headings; reclassify APPENDIX A/B/C as sub1 (12pt left-aligned bold caps per companion guide)
</commit_message>
<xml_diff>
--- a/thesis/003_ThesisProposal_Draft_012.docx
+++ b/thesis/003_ThesisProposal_Draft_012.docx
@@ -377,6 +377,9 @@
         </w:sectPr>
       </w:pPr>
     </w:p>
+    <w:p/>
+    <w:p/>
+    <w:p/>
     <w:p>
       <w:pPr>
         <w:keepNext/>
@@ -1627,6 +1630,9 @@
         </w:sectPr>
       </w:pPr>
     </w:p>
+    <w:p/>
+    <w:p/>
+    <w:p/>
     <w:p>
       <w:pPr>
         <w:pageBreakBefore/>
@@ -2952,6 +2958,9 @@
         </w:sectPr>
       </w:pPr>
     </w:p>
+    <w:p/>
+    <w:p/>
+    <w:p/>
     <w:p>
       <w:pPr>
         <w:pageBreakBefore/>
@@ -4413,14 +4422,14 @@
         <w:tblLayout w:type="fixed"/>
       </w:tblPr>
       <w:tblGrid>
-        <w:gridCol w:w="1038"/>
-        <w:gridCol w:w="1038"/>
-        <w:gridCol w:w="1038"/>
-        <w:gridCol w:w="1038"/>
-        <w:gridCol w:w="1038"/>
-        <w:gridCol w:w="1038"/>
-        <w:gridCol w:w="1038"/>
-        <w:gridCol w:w="1038"/>
+        <w:gridCol w:w="2160"/>
+        <w:gridCol w:w="878"/>
+        <w:gridCol w:w="878"/>
+        <w:gridCol w:w="878"/>
+        <w:gridCol w:w="878"/>
+        <w:gridCol w:w="878"/>
+        <w:gridCol w:w="878"/>
+        <w:gridCol w:w="878"/>
       </w:tblGrid>
       <w:tr>
         <w:trPr>
@@ -4429,7 +4438,7 @@
         </w:trPr>
         <w:tc>
           <w:tcPr>
-            <w:tcW w:type="dxa" w:w="1038"/>
+            <w:tcW w:type="dxa" w:w="2160"/>
             <w:tcBorders>
               <w:bottom w:val="single" w:sz="2" w:space="0" w:color="000000"/>
             </w:tcBorders>
@@ -4444,7 +4453,7 @@
                 <w:rFonts w:ascii="Georgia" w:hAnsi="Georgia" w:eastAsia="Georgia"/>
                 <w:b/>
                 <w:i w:val="0"/>
-                <w:sz w:val="20"/>
+                <w:sz w:val="18"/>
               </w:rPr>
               <w:t>Discipline</w:t>
             </w:r>
@@ -4452,7 +4461,7 @@
         </w:tc>
         <w:tc>
           <w:tcPr>
-            <w:tcW w:type="dxa" w:w="1038"/>
+            <w:tcW w:type="dxa" w:w="878"/>
             <w:tcBorders>
               <w:bottom w:val="single" w:sz="2" w:space="0" w:color="000000"/>
             </w:tcBorders>
@@ -4467,7 +4476,7 @@
                 <w:rFonts w:ascii="Georgia" w:hAnsi="Georgia" w:eastAsia="Georgia"/>
                 <w:b/>
                 <w:i w:val="0"/>
-                <w:sz w:val="20"/>
+                <w:sz w:val="18"/>
               </w:rPr>
               <w:t>Abstracts</w:t>
             </w:r>
@@ -4475,7 +4484,7 @@
         </w:tc>
         <w:tc>
           <w:tcPr>
-            <w:tcW w:type="dxa" w:w="1038"/>
+            <w:tcW w:type="dxa" w:w="878"/>
             <w:tcBorders>
               <w:bottom w:val="single" w:sz="2" w:space="0" w:color="000000"/>
             </w:tcBorders>
@@ -4490,7 +4499,7 @@
                 <w:rFonts w:ascii="Georgia" w:hAnsi="Georgia" w:eastAsia="Georgia"/>
                 <w:b/>
                 <w:i w:val="0"/>
-                <w:sz w:val="20"/>
+                <w:sz w:val="18"/>
               </w:rPr>
               <w:t>Words</w:t>
             </w:r>
@@ -4498,7 +4507,7 @@
         </w:tc>
         <w:tc>
           <w:tcPr>
-            <w:tcW w:type="dxa" w:w="1038"/>
+            <w:tcW w:type="dxa" w:w="878"/>
             <w:tcBorders>
               <w:bottom w:val="single" w:sz="2" w:space="0" w:color="000000"/>
             </w:tcBorders>
@@ -4513,7 +4522,7 @@
                 <w:rFonts w:ascii="Georgia" w:hAnsi="Georgia" w:eastAsia="Georgia"/>
                 <w:b/>
                 <w:i w:val="0"/>
-                <w:sz w:val="20"/>
+                <w:sz w:val="18"/>
               </w:rPr>
               <w:t>Hedges</w:t>
             </w:r>
@@ -4521,7 +4530,7 @@
         </w:tc>
         <w:tc>
           <w:tcPr>
-            <w:tcW w:type="dxa" w:w="1038"/>
+            <w:tcW w:type="dxa" w:w="878"/>
             <w:tcBorders>
               <w:bottom w:val="single" w:sz="2" w:space="0" w:color="000000"/>
             </w:tcBorders>
@@ -4536,7 +4545,7 @@
                 <w:rFonts w:ascii="Georgia" w:hAnsi="Georgia" w:eastAsia="Georgia"/>
                 <w:b/>
                 <w:i w:val="0"/>
-                <w:sz w:val="20"/>
+                <w:sz w:val="18"/>
               </w:rPr>
               <w:t>FPs</w:t>
             </w:r>
@@ -4544,7 +4553,7 @@
         </w:tc>
         <w:tc>
           <w:tcPr>
-            <w:tcW w:type="dxa" w:w="1038"/>
+            <w:tcW w:type="dxa" w:w="878"/>
             <w:tcBorders>
               <w:bottom w:val="single" w:sz="2" w:space="0" w:color="000000"/>
             </w:tcBorders>
@@ -4559,7 +4568,7 @@
                 <w:rFonts w:ascii="Georgia" w:hAnsi="Georgia" w:eastAsia="Georgia"/>
                 <w:b/>
                 <w:i w:val="0"/>
-                <w:sz w:val="20"/>
+                <w:sz w:val="18"/>
               </w:rPr>
               <w:t>L3 Sites</w:t>
             </w:r>
@@ -4567,7 +4576,7 @@
         </w:tc>
         <w:tc>
           <w:tcPr>
-            <w:tcW w:type="dxa" w:w="1038"/>
+            <w:tcW w:type="dxa" w:w="878"/>
             <w:tcBorders>
               <w:bottom w:val="single" w:sz="2" w:space="0" w:color="000000"/>
             </w:tcBorders>
@@ -4582,7 +4591,7 @@
                 <w:rFonts w:ascii="Georgia" w:hAnsi="Georgia" w:eastAsia="Georgia"/>
                 <w:b/>
                 <w:i w:val="0"/>
-                <w:sz w:val="20"/>
+                <w:sz w:val="18"/>
               </w:rPr>
               <w:t>Zero-Hedge</w:t>
             </w:r>
@@ -4590,7 +4599,7 @@
         </w:tc>
         <w:tc>
           <w:tcPr>
-            <w:tcW w:type="dxa" w:w="1038"/>
+            <w:tcW w:type="dxa" w:w="878"/>
             <w:tcBorders>
               <w:bottom w:val="single" w:sz="2" w:space="0" w:color="000000"/>
             </w:tcBorders>
@@ -4605,7 +4614,7 @@
                 <w:rFonts w:ascii="Georgia" w:hAnsi="Georgia" w:eastAsia="Georgia"/>
                 <w:b/>
                 <w:i w:val="0"/>
-                <w:sz w:val="20"/>
+                <w:sz w:val="18"/>
               </w:rPr>
               <w:t>Hedges/100w</w:t>
             </w:r>
@@ -4618,7 +4627,7 @@
         </w:trPr>
         <w:tc>
           <w:tcPr>
-            <w:tcW w:type="dxa" w:w="1038"/>
+            <w:tcW w:type="dxa" w:w="2160"/>
           </w:tcPr>
           <w:p>
             <w:pPr>
@@ -4630,7 +4639,7 @@
                 <w:rFonts w:ascii="Georgia" w:hAnsi="Georgia" w:eastAsia="Georgia"/>
                 <w:b w:val="0"/>
                 <w:i w:val="0"/>
-                <w:sz w:val="20"/>
+                <w:sz w:val="18"/>
               </w:rPr>
               <w:t>Agriculture</w:t>
             </w:r>
@@ -4638,7 +4647,7 @@
         </w:tc>
         <w:tc>
           <w:tcPr>
-            <w:tcW w:type="dxa" w:w="1038"/>
+            <w:tcW w:type="dxa" w:w="878"/>
           </w:tcPr>
           <w:p>
             <w:pPr>
@@ -4650,7 +4659,7 @@
                 <w:rFonts w:ascii="Georgia" w:hAnsi="Georgia" w:eastAsia="Georgia"/>
                 <w:b w:val="0"/>
                 <w:i w:val="0"/>
-                <w:sz w:val="20"/>
+                <w:sz w:val="18"/>
               </w:rPr>
               <w:t>20</w:t>
             </w:r>
@@ -4658,7 +4667,7 @@
         </w:tc>
         <w:tc>
           <w:tcPr>
-            <w:tcW w:type="dxa" w:w="1038"/>
+            <w:tcW w:type="dxa" w:w="878"/>
           </w:tcPr>
           <w:p>
             <w:pPr>
@@ -4670,7 +4679,7 @@
                 <w:rFonts w:ascii="Georgia" w:hAnsi="Georgia" w:eastAsia="Georgia"/>
                 <w:b w:val="0"/>
                 <w:i w:val="0"/>
-                <w:sz w:val="20"/>
+                <w:sz w:val="18"/>
               </w:rPr>
               <w:t>4,300</w:t>
             </w:r>
@@ -4678,7 +4687,7 @@
         </w:tc>
         <w:tc>
           <w:tcPr>
-            <w:tcW w:type="dxa" w:w="1038"/>
+            <w:tcW w:type="dxa" w:w="878"/>
           </w:tcPr>
           <w:p>
             <w:pPr>
@@ -4690,7 +4699,7 @@
                 <w:rFonts w:ascii="Georgia" w:hAnsi="Georgia" w:eastAsia="Georgia"/>
                 <w:b w:val="0"/>
                 <w:i w:val="0"/>
-                <w:sz w:val="20"/>
+                <w:sz w:val="18"/>
               </w:rPr>
               <w:t>26</w:t>
             </w:r>
@@ -4698,7 +4707,7 @@
         </w:tc>
         <w:tc>
           <w:tcPr>
-            <w:tcW w:type="dxa" w:w="1038"/>
+            <w:tcW w:type="dxa" w:w="878"/>
           </w:tcPr>
           <w:p>
             <w:pPr>
@@ -4710,7 +4719,7 @@
                 <w:rFonts w:ascii="Georgia" w:hAnsi="Georgia" w:eastAsia="Georgia"/>
                 <w:b w:val="0"/>
                 <w:i w:val="0"/>
-                <w:sz w:val="20"/>
+                <w:sz w:val="18"/>
               </w:rPr>
               <w:t>15</w:t>
             </w:r>
@@ -4718,7 +4727,7 @@
         </w:tc>
         <w:tc>
           <w:tcPr>
-            <w:tcW w:type="dxa" w:w="1038"/>
+            <w:tcW w:type="dxa" w:w="878"/>
           </w:tcPr>
           <w:p>
             <w:pPr>
@@ -4730,7 +4739,7 @@
                 <w:rFonts w:ascii="Georgia" w:hAnsi="Georgia" w:eastAsia="Georgia"/>
                 <w:b w:val="0"/>
                 <w:i w:val="0"/>
-                <w:sz w:val="20"/>
+                <w:sz w:val="18"/>
               </w:rPr>
               <w:t>12</w:t>
             </w:r>
@@ -4738,7 +4747,7 @@
         </w:tc>
         <w:tc>
           <w:tcPr>
-            <w:tcW w:type="dxa" w:w="1038"/>
+            <w:tcW w:type="dxa" w:w="878"/>
           </w:tcPr>
           <w:p>
             <w:pPr>
@@ -4750,7 +4759,7 @@
                 <w:rFonts w:ascii="Georgia" w:hAnsi="Georgia" w:eastAsia="Georgia"/>
                 <w:b w:val="0"/>
                 <w:i w:val="0"/>
-                <w:sz w:val="20"/>
+                <w:sz w:val="18"/>
               </w:rPr>
               <w:t>8</w:t>
             </w:r>
@@ -4758,7 +4767,7 @@
         </w:tc>
         <w:tc>
           <w:tcPr>
-            <w:tcW w:type="dxa" w:w="1038"/>
+            <w:tcW w:type="dxa" w:w="878"/>
           </w:tcPr>
           <w:p>
             <w:pPr>
@@ -4770,7 +4779,7 @@
                 <w:rFonts w:ascii="Georgia" w:hAnsi="Georgia" w:eastAsia="Georgia"/>
                 <w:b w:val="0"/>
                 <w:i w:val="0"/>
-                <w:sz w:val="20"/>
+                <w:sz w:val="18"/>
               </w:rPr>
               <w:t>0.60</w:t>
             </w:r>
@@ -4783,7 +4792,7 @@
         </w:trPr>
         <w:tc>
           <w:tcPr>
-            <w:tcW w:type="dxa" w:w="1038"/>
+            <w:tcW w:type="dxa" w:w="2160"/>
           </w:tcPr>
           <w:p>
             <w:pPr>
@@ -4795,7 +4804,7 @@
                 <w:rFonts w:ascii="Georgia" w:hAnsi="Georgia" w:eastAsia="Georgia"/>
                 <w:b w:val="0"/>
                 <w:i w:val="0"/>
-                <w:sz w:val="20"/>
+                <w:sz w:val="18"/>
               </w:rPr>
               <w:t>Biology</w:t>
             </w:r>
@@ -4803,7 +4812,7 @@
         </w:tc>
         <w:tc>
           <w:tcPr>
-            <w:tcW w:type="dxa" w:w="1038"/>
+            <w:tcW w:type="dxa" w:w="878"/>
           </w:tcPr>
           <w:p>
             <w:pPr>
@@ -4815,7 +4824,7 @@
                 <w:rFonts w:ascii="Georgia" w:hAnsi="Georgia" w:eastAsia="Georgia"/>
                 <w:b w:val="0"/>
                 <w:i w:val="0"/>
-                <w:sz w:val="20"/>
+                <w:sz w:val="18"/>
               </w:rPr>
               <w:t>20</w:t>
             </w:r>
@@ -4823,7 +4832,7 @@
         </w:tc>
         <w:tc>
           <w:tcPr>
-            <w:tcW w:type="dxa" w:w="1038"/>
+            <w:tcW w:type="dxa" w:w="878"/>
           </w:tcPr>
           <w:p>
             <w:pPr>
@@ -4835,7 +4844,7 @@
                 <w:rFonts w:ascii="Georgia" w:hAnsi="Georgia" w:eastAsia="Georgia"/>
                 <w:b w:val="0"/>
                 <w:i w:val="0"/>
-                <w:sz w:val="20"/>
+                <w:sz w:val="18"/>
               </w:rPr>
               <w:t>4,509</w:t>
             </w:r>
@@ -4843,7 +4852,7 @@
         </w:tc>
         <w:tc>
           <w:tcPr>
-            <w:tcW w:type="dxa" w:w="1038"/>
+            <w:tcW w:type="dxa" w:w="878"/>
           </w:tcPr>
           <w:p>
             <w:pPr>
@@ -4855,7 +4864,7 @@
                 <w:rFonts w:ascii="Georgia" w:hAnsi="Georgia" w:eastAsia="Georgia"/>
                 <w:b w:val="0"/>
                 <w:i w:val="0"/>
-                <w:sz w:val="20"/>
+                <w:sz w:val="18"/>
               </w:rPr>
               <w:t>25</w:t>
             </w:r>
@@ -4863,7 +4872,7 @@
         </w:tc>
         <w:tc>
           <w:tcPr>
-            <w:tcW w:type="dxa" w:w="1038"/>
+            <w:tcW w:type="dxa" w:w="878"/>
           </w:tcPr>
           <w:p>
             <w:pPr>
@@ -4875,7 +4884,7 @@
                 <w:rFonts w:ascii="Georgia" w:hAnsi="Georgia" w:eastAsia="Georgia"/>
                 <w:b w:val="0"/>
                 <w:i w:val="0"/>
-                <w:sz w:val="20"/>
+                <w:sz w:val="18"/>
               </w:rPr>
               <w:t>35</w:t>
             </w:r>
@@ -4883,7 +4892,7 @@
         </w:tc>
         <w:tc>
           <w:tcPr>
-            <w:tcW w:type="dxa" w:w="1038"/>
+            <w:tcW w:type="dxa" w:w="878"/>
           </w:tcPr>
           <w:p>
             <w:pPr>
@@ -4895,7 +4904,7 @@
                 <w:rFonts w:ascii="Georgia" w:hAnsi="Georgia" w:eastAsia="Georgia"/>
                 <w:b w:val="0"/>
                 <w:i w:val="0"/>
-                <w:sz w:val="20"/>
+                <w:sz w:val="18"/>
               </w:rPr>
               <w:t>10</w:t>
             </w:r>
@@ -4903,7 +4912,7 @@
         </w:tc>
         <w:tc>
           <w:tcPr>
-            <w:tcW w:type="dxa" w:w="1038"/>
+            <w:tcW w:type="dxa" w:w="878"/>
           </w:tcPr>
           <w:p>
             <w:pPr>
@@ -4915,7 +4924,7 @@
                 <w:rFonts w:ascii="Georgia" w:hAnsi="Georgia" w:eastAsia="Georgia"/>
                 <w:b w:val="0"/>
                 <w:i w:val="0"/>
-                <w:sz w:val="20"/>
+                <w:sz w:val="18"/>
               </w:rPr>
               <w:t>7</w:t>
             </w:r>
@@ -4923,7 +4932,7 @@
         </w:tc>
         <w:tc>
           <w:tcPr>
-            <w:tcW w:type="dxa" w:w="1038"/>
+            <w:tcW w:type="dxa" w:w="878"/>
           </w:tcPr>
           <w:p>
             <w:pPr>
@@ -4935,7 +4944,7 @@
                 <w:rFonts w:ascii="Georgia" w:hAnsi="Georgia" w:eastAsia="Georgia"/>
                 <w:b w:val="0"/>
                 <w:i w:val="0"/>
-                <w:sz w:val="20"/>
+                <w:sz w:val="18"/>
               </w:rPr>
               <w:t>0.55</w:t>
             </w:r>
@@ -4948,7 +4957,7 @@
         </w:trPr>
         <w:tc>
           <w:tcPr>
-            <w:tcW w:type="dxa" w:w="1038"/>
+            <w:tcW w:type="dxa" w:w="2160"/>
           </w:tcPr>
           <w:p>
             <w:pPr>
@@ -4960,7 +4969,7 @@
                 <w:rFonts w:ascii="Georgia" w:hAnsi="Georgia" w:eastAsia="Georgia"/>
                 <w:b w:val="0"/>
                 <w:i w:val="0"/>
-                <w:sz w:val="20"/>
+                <w:sz w:val="18"/>
               </w:rPr>
               <w:t>Veterinary Medicine</w:t>
             </w:r>
@@ -4968,7 +4977,7 @@
         </w:tc>
         <w:tc>
           <w:tcPr>
-            <w:tcW w:type="dxa" w:w="1038"/>
+            <w:tcW w:type="dxa" w:w="878"/>
           </w:tcPr>
           <w:p>
             <w:pPr>
@@ -4980,7 +4989,7 @@
                 <w:rFonts w:ascii="Georgia" w:hAnsi="Georgia" w:eastAsia="Georgia"/>
                 <w:b w:val="0"/>
                 <w:i w:val="0"/>
-                <w:sz w:val="20"/>
+                <w:sz w:val="18"/>
               </w:rPr>
               <w:t>20</w:t>
             </w:r>
@@ -4988,7 +4997,7 @@
         </w:tc>
         <w:tc>
           <w:tcPr>
-            <w:tcW w:type="dxa" w:w="1038"/>
+            <w:tcW w:type="dxa" w:w="878"/>
           </w:tcPr>
           <w:p>
             <w:pPr>
@@ -5000,7 +5009,7 @@
                 <w:rFonts w:ascii="Georgia" w:hAnsi="Georgia" w:eastAsia="Georgia"/>
                 <w:b w:val="0"/>
                 <w:i w:val="0"/>
-                <w:sz w:val="20"/>
+                <w:sz w:val="18"/>
               </w:rPr>
               <w:t>5,060</w:t>
             </w:r>
@@ -5008,7 +5017,7 @@
         </w:tc>
         <w:tc>
           <w:tcPr>
-            <w:tcW w:type="dxa" w:w="1038"/>
+            <w:tcW w:type="dxa" w:w="878"/>
           </w:tcPr>
           <w:p>
             <w:pPr>
@@ -5020,7 +5029,7 @@
                 <w:rFonts w:ascii="Georgia" w:hAnsi="Georgia" w:eastAsia="Georgia"/>
                 <w:b w:val="0"/>
                 <w:i w:val="0"/>
-                <w:sz w:val="20"/>
+                <w:sz w:val="18"/>
               </w:rPr>
               <w:t>9</w:t>
             </w:r>
@@ -5028,7 +5037,7 @@
         </w:tc>
         <w:tc>
           <w:tcPr>
-            <w:tcW w:type="dxa" w:w="1038"/>
+            <w:tcW w:type="dxa" w:w="878"/>
           </w:tcPr>
           <w:p>
             <w:pPr>
@@ -5040,7 +5049,7 @@
                 <w:rFonts w:ascii="Georgia" w:hAnsi="Georgia" w:eastAsia="Georgia"/>
                 <w:b w:val="0"/>
                 <w:i w:val="0"/>
-                <w:sz w:val="20"/>
+                <w:sz w:val="18"/>
               </w:rPr>
               <w:t>13</w:t>
             </w:r>
@@ -5048,7 +5057,7 @@
         </w:tc>
         <w:tc>
           <w:tcPr>
-            <w:tcW w:type="dxa" w:w="1038"/>
+            <w:tcW w:type="dxa" w:w="878"/>
           </w:tcPr>
           <w:p>
             <w:pPr>
@@ -5060,7 +5069,7 @@
                 <w:rFonts w:ascii="Georgia" w:hAnsi="Georgia" w:eastAsia="Georgia"/>
                 <w:b w:val="0"/>
                 <w:i w:val="0"/>
-                <w:sz w:val="20"/>
+                <w:sz w:val="18"/>
               </w:rPr>
               <w:t>15</w:t>
             </w:r>
@@ -5068,7 +5077,7 @@
         </w:tc>
         <w:tc>
           <w:tcPr>
-            <w:tcW w:type="dxa" w:w="1038"/>
+            <w:tcW w:type="dxa" w:w="878"/>
           </w:tcPr>
           <w:p>
             <w:pPr>
@@ -5080,7 +5089,7 @@
                 <w:rFonts w:ascii="Georgia" w:hAnsi="Georgia" w:eastAsia="Georgia"/>
                 <w:b w:val="0"/>
                 <w:i w:val="0"/>
-                <w:sz w:val="20"/>
+                <w:sz w:val="18"/>
               </w:rPr>
               <w:t>13</w:t>
             </w:r>
@@ -5088,7 +5097,7 @@
         </w:tc>
         <w:tc>
           <w:tcPr>
-            <w:tcW w:type="dxa" w:w="1038"/>
+            <w:tcW w:type="dxa" w:w="878"/>
           </w:tcPr>
           <w:p>
             <w:pPr>
@@ -5100,7 +5109,7 @@
                 <w:rFonts w:ascii="Georgia" w:hAnsi="Georgia" w:eastAsia="Georgia"/>
                 <w:b w:val="0"/>
                 <w:i w:val="0"/>
-                <w:sz w:val="20"/>
+                <w:sz w:val="18"/>
               </w:rPr>
               <w:t>0.18</w:t>
             </w:r>
@@ -5113,7 +5122,7 @@
         </w:trPr>
         <w:tc>
           <w:tcPr>
-            <w:tcW w:type="dxa" w:w="1038"/>
+            <w:tcW w:type="dxa" w:w="2160"/>
           </w:tcPr>
           <w:p>
             <w:pPr>
@@ -5125,7 +5134,7 @@
                 <w:rFonts w:ascii="Georgia" w:hAnsi="Georgia" w:eastAsia="Georgia"/>
                 <w:b w:val="0"/>
                 <w:i w:val="0"/>
-                <w:sz w:val="20"/>
+                <w:sz w:val="18"/>
               </w:rPr>
               <w:t>Total</w:t>
             </w:r>
@@ -5133,7 +5142,7 @@
         </w:tc>
         <w:tc>
           <w:tcPr>
-            <w:tcW w:type="dxa" w:w="1038"/>
+            <w:tcW w:type="dxa" w:w="878"/>
           </w:tcPr>
           <w:p>
             <w:pPr>
@@ -5145,7 +5154,7 @@
                 <w:rFonts w:ascii="Georgia" w:hAnsi="Georgia" w:eastAsia="Georgia"/>
                 <w:b w:val="0"/>
                 <w:i w:val="0"/>
-                <w:sz w:val="20"/>
+                <w:sz w:val="18"/>
               </w:rPr>
               <w:t>60</w:t>
             </w:r>
@@ -5153,7 +5162,7 @@
         </w:tc>
         <w:tc>
           <w:tcPr>
-            <w:tcW w:type="dxa" w:w="1038"/>
+            <w:tcW w:type="dxa" w:w="878"/>
           </w:tcPr>
           <w:p>
             <w:pPr>
@@ -5165,7 +5174,7 @@
                 <w:rFonts w:ascii="Georgia" w:hAnsi="Georgia" w:eastAsia="Georgia"/>
                 <w:b w:val="0"/>
                 <w:i w:val="0"/>
-                <w:sz w:val="20"/>
+                <w:sz w:val="18"/>
               </w:rPr>
               <w:t>13,869</w:t>
             </w:r>
@@ -5173,7 +5182,7 @@
         </w:tc>
         <w:tc>
           <w:tcPr>
-            <w:tcW w:type="dxa" w:w="1038"/>
+            <w:tcW w:type="dxa" w:w="878"/>
           </w:tcPr>
           <w:p>
             <w:pPr>
@@ -5185,7 +5194,7 @@
                 <w:rFonts w:ascii="Georgia" w:hAnsi="Georgia" w:eastAsia="Georgia"/>
                 <w:b w:val="0"/>
                 <w:i w:val="0"/>
-                <w:sz w:val="20"/>
+                <w:sz w:val="18"/>
               </w:rPr>
               <w:t>60</w:t>
             </w:r>
@@ -5193,7 +5202,7 @@
         </w:tc>
         <w:tc>
           <w:tcPr>
-            <w:tcW w:type="dxa" w:w="1038"/>
+            <w:tcW w:type="dxa" w:w="878"/>
           </w:tcPr>
           <w:p>
             <w:pPr>
@@ -5205,7 +5214,7 @@
                 <w:rFonts w:ascii="Georgia" w:hAnsi="Georgia" w:eastAsia="Georgia"/>
                 <w:b w:val="0"/>
                 <w:i w:val="0"/>
-                <w:sz w:val="20"/>
+                <w:sz w:val="18"/>
               </w:rPr>
               <w:t>63</w:t>
             </w:r>
@@ -5213,7 +5222,7 @@
         </w:tc>
         <w:tc>
           <w:tcPr>
-            <w:tcW w:type="dxa" w:w="1038"/>
+            <w:tcW w:type="dxa" w:w="878"/>
           </w:tcPr>
           <w:p>
             <w:pPr>
@@ -5225,7 +5234,7 @@
                 <w:rFonts w:ascii="Georgia" w:hAnsi="Georgia" w:eastAsia="Georgia"/>
                 <w:b w:val="0"/>
                 <w:i w:val="0"/>
-                <w:sz w:val="20"/>
+                <w:sz w:val="18"/>
               </w:rPr>
               <w:t>37</w:t>
             </w:r>
@@ -5233,7 +5242,7 @@
         </w:tc>
         <w:tc>
           <w:tcPr>
-            <w:tcW w:type="dxa" w:w="1038"/>
+            <w:tcW w:type="dxa" w:w="878"/>
           </w:tcPr>
           <w:p>
             <w:pPr>
@@ -5245,7 +5254,7 @@
                 <w:rFonts w:ascii="Georgia" w:hAnsi="Georgia" w:eastAsia="Georgia"/>
                 <w:b w:val="0"/>
                 <w:i w:val="0"/>
-                <w:sz w:val="20"/>
+                <w:sz w:val="18"/>
               </w:rPr>
               <w:t>28</w:t>
             </w:r>
@@ -5253,7 +5262,7 @@
         </w:tc>
         <w:tc>
           <w:tcPr>
-            <w:tcW w:type="dxa" w:w="1038"/>
+            <w:tcW w:type="dxa" w:w="878"/>
           </w:tcPr>
           <w:p>
             <w:pPr>
@@ -5265,7 +5274,7 @@
                 <w:rFonts w:ascii="Georgia" w:hAnsi="Georgia" w:eastAsia="Georgia"/>
                 <w:b w:val="0"/>
                 <w:i w:val="0"/>
-                <w:sz w:val="20"/>
+                <w:sz w:val="18"/>
               </w:rPr>
               <w:t>0.43</w:t>
             </w:r>
@@ -6257,6 +6266,9 @@
         </w:sectPr>
       </w:pPr>
     </w:p>
+    <w:p/>
+    <w:p/>
+    <w:p/>
     <w:p>
       <w:pPr>
         <w:pageBreakBefore/>
@@ -6929,6 +6941,9 @@
         </w:sectPr>
       </w:pPr>
     </w:p>
+    <w:p/>
+    <w:p/>
+    <w:p/>
     <w:p>
       <w:pPr>
         <w:pageBreakBefore/>
@@ -6962,22 +6977,8 @@
     </w:p>
     <w:p>
       <w:pPr>
-        <w:spacing w:after="0" w:before="0"/>
-      </w:pPr>
-      <w:r>
-        <w:rPr>
-          <w:rFonts w:ascii="Georgia" w:hAnsi="Georgia" w:eastAsia="Georgia"/>
-          <w:b w:val="0"/>
-          <w:i w:val="0"/>
-          <w:sz w:val="22"/>
-        </w:rPr>
-      </w:r>
-    </w:p>
-    <w:p/>
-    <w:p>
-      <w:pPr>
         <w:spacing w:before="120" w:after="200" w:line="240" w:lineRule="auto"/>
-        <w:jc w:val="center"/>
+        <w:jc w:val="left"/>
       </w:pPr>
       <w:r>
         <w:rPr>
@@ -6991,14 +6992,11 @@
         <w:rPr>
           <w:rFonts w:ascii="Georgia" w:hAnsi="Georgia" w:cs="Georgia"/>
           <w:b/>
-          <w:sz w:val="28"/>
+          <w:sz w:val="24"/>
         </w:rPr>
         <w:t>APPENDIX A: HEDGING CODEBOOK</w:t>
       </w:r>
     </w:p>
-    <w:p/>
-    <w:p/>
-    <w:p/>
     <w:p>
       <w:pPr>
         <w:spacing w:before="0" w:after="120" w:line="240" w:lineRule="auto"/>
@@ -12789,39 +12787,22 @@
       </w:tr>
     </w:tbl>
     <w:p/>
-    <w:p/>
-    <w:p/>
     <w:p>
       <w:pPr>
         <w:pageBreakBefore/>
         <w:spacing w:before="360" w:after="200" w:line="240" w:lineRule="auto"/>
-        <w:jc w:val="center"/>
+        <w:jc w:val="left"/>
       </w:pPr>
       <w:r>
         <w:rPr>
           <w:rFonts w:ascii="Georgia" w:hAnsi="Georgia" w:eastAsia="Georgia" w:cs="Georgia"/>
           <w:b/>
           <w:i w:val="0"/>
-          <w:sz w:val="28"/>
+          <w:sz w:val="24"/>
         </w:rPr>
         <w:t>APPENDIX B: PILOT SAMPLE ANALYSIS AND CODING VERIFICATION</w:t>
       </w:r>
     </w:p>
-    <w:p>
-      <w:pPr>
-        <w:spacing w:before="0" w:after="0" w:line="240" w:lineRule="auto"/>
-      </w:pPr>
-      <w:r>
-        <w:rPr>
-          <w:rFonts w:ascii="Georgia" w:hAnsi="Georgia" w:eastAsia="Georgia"/>
-          <w:b w:val="0"/>
-          <w:i w:val="0"/>
-          <w:sz w:val="22"/>
-        </w:rPr>
-      </w:r>
-    </w:p>
-    <w:p/>
-    <w:p/>
     <w:p>
       <w:pPr>
         <w:spacing w:line="240" w:lineRule="auto" w:before="0" w:after="120"/>
@@ -13362,11 +13343,12 @@
         </w:sectPr>
       </w:pPr>
     </w:p>
+    <w:p/>
     <w:p>
       <w:pPr>
         <w:pageBreakBefore/>
         <w:spacing w:before="360" w:after="200" w:line="240" w:lineRule="auto"/>
-        <w:jc w:val="center"/>
+        <w:jc w:val="left"/>
       </w:pPr>
       <w:r>
         <w:rPr>
@@ -13380,26 +13362,11 @@
         <w:rPr>
           <w:rFonts w:ascii="Georgia" w:hAnsi="Georgia" w:cs="Georgia"/>
           <w:b/>
-          <w:sz w:val="28"/>
+          <w:sz w:val="24"/>
         </w:rPr>
         <w:t>APPENDIX C: CODED CORPUS WITH HIGHLIGHTS</w:t>
       </w:r>
     </w:p>
-    <w:p>
-      <w:pPr>
-        <w:spacing w:before="0" w:after="0" w:line="240" w:lineRule="auto"/>
-      </w:pPr>
-      <w:r>
-        <w:rPr>
-          <w:rFonts w:ascii="Georgia" w:hAnsi="Georgia" w:eastAsia="Georgia"/>
-          <w:b w:val="0"/>
-          <w:i w:val="0"/>
-          <w:sz w:val="22"/>
-        </w:rPr>
-      </w:r>
-    </w:p>
-    <w:p/>
-    <w:p/>
     <w:p>
       <w:pPr>
         <w:spacing w:line="480" w:lineRule="auto" w:before="0" w:after="0"/>

</xml_diff>

<commit_message>
Draft_012 (in place): eliminate all blank pages — removed leading empties before section-break-adjacent major headings + APPENDIX C; removed redundant body-level sectPr causing trailing blank page; verified 113 pages, 0 blank
</commit_message>
<xml_diff>
--- a/thesis/003_ThesisProposal_Draft_012.docx
+++ b/thesis/003_ThesisProposal_Draft_012.docx
@@ -377,9 +377,6 @@
         </w:sectPr>
       </w:pPr>
     </w:p>
-    <w:p/>
-    <w:p/>
-    <w:p/>
     <w:p>
       <w:pPr>
         <w:keepNext/>
@@ -1630,9 +1627,6 @@
         </w:sectPr>
       </w:pPr>
     </w:p>
-    <w:p/>
-    <w:p/>
-    <w:p/>
     <w:p>
       <w:pPr>
         <w:pageBreakBefore/>
@@ -2958,9 +2952,6 @@
         </w:sectPr>
       </w:pPr>
     </w:p>
-    <w:p/>
-    <w:p/>
-    <w:p/>
     <w:p>
       <w:pPr>
         <w:pageBreakBefore/>
@@ -6266,9 +6257,6 @@
         </w:sectPr>
       </w:pPr>
     </w:p>
-    <w:p/>
-    <w:p/>
-    <w:p/>
     <w:p>
       <w:pPr>
         <w:pageBreakBefore/>
@@ -6941,9 +6929,6 @@
         </w:sectPr>
       </w:pPr>
     </w:p>
-    <w:p/>
-    <w:p/>
-    <w:p/>
     <w:p>
       <w:pPr>
         <w:pageBreakBefore/>
@@ -13343,7 +13328,6 @@
         </w:sectPr>
       </w:pPr>
     </w:p>
-    <w:p/>
     <w:p>
       <w:pPr>
         <w:pageBreakBefore/>
@@ -20069,142 +20053,6 @@
       <w:pPr>
         <w:spacing w:line="480" w:lineRule="auto" w:before="0" w:after="240"/>
         <w:jc w:val="both"/>
-      </w:pPr>
-      <w:r>
-        <w:rPr>
-          <w:rFonts w:ascii="Georgia" w:hAnsi="Georgia" w:eastAsia="Georgia"/>
-          <w:b w:val="0"/>
-          <w:i w:val="0"/>
-          <w:color w:val="000000"/>
-          <w:sz w:val="22"/>
-        </w:rPr>
-        <w:t xml:space="preserve">The study was conducted at Sitio Corba, San Vicente, Concepcion, Tarlac, for 35 days, from April 16 to May 20, 2023. The study was carried out to search for alternatives to protein sources. The objective of the study was to determine the growth response of F1 New Zealand white rabbits as influenced by the roughage-to-concentrate ratio. A total of eighteen (18) heads of six (6)-week-old female New Zealand White Rabbits were selected and distributed into three (3) groups, each treatment replicated thrice with 2 rabbits per replication. Results showed no significant difference (P&lt;0.05) in final weight, gain in weight, and average daily gain in all the treatment groups. The control group (T1) was fed 70% guinea grass and 30% concentrates. For T2 and T3, the guinea grass was replaced with fresh azolla on an equi-weight basis at levels of 10 and 20 percent, respectively. In conclusion, based on the results, it </w:t>
-      </w:r>
-      <w:r>
-        <w:rPr>
-          <w:rFonts w:ascii="Georgia" w:hAnsi="Georgia" w:eastAsia="Georgia"/>
-          <w:b/>
-          <w:strike w:val="0"/>
-          <w:color w:val="000000"/>
-          <w:sz w:val="22"/>
-          <w:shd w:val="clear" w:color="auto" w:fill="00B0F0"/>
-        </w:rPr>
-        <w:t>can</w:t>
-      </w:r>
-      <w:r>
-        <w:rPr>
-          <w:rFonts w:ascii="Georgia" w:hAnsi="Georgia" w:eastAsia="Georgia"/>
-          <w:b/>
-          <w:i w:val="0"/>
-          <w:color w:val="ED7D31"/>
-          <w:sz w:val="20"/>
-        </w:rPr>
-        <w:t xml:space="preserve"> (EC)</w:t>
-      </w:r>
-      <w:r>
-        <w:rPr>
-          <w:rFonts w:ascii="Georgia" w:hAnsi="Georgia" w:eastAsia="Georgia"/>
-          <w:b w:val="0"/>
-          <w:i w:val="0"/>
-          <w:color w:val="000000"/>
-          <w:sz w:val="22"/>
-        </w:rPr>
-        <w:t xml:space="preserve"> be stated that the ratio of 70% guinea grass (GG) + 30% concentrate (C), the control group, had a significantly higher (P&lt;0.01) feed conversion ratio, while rabbits in treatment T3 (50% guinea grass, 20% azolla, and 30% concentrate) had a significantly higher (P&lt;0.01) dry matter intake. The researchers still </w:t>
-      </w:r>
-      <w:r>
-        <w:rPr>
-          <w:rFonts w:ascii="Georgia" w:hAnsi="Georgia"/>
-          <w:b/>
-          <w:strike/>
-          <w:color w:val="000000"/>
-          <w:sz w:val="22"/>
-        </w:rPr>
-        <w:t>recommended</w:t>
-      </w:r>
-      <w:r>
-        <w:rPr>
-          <w:rFonts w:ascii="Georgia" w:hAnsi="Georgia" w:eastAsia="Georgia"/>
-          <w:b w:val="0"/>
-          <w:i w:val="0"/>
-          <w:color w:val="808080"/>
-          <w:sz w:val="20"/>
-        </w:rPr>
-        <w:t xml:space="preserve"> (FP-Rec)</w:t>
-      </w:r>
-      <w:r>
-        <w:rPr>
-          <w:rFonts w:ascii="Georgia" w:hAnsi="Georgia" w:eastAsia="Georgia"/>
-          <w:b w:val="0"/>
-          <w:i w:val="0"/>
-          <w:color w:val="000000"/>
-          <w:sz w:val="22"/>
-        </w:rPr>
-        <w:t xml:space="preserve"> incorporating 50% Guinea grass + 20% Azolla + 30% concentrates for rabbit growth performance, considering the results show that this treatment performs well and doesn't differ from treatment 1, which is the farmer practice. The researchers also saw that the treatment of 50% Guinea grass + 20% Azolla + 30% concentrates has </w:t>
-      </w:r>
-      <w:r>
-        <w:rPr>
-          <w:rFonts w:ascii="Georgia" w:hAnsi="Georgia" w:eastAsia="Georgia"/>
-          <w:b/>
-          <w:strike w:val="0"/>
-          <w:color w:val="FFFFFF"/>
-          <w:sz w:val="22"/>
-          <w:shd w:val="clear" w:color="auto" w:fill="FF0000"/>
-        </w:rPr>
-        <w:t>potential</w:t>
-      </w:r>
-      <w:r>
-        <w:rPr>
-          <w:rFonts w:ascii="Georgia" w:hAnsi="Georgia" w:eastAsia="Georgia"/>
-          <w:b/>
-          <w:i w:val="0"/>
-          <w:color w:val="ED7D31"/>
-          <w:sz w:val="20"/>
-        </w:rPr>
-        <w:t xml:space="preserve"> (EC)</w:t>
-      </w:r>
-      <w:r>
-        <w:rPr>
-          <w:rFonts w:ascii="Georgia" w:hAnsi="Georgia" w:eastAsia="Georgia"/>
-          <w:b w:val="0"/>
-          <w:i w:val="0"/>
-          <w:color w:val="000000"/>
-          <w:sz w:val="22"/>
-        </w:rPr>
-        <w:t xml:space="preserve"> as an alternative feed ration for rabbits without adverse effects, and considering that azolla </w:t>
-      </w:r>
-      <w:r>
-        <w:rPr>
-          <w:rFonts w:ascii="Georgia" w:hAnsi="Georgia"/>
-          <w:b/>
-          <w:strike/>
-          <w:color w:val="000000"/>
-          <w:sz w:val="22"/>
-        </w:rPr>
-        <w:t>can</w:t>
-      </w:r>
-      <w:r>
-        <w:rPr>
-          <w:rFonts w:ascii="Georgia" w:hAnsi="Georgia" w:eastAsia="Georgia"/>
-          <w:b w:val="0"/>
-          <w:i w:val="0"/>
-          <w:color w:val="808080"/>
-          <w:sz w:val="20"/>
-        </w:rPr>
-        <w:t xml:space="preserve"> (FP-Cap)</w:t>
-      </w:r>
-      <w:r>
-        <w:rPr>
-          <w:rFonts w:ascii="Georgia" w:hAnsi="Georgia" w:eastAsia="Georgia"/>
-          <w:b w:val="0"/>
-          <w:i w:val="0"/>
-          <w:color w:val="000000"/>
-          <w:sz w:val="22"/>
-        </w:rPr>
-        <w:t xml:space="preserve"> help breeders to lessen the feed cost in production.</w:t>
-      </w:r>
-    </w:p>
-    <w:p>
-      <w:pPr>
         <w:sectPr>
           <w:headerReference w:type="default" r:id="rId24"/>
           <w:headerReference w:type="first" r:id="rId25"/>
@@ -20215,29 +20063,139 @@
           <w:docGrid w:linePitch="360"/>
         </w:sectPr>
       </w:pPr>
+      <w:r>
+        <w:rPr>
+          <w:rFonts w:ascii="Georgia" w:hAnsi="Georgia" w:eastAsia="Georgia"/>
+          <w:b w:val="0"/>
+          <w:i w:val="0"/>
+          <w:color w:val="000000"/>
+          <w:sz w:val="22"/>
+        </w:rPr>
+        <w:t xml:space="preserve">The study was conducted at Sitio Corba, San Vicente, Concepcion, Tarlac, for 35 days, from April 16 to May 20, 2023. The study was carried out to search for alternatives to protein sources. The objective of the study was to determine the growth response of F1 New Zealand white rabbits as influenced by the roughage-to-concentrate ratio. A total of eighteen (18) heads of six (6)-week-old female New Zealand White Rabbits were selected and distributed into three (3) groups, each treatment replicated thrice with 2 rabbits per replication. Results showed no significant difference (P&lt;0.05) in final weight, gain in weight, and average daily gain in all the treatment groups. The control group (T1) was fed 70% guinea grass and 30% concentrates. For T2 and T3, the guinea grass was replaced with fresh azolla on an equi-weight basis at levels of 10 and 20 percent, respectively. In conclusion, based on the results, it </w:t>
+      </w:r>
+      <w:r>
+        <w:rPr>
+          <w:rFonts w:ascii="Georgia" w:hAnsi="Georgia" w:eastAsia="Georgia"/>
+          <w:b/>
+          <w:strike w:val="0"/>
+          <w:color w:val="000000"/>
+          <w:sz w:val="22"/>
+          <w:shd w:val="clear" w:color="auto" w:fill="00B0F0"/>
+        </w:rPr>
+        <w:t>can</w:t>
+      </w:r>
+      <w:r>
+        <w:rPr>
+          <w:rFonts w:ascii="Georgia" w:hAnsi="Georgia" w:eastAsia="Georgia"/>
+          <w:b/>
+          <w:i w:val="0"/>
+          <w:color w:val="ED7D31"/>
+          <w:sz w:val="20"/>
+        </w:rPr>
+        <w:t xml:space="preserve"> (EC)</w:t>
+      </w:r>
+      <w:r>
+        <w:rPr>
+          <w:rFonts w:ascii="Georgia" w:hAnsi="Georgia" w:eastAsia="Georgia"/>
+          <w:b w:val="0"/>
+          <w:i w:val="0"/>
+          <w:color w:val="000000"/>
+          <w:sz w:val="22"/>
+        </w:rPr>
+        <w:t xml:space="preserve"> be stated that the ratio of 70% guinea grass (GG) + 30% concentrate (C), the control group, had a significantly higher (P&lt;0.01) feed conversion ratio, while rabbits in treatment T3 (50% guinea grass, 20% azolla, and 30% concentrate) had a significantly higher (P&lt;0.01) dry matter intake. The researchers still </w:t>
+      </w:r>
+      <w:r>
+        <w:rPr>
+          <w:rFonts w:ascii="Georgia" w:hAnsi="Georgia"/>
+          <w:b/>
+          <w:strike/>
+          <w:color w:val="000000"/>
+          <w:sz w:val="22"/>
+        </w:rPr>
+        <w:t>recommended</w:t>
+      </w:r>
+      <w:r>
+        <w:rPr>
+          <w:rFonts w:ascii="Georgia" w:hAnsi="Georgia" w:eastAsia="Georgia"/>
+          <w:b w:val="0"/>
+          <w:i w:val="0"/>
+          <w:color w:val="808080"/>
+          <w:sz w:val="20"/>
+        </w:rPr>
+        <w:t xml:space="preserve"> (FP-Rec)</w:t>
+      </w:r>
+      <w:r>
+        <w:rPr>
+          <w:rFonts w:ascii="Georgia" w:hAnsi="Georgia" w:eastAsia="Georgia"/>
+          <w:b w:val="0"/>
+          <w:i w:val="0"/>
+          <w:color w:val="000000"/>
+          <w:sz w:val="22"/>
+        </w:rPr>
+        <w:t xml:space="preserve"> incorporating 50% Guinea grass + 20% Azolla + 30% concentrates for rabbit growth performance, considering the results show that this treatment performs well and doesn't differ from treatment 1, which is the farmer practice. The researchers also saw that the treatment of 50% Guinea grass + 20% Azolla + 30% concentrates has </w:t>
+      </w:r>
+      <w:r>
+        <w:rPr>
+          <w:rFonts w:ascii="Georgia" w:hAnsi="Georgia" w:eastAsia="Georgia"/>
+          <w:b/>
+          <w:strike w:val="0"/>
+          <w:color w:val="FFFFFF"/>
+          <w:sz w:val="22"/>
+          <w:shd w:val="clear" w:color="auto" w:fill="FF0000"/>
+        </w:rPr>
+        <w:t>potential</w:t>
+      </w:r>
+      <w:r>
+        <w:rPr>
+          <w:rFonts w:ascii="Georgia" w:hAnsi="Georgia" w:eastAsia="Georgia"/>
+          <w:b/>
+          <w:i w:val="0"/>
+          <w:color w:val="ED7D31"/>
+          <w:sz w:val="20"/>
+        </w:rPr>
+        <w:t xml:space="preserve"> (EC)</w:t>
+      </w:r>
+      <w:r>
+        <w:rPr>
+          <w:rFonts w:ascii="Georgia" w:hAnsi="Georgia" w:eastAsia="Georgia"/>
+          <w:b w:val="0"/>
+          <w:i w:val="0"/>
+          <w:color w:val="000000"/>
+          <w:sz w:val="22"/>
+        </w:rPr>
+        <w:t xml:space="preserve"> as an alternative feed ration for rabbits without adverse effects, and considering that azolla </w:t>
+      </w:r>
+      <w:r>
+        <w:rPr>
+          <w:rFonts w:ascii="Georgia" w:hAnsi="Georgia"/>
+          <w:b/>
+          <w:strike/>
+          <w:color w:val="000000"/>
+          <w:sz w:val="22"/>
+        </w:rPr>
+        <w:t>can</w:t>
+      </w:r>
+      <w:r>
+        <w:rPr>
+          <w:rFonts w:ascii="Georgia" w:hAnsi="Georgia" w:eastAsia="Georgia"/>
+          <w:b w:val="0"/>
+          <w:i w:val="0"/>
+          <w:color w:val="808080"/>
+          <w:sz w:val="20"/>
+        </w:rPr>
+        <w:t xml:space="preserve"> (FP-Cap)</w:t>
+      </w:r>
+      <w:r>
+        <w:rPr>
+          <w:rFonts w:ascii="Georgia" w:hAnsi="Georgia" w:eastAsia="Georgia"/>
+          <w:b w:val="0"/>
+          <w:i w:val="0"/>
+          <w:color w:val="000000"/>
+          <w:sz w:val="22"/>
+        </w:rPr>
+        <w:t xml:space="preserve"> help breeders to lessen the feed cost in production.</w:t>
+      </w:r>
     </w:p>
-    <w:p>
-      <w:pPr>
-        <w:spacing w:before="0" w:after="0" w:line="240" w:lineRule="auto"/>
-      </w:pPr>
-      <w:r>
-        <w:rPr>
-          <w:rFonts w:ascii="Georgia" w:hAnsi="Georgia" w:eastAsia="Georgia"/>
-          <w:b w:val="0"/>
-          <w:i w:val="0"/>
-          <w:sz w:val="22"/>
-        </w:rPr>
-      </w:r>
-    </w:p>
-    <w:sectPr>
-      <w:headerReference w:type="default" r:id="rId26"/>
-      <w:headerReference w:type="first" r:id="rId27"/>
-      <w:pgSz w:w="11906" w:h="16838"/>
-      <w:pgMar w:top="1440" w:right="1440" w:bottom="1440" w:left="2160" w:header="720" w:footer="720" w:gutter="0"/>
-      <w:cols w:space="720"/>
-      <w:titlePg/>
-      <w:docGrid w:linePitch="360"/>
-    </w:sectPr>
   </w:body>
 </w:document>
 </file>

</xml_diff>

<commit_message>
Draft_012 (in place): proper blank page fix — root cause was pageBreakBefore property on major headings (conflicted with section break, creating double page break). Removed pageBreakBefore from section-break-adjacent headings; restored 3-before spacing. 113 pages, 0 blank.
</commit_message>
<xml_diff>
--- a/thesis/003_ThesisProposal_Draft_012.docx
+++ b/thesis/003_ThesisProposal_Draft_012.docx
@@ -377,6 +377,9 @@
         </w:sectPr>
       </w:pPr>
     </w:p>
+    <w:p/>
+    <w:p/>
+    <w:p/>
     <w:p>
       <w:pPr>
         <w:keepNext/>
@@ -1627,9 +1630,11 @@
         </w:sectPr>
       </w:pPr>
     </w:p>
+    <w:p/>
+    <w:p/>
+    <w:p/>
     <w:p>
       <w:pPr>
-        <w:pageBreakBefore/>
         <w:keepNext/>
         <w:keepLines/>
         <w:spacing w:before="0" w:after="0" w:line="480" w:lineRule="auto"/>
@@ -2952,9 +2957,11 @@
         </w:sectPr>
       </w:pPr>
     </w:p>
+    <w:p/>
+    <w:p/>
+    <w:p/>
     <w:p>
       <w:pPr>
-        <w:pageBreakBefore/>
         <w:keepNext/>
         <w:keepLines/>
         <w:spacing w:before="0" w:after="0" w:line="480" w:lineRule="auto"/>
@@ -6257,9 +6264,11 @@
         </w:sectPr>
       </w:pPr>
     </w:p>
+    <w:p/>
+    <w:p/>
+    <w:p/>
     <w:p>
       <w:pPr>
-        <w:pageBreakBefore/>
         <w:keepNext/>
         <w:keepLines/>
         <w:spacing w:before="0" w:after="0" w:line="480" w:lineRule="auto"/>
@@ -6929,9 +6938,11 @@
         </w:sectPr>
       </w:pPr>
     </w:p>
+    <w:p/>
+    <w:p/>
+    <w:p/>
     <w:p>
       <w:pPr>
-        <w:pageBreakBefore/>
         <w:keepNext/>
         <w:keepLines/>
         <w:spacing w:before="0" w:after="240" w:line="240" w:lineRule="auto"/>
@@ -13328,9 +13339,9 @@
         </w:sectPr>
       </w:pPr>
     </w:p>
+    <w:p/>
     <w:p>
       <w:pPr>
-        <w:pageBreakBefore/>
         <w:spacing w:before="360" w:after="200" w:line="240" w:lineRule="auto"/>
         <w:jc w:val="left"/>
       </w:pPr>

</xml_diff>